<commit_message>
docs: team headers for ML-HW05
</commit_message>
<xml_diff>
--- a/labs/Lab02_Word2Vec_FastText_resumes.docx
+++ b/labs/Lab02_Word2Vec_FastText_resumes.docx
@@ -1,6 +1,6 @@
 
 <file path=word/document.xml><?xml version="1.0" encoding="utf-8"?>
-<w:document xmlns:wpc="http://schemas.microsoft.com/office/word/2010/wordprocessingCanvas" xmlns:cx="http://schemas.microsoft.com/office/drawing/2014/chartex" xmlns:cx1="http://schemas.microsoft.com/office/drawing/2015/9/8/chartex" xmlns:cx2="http://schemas.microsoft.com/office/drawing/2015/10/21/chartex" xmlns:cx3="http://schemas.microsoft.com/office/drawing/2016/5/9/chartex" xmlns:cx4="http://schemas.microsoft.com/office/drawing/2016/5/10/chartex" xmlns:cx5="http://schemas.microsoft.com/office/drawing/2016/5/11/chartex" xmlns:cx6="http://schemas.microsoft.com/office/drawing/2016/5/12/chartex" xmlns:cx7="http://schemas.microsoft.com/office/drawing/2016/5/13/chartex" xmlns:cx8="http://schemas.microsoft.com/office/drawing/2016/5/14/chartex" xmlns:mc="http://schemas.openxmlformats.org/markup-compatibility/2006" xmlns:aink="http://schemas.microsoft.com/office/drawing/2016/ink" xmlns:am3d="http://schemas.microsoft.com/office/drawing/2017/model3d" xmlns:o="urn:schemas-microsoft-com:office:office" xmlns:oel="http://schemas.microsoft.com/office/2019/extlst" xmlns:r="http://schemas.openxmlformats.org/officeDocument/2006/relationships" xmlns:m="http://schemas.openxmlformats.org/officeDocument/2006/math" xmlns:v="urn:schemas-microsoft-com:vml" xmlns:wp14="http://schemas.microsoft.com/office/word/2010/wordprocessingDrawing" xmlns:wp="http://schemas.openxmlformats.org/drawingml/2006/wordprocessingDrawing" xmlns:w10="urn:schemas-microsoft-com:office:word" xmlns:w="http://schemas.openxmlformats.org/wordprocessingml/2006/main" xmlns:w14="http://schemas.microsoft.com/office/word/2010/wordml" xmlns:w15="http://schemas.microsoft.com/office/word/2012/wordml" xmlns:w16cex="http://schemas.microsoft.com/office/word/2018/wordml/cex" xmlns:w16cid="http://schemas.microsoft.com/office/word/2016/wordml/cid" xmlns:w16="http://schemas.microsoft.com/office/word/2018/wordml" xmlns:w16sdtdh="http://schemas.microsoft.com/office/word/2020/wordml/sdtdatahash" xmlns:w16se="http://schemas.microsoft.com/office/word/2015/wordml/symex" xmlns:wpg="http://schemas.microsoft.com/office/word/2010/wordprocessingGroup" xmlns:wpi="http://schemas.microsoft.com/office/word/2010/wordprocessingInk" xmlns:wne="http://schemas.microsoft.com/office/word/2006/wordml" xmlns:wps="http://schemas.microsoft.com/office/word/2010/wordprocessingShape" mc:Ignorable="w14 w15 w16se w16cid w16 w16cex w16sdtdh wp14">
+<w:document xmlns:wpc="http://schemas.microsoft.com/office/word/2010/wordprocessingCanvas" xmlns:cx="http://schemas.microsoft.com/office/drawing/2014/chartex" xmlns:cx1="http://schemas.microsoft.com/office/drawing/2015/9/8/chartex" xmlns:cx2="http://schemas.microsoft.com/office/drawing/2015/10/21/chartex" xmlns:cx3="http://schemas.microsoft.com/office/drawing/2016/5/9/chartex" xmlns:cx4="http://schemas.microsoft.com/office/drawing/2016/5/10/chartex" xmlns:cx5="http://schemas.microsoft.com/office/drawing/2016/5/11/chartex" xmlns:cx6="http://schemas.microsoft.com/office/drawing/2016/5/12/chartex" xmlns:cx7="http://schemas.microsoft.com/office/drawing/2016/5/13/chartex" xmlns:cx8="http://schemas.microsoft.com/office/drawing/2016/5/14/chartex" xmlns:mc="http://schemas.openxmlformats.org/markup-compatibility/2006" xmlns:aink="http://schemas.microsoft.com/office/drawing/2016/ink" xmlns:am3d="http://schemas.microsoft.com/office/drawing/2017/model3d" xmlns:o="urn:schemas-microsoft-com:office:office" xmlns:oel="http://schemas.microsoft.com/office/2019/extlst" xmlns:r="http://schemas.openxmlformats.org/officeDocument/2006/relationships" xmlns:m="http://schemas.openxmlformats.org/officeDocument/2006/math" xmlns:v="urn:schemas-microsoft-com:vml" xmlns:wp14="http://schemas.microsoft.com/office/word/2010/wordprocessingDrawing" xmlns:wp="http://schemas.openxmlformats.org/drawingml/2006/wordprocessingDrawing" xmlns:w10="urn:schemas-microsoft-com:office:word" xmlns:w="http://schemas.openxmlformats.org/wordprocessingml/2006/main" xmlns:w14="http://schemas.microsoft.com/office/word/2010/wordml" xmlns:w15="http://schemas.microsoft.com/office/word/2012/wordml" xmlns:w16cex="http://schemas.microsoft.com/office/word/2018/wordml/cex" xmlns:w16cid="http://schemas.microsoft.com/office/word/2016/wordml/cid" xmlns:w16="http://schemas.microsoft.com/office/word/2018/wordml" xmlns:w16du="http://schemas.microsoft.com/office/word/2023/wordml/word16du" xmlns:w16sdtdh="http://schemas.microsoft.com/office/word/2020/wordml/sdtdatahash" xmlns:w16sdtfl="http://schemas.microsoft.com/office/word/2024/wordml/sdtformatlock" xmlns:w16se="http://schemas.microsoft.com/office/word/2015/wordml/symex" xmlns:wpg="http://schemas.microsoft.com/office/word/2010/wordprocessingGroup" xmlns:wpi="http://schemas.microsoft.com/office/word/2010/wordprocessingInk" xmlns:wne="http://schemas.microsoft.com/office/word/2006/wordml" xmlns:wps="http://schemas.microsoft.com/office/word/2010/wordprocessingShape" mc:Ignorable="w14 w15 w16se w16cid w16 w16cex w16sdtdh w16sdtfl w16du wp14">
   <w:body>
     <w:p>
       <w:pPr>
@@ -52,7 +52,7 @@
     </w:p>
     <w:p>
       <w:pPr>
-        <w:pStyle w:val="1"/>
+        <w:pStyle w:val="Heading1"/>
         <w:rPr>
           <w:lang w:val="ru-RU"/>
         </w:rPr>
@@ -61,11 +61,72 @@
         <w:rPr>
           <w:lang w:val="ru-RU"/>
         </w:rPr>
-        <w:t>1. Данные и подготовка корпуса</w:t>
+        <w:t>Шапка</w:t>
+      </w:r>
+    </w:p>
+    <w:p>
+      <w:r>
+        <w:t>ML</w:t>
+      </w:r>
+      <w:r>
+        <w:rPr>
+          <w:lang w:val="ru-RU"/>
+        </w:rPr>
+        <w:t>-</w:t>
+      </w:r>
+      <w:r>
+        <w:t>HW</w:t>
+      </w:r>
+      <w:r>
+        <w:rPr>
+          <w:lang w:val="ru-RU"/>
+        </w:rPr>
+        <w:t>05-</w:t>
+      </w:r>
+      <w:r>
+        <w:t>v</w:t>
+      </w:r>
+      <w:r>
+        <w:rPr>
+          <w:lang w:val="ru-RU"/>
+        </w:rPr>
+        <w:t xml:space="preserve">1 </w:t>
+      </w:r>
+      <w:r>
+        <w:t>TEAM</w:t>
+      </w:r>
+      <w:r>
+        <w:rPr>
+          <w:lang w:val="ru-RU"/>
+        </w:rPr>
+        <w:t>-11</w:t>
+      </w:r>
+      <w:r>
+        <w:rPr>
+          <w:lang w:val="ru-RU"/>
+        </w:rPr>
+        <w:t xml:space="preserve">. Эмбеддинги: </w:t>
+      </w:r>
+      <w:r>
+        <w:t>Word2Vec</w:t>
+      </w:r>
+      <w:r>
+        <w:rPr>
+          <w:lang w:val="ru-RU"/>
+        </w:rPr>
+        <w:t xml:space="preserve"> и </w:t>
+      </w:r>
+      <w:r>
+        <w:t>fastText.</w:t>
       </w:r>
     </w:p>
     <w:p>
       <w:pPr>
+        <w:pStyle w:val="ListParagraph"/>
+        <w:numPr>
+          <w:ilvl w:val="0"/>
+          <w:numId w:val="11"/>
+        </w:numPr>
         <w:rPr>
           <w:lang w:val="ru-RU"/>
         </w:rPr>
@@ -74,90 +135,16 @@
         <w:rPr>
           <w:lang w:val="ru-RU"/>
         </w:rPr>
-        <w:t>Использован датасет `</w:t>
-      </w:r>
-      <w:proofErr w:type="spellStart"/>
-      <w:r>
-        <w:t>mo</w:t>
-      </w:r>
-      <w:proofErr w:type="spellEnd"/>
-      <w:r>
-        <w:rPr>
-          <w:lang w:val="ru-RU"/>
-        </w:rPr>
-        <w:t>3_</w:t>
-      </w:r>
-      <w:r>
-        <w:t>team</w:t>
-      </w:r>
-      <w:r>
-        <w:rPr>
-          <w:lang w:val="ru-RU"/>
-        </w:rPr>
-        <w:t>_</w:t>
-      </w:r>
-      <w:proofErr w:type="spellStart"/>
-      <w:r>
-        <w:t>colabs</w:t>
-      </w:r>
-      <w:proofErr w:type="spellEnd"/>
-      <w:r>
-        <w:rPr>
-          <w:lang w:val="ru-RU"/>
-        </w:rPr>
-        <w:t>/</w:t>
-      </w:r>
-      <w:r>
-        <w:t>data</w:t>
-      </w:r>
-      <w:r>
-        <w:rPr>
-          <w:lang w:val="ru-RU"/>
-        </w:rPr>
-        <w:t>/</w:t>
-      </w:r>
-      <w:r>
-        <w:t>resumes</w:t>
-      </w:r>
-      <w:r>
-        <w:rPr>
-          <w:lang w:val="ru-RU"/>
-        </w:rPr>
-        <w:t>_</w:t>
-      </w:r>
-      <w:proofErr w:type="spellStart"/>
-      <w:r>
-        <w:t>ru</w:t>
-      </w:r>
-      <w:proofErr w:type="spellEnd"/>
-      <w:r>
-        <w:rPr>
-          <w:lang w:val="ru-RU"/>
-        </w:rPr>
-        <w:t>_6000_</w:t>
-      </w:r>
-      <w:r>
-        <w:t>labeled</w:t>
-      </w:r>
-      <w:r>
-        <w:rPr>
-          <w:lang w:val="ru-RU"/>
-        </w:rPr>
-        <w:t>.</w:t>
-      </w:r>
-      <w:r>
-        <w:t>csv</w:t>
-      </w:r>
-      <w:r>
-        <w:rPr>
-          <w:lang w:val="ru-RU"/>
-        </w:rPr>
-        <w:t>`: 6000 русскоязычных резюме и 6 классов по 1000 объектов. Текст приводится к нижнему регистру, ё заменяется на е, затем выделяются русские и латинские буквенные последовательности. Каждое резюме используется как одна обучающая последовательность; это сохраняет контекст документа и делает запуск воспроизводимым.</w:t>
+        <w:t>Руденко Евгений Александрович</w:t>
       </w:r>
     </w:p>
     <w:p>
       <w:pPr>
-        <w:pStyle w:val="1"/>
+        <w:pStyle w:val="ListParagraph"/>
+        <w:numPr>
+          <w:ilvl w:val="0"/>
+          <w:numId w:val="11"/>
+        </w:numPr>
         <w:rPr>
           <w:lang w:val="ru-RU"/>
         </w:rPr>
@@ -166,28 +153,30 @@
         <w:rPr>
           <w:lang w:val="ru-RU"/>
         </w:rPr>
-        <w:t>2. Теория</w:t>
+        <w:t>Сажин Семён Михайлович</w:t>
       </w:r>
     </w:p>
     <w:p>
       <w:pPr>
-        <w:pStyle w:val="21"/>
+        <w:pStyle w:val="ListParagraph"/>
+        <w:numPr>
+          <w:ilvl w:val="0"/>
+          <w:numId w:val="11"/>
+        </w:numPr>
         <w:rPr>
           <w:lang w:val="ru-RU"/>
         </w:rPr>
       </w:pPr>
       <w:r>
-        <w:t>Q</w:t>
-      </w:r>
-      <w:r>
-        <w:rPr>
-          <w:lang w:val="ru-RU"/>
-        </w:rPr>
-        <w:t>1. В чём суть распределительной гипотезы и почему векторы слов работают?</w:t>
+        <w:rPr>
+          <w:lang w:val="ru-RU"/>
+        </w:rPr>
+        <w:t>Тихомиров Алексей Константинович</w:t>
       </w:r>
     </w:p>
     <w:p>
       <w:pPr>
+        <w:pStyle w:val="Heading1"/>
         <w:rPr>
           <w:lang w:val="ru-RU"/>
         </w:rPr>
@@ -196,191 +185,111 @@
         <w:rPr>
           <w:lang w:val="ru-RU"/>
         </w:rPr>
-        <w:t xml:space="preserve">Распределительная гипотеза утверждает, что значение слова можно оценивать по тому, в каком окружении оно встречается. Если слова имеют похожие контексты, их векторы становятся близкими. </w:t>
-      </w:r>
-      <w:r>
-        <w:t>Word</w:t>
-      </w:r>
-      <w:r>
-        <w:rPr>
-          <w:lang w:val="ru-RU"/>
-        </w:rPr>
-        <w:t>2</w:t>
-      </w:r>
-      <w:proofErr w:type="spellStart"/>
-      <w:r>
-        <w:t>Vec</w:t>
-      </w:r>
-      <w:proofErr w:type="spellEnd"/>
-      <w:r>
-        <w:rPr>
-          <w:lang w:val="ru-RU"/>
-        </w:rPr>
-        <w:t xml:space="preserve"> обучает такое пространство из статистики совместных появлений. </w:t>
-      </w:r>
-      <w:r>
-        <w:t>CBOW</w:t>
-      </w:r>
-      <w:r>
-        <w:rPr>
-          <w:lang w:val="ru-RU"/>
-        </w:rPr>
-        <w:t xml:space="preserve"> предсказывает слово по контексту, а </w:t>
-      </w:r>
-      <w:r>
-        <w:t>Skip</w:t>
-      </w:r>
-      <w:r>
-        <w:rPr>
-          <w:lang w:val="ru-RU"/>
-        </w:rPr>
-        <w:t>-</w:t>
-      </w:r>
-      <w:r>
-        <w:t>gram</w:t>
-      </w:r>
-      <w:r>
-        <w:rPr>
-          <w:lang w:val="ru-RU"/>
-        </w:rPr>
-        <w:t xml:space="preserve"> — слова контекста по целевому слову. Поэтому геометрия векторов отражает часть структуры корпуса. Косинусная близость может использоваться как приближённая мера семантического сходства. Результат зависит от конкретного корпуса и не является универсальным словарным определением.</w:t>
+        <w:t>1. Данные и подготовка корпуса</w:t>
       </w:r>
     </w:p>
     <w:p>
       <w:pPr>
-        <w:pStyle w:val="21"/>
+        <w:rPr>
+          <w:lang w:val="ru-RU"/>
+        </w:rPr>
       </w:pPr>
       <w:r>
-        <w:t>Q2. Различия CBOW vs Skip-gram; negative sampling vs hierarchical softmax.</w:t>
+        <w:rPr>
+          <w:lang w:val="ru-RU"/>
+        </w:rPr>
+        <w:t>Использован датасет `</w:t>
+      </w:r>
+      <w:r>
+        <w:t>mo</w:t>
+      </w:r>
+      <w:r>
+        <w:rPr>
+          <w:lang w:val="ru-RU"/>
+        </w:rPr>
+        <w:t>3_</w:t>
+      </w:r>
+      <w:r>
+        <w:t>team</w:t>
+      </w:r>
+      <w:r>
+        <w:rPr>
+          <w:lang w:val="ru-RU"/>
+        </w:rPr>
+        <w:t>_</w:t>
+      </w:r>
+      <w:r>
+        <w:t>colabs</w:t>
+      </w:r>
+      <w:r>
+        <w:rPr>
+          <w:lang w:val="ru-RU"/>
+        </w:rPr>
+        <w:t>/</w:t>
+      </w:r>
+      <w:r>
+        <w:t>data</w:t>
+      </w:r>
+      <w:r>
+        <w:rPr>
+          <w:lang w:val="ru-RU"/>
+        </w:rPr>
+        <w:t>/</w:t>
+      </w:r>
+      <w:r>
+        <w:t>resumes</w:t>
+      </w:r>
+      <w:r>
+        <w:rPr>
+          <w:lang w:val="ru-RU"/>
+        </w:rPr>
+        <w:t>_</w:t>
+      </w:r>
+      <w:r>
+        <w:t>ru</w:t>
+      </w:r>
+      <w:r>
+        <w:rPr>
+          <w:lang w:val="ru-RU"/>
+        </w:rPr>
+        <w:t>_6000_</w:t>
+      </w:r>
+      <w:r>
+        <w:t>labeled</w:t>
+      </w:r>
+      <w:r>
+        <w:rPr>
+          <w:lang w:val="ru-RU"/>
+        </w:rPr>
+        <w:t>.</w:t>
+      </w:r>
+      <w:r>
+        <w:t>csv</w:t>
+      </w:r>
+      <w:r>
+        <w:rPr>
+          <w:lang w:val="ru-RU"/>
+        </w:rPr>
+        <w:t>`: 6000 русскоязычных резюме и 6 классов по 1000 объектов. Текст приводится к нижнему регистру, ё заменяется на е, затем выделяются русские и латинские буквенные последовательности. Каждое резюме используется как одна обучающая последовательность; это сохраняет контекст документа и делает запуск воспроизводимым.</w:t>
       </w:r>
     </w:p>
     <w:p>
       <w:pPr>
+        <w:pStyle w:val="Heading1"/>
         <w:rPr>
           <w:lang w:val="ru-RU"/>
         </w:rPr>
       </w:pPr>
       <w:r>
-        <w:t>CBOW</w:t>
-      </w:r>
-      <w:r>
-        <w:rPr>
-          <w:lang w:val="ru-RU"/>
-        </w:rPr>
-        <w:t xml:space="preserve"> предсказывает центральное слово по контексту и обычно обучается быстрее. </w:t>
-      </w:r>
-      <w:r>
-        <w:t>Skip</w:t>
-      </w:r>
-      <w:r>
-        <w:rPr>
-          <w:lang w:val="ru-RU"/>
-        </w:rPr>
-        <w:t>-</w:t>
-      </w:r>
-      <w:r>
-        <w:t>gram</w:t>
-      </w:r>
-      <w:r>
-        <w:rPr>
-          <w:lang w:val="ru-RU"/>
-        </w:rPr>
-        <w:t xml:space="preserve"> предсказывает слова контекста по центральному слову и часто лучше использует информацию о редких словах. </w:t>
-      </w:r>
-      <w:r>
-        <w:t>Negative</w:t>
-      </w:r>
-      <w:r>
-        <w:rPr>
-          <w:lang w:val="ru-RU"/>
-        </w:rPr>
-        <w:t xml:space="preserve"> </w:t>
-      </w:r>
-      <w:r>
-        <w:t>sampling</w:t>
-      </w:r>
-      <w:r>
-        <w:rPr>
-          <w:lang w:val="ru-RU"/>
-        </w:rPr>
-        <w:t xml:space="preserve"> обучается на нескольких отрицательных примерах вместо полного словаря и снижает вычислительную стоимость шага. </w:t>
-      </w:r>
-      <w:r>
-        <w:t>Hierarchical</w:t>
-      </w:r>
-      <w:r>
-        <w:rPr>
-          <w:lang w:val="ru-RU"/>
-        </w:rPr>
-        <w:t xml:space="preserve"> </w:t>
-      </w:r>
-      <w:proofErr w:type="spellStart"/>
-      <w:r>
-        <w:t>softmax</w:t>
-      </w:r>
-      <w:proofErr w:type="spellEnd"/>
-      <w:r>
-        <w:rPr>
-          <w:lang w:val="ru-RU"/>
-        </w:rPr>
-        <w:t xml:space="preserve"> использует дерево словаря и путь от корня к слову. В работе используется </w:t>
-      </w:r>
-      <w:r>
-        <w:t>negative</w:t>
-      </w:r>
-      <w:r>
-        <w:rPr>
-          <w:lang w:val="ru-RU"/>
-        </w:rPr>
-        <w:t xml:space="preserve"> </w:t>
-      </w:r>
-      <w:r>
-        <w:t>sampling</w:t>
-      </w:r>
-      <w:r>
-        <w:rPr>
-          <w:lang w:val="ru-RU"/>
-        </w:rPr>
-        <w:t xml:space="preserve"> одинаково во всех конфигурациях </w:t>
-      </w:r>
-      <w:r>
-        <w:t>Word</w:t>
-      </w:r>
-      <w:r>
-        <w:rPr>
-          <w:lang w:val="ru-RU"/>
-        </w:rPr>
-        <w:t>2</w:t>
-      </w:r>
-      <w:proofErr w:type="spellStart"/>
-      <w:r>
-        <w:t>Vec</w:t>
-      </w:r>
-      <w:proofErr w:type="spellEnd"/>
-      <w:r>
-        <w:rPr>
-          <w:lang w:val="ru-RU"/>
-        </w:rPr>
-        <w:t xml:space="preserve">. Это делает сравнение </w:t>
-      </w:r>
-      <w:proofErr w:type="spellStart"/>
-      <w:r>
-        <w:rPr>
-          <w:lang w:val="ru-RU"/>
-        </w:rPr>
-        <w:t>гиперпараметров</w:t>
-      </w:r>
-      <w:proofErr w:type="spellEnd"/>
-      <w:r>
-        <w:rPr>
-          <w:lang w:val="ru-RU"/>
-        </w:rPr>
-        <w:t xml:space="preserve"> более контролируемым и воспроизводимым.</w:t>
+        <w:rPr>
+          <w:lang w:val="ru-RU"/>
+        </w:rPr>
+        <w:t>2. Теория</w:t>
       </w:r>
     </w:p>
     <w:p>
       <w:pPr>
-        <w:pStyle w:val="21"/>
+        <w:pStyle w:val="Heading2"/>
         <w:rPr>
           <w:lang w:val="ru-RU"/>
         </w:rPr>
@@ -392,27 +301,7 @@
         <w:rPr>
           <w:lang w:val="ru-RU"/>
         </w:rPr>
-        <w:t xml:space="preserve">3. Почему </w:t>
-      </w:r>
-      <w:proofErr w:type="spellStart"/>
-      <w:r>
-        <w:t>fastText</w:t>
-      </w:r>
-      <w:proofErr w:type="spellEnd"/>
-      <w:r>
-        <w:rPr>
-          <w:lang w:val="ru-RU"/>
-        </w:rPr>
-        <w:t xml:space="preserve"> устойчив к </w:t>
-      </w:r>
-      <w:r>
-        <w:t>OOV</w:t>
-      </w:r>
-      <w:r>
-        <w:rPr>
-          <w:lang w:val="ru-RU"/>
-        </w:rPr>
-        <w:t xml:space="preserve"> и морфологии?</w:t>
+        <w:t>1. В чём суть распределительной гипотезы и почему векторы слов работают?</w:t>
       </w:r>
     </w:p>
     <w:p>
@@ -421,83 +310,65 @@
           <w:lang w:val="ru-RU"/>
         </w:rPr>
       </w:pPr>
-      <w:proofErr w:type="spellStart"/>
-      <w:r>
-        <w:t>FastText</w:t>
-      </w:r>
-      <w:proofErr w:type="spellEnd"/>
-      <w:r>
-        <w:rPr>
-          <w:lang w:val="ru-RU"/>
-        </w:rPr>
-        <w:t xml:space="preserve"> использует символьные </w:t>
-      </w:r>
-      <w:r>
-        <w:t>n</w:t>
-      </w:r>
-      <w:r>
-        <w:rPr>
-          <w:lang w:val="ru-RU"/>
-        </w:rPr>
-        <w:t xml:space="preserve">-граммы вместе с представлением целого слова. Поэтому вектор для неизвестной словоформы можно построить по известным фрагментам. Это особенно полезно для русского языка с большим числом морфологических форм. В работе используются </w:t>
-      </w:r>
-      <w:r>
-        <w:t>n</w:t>
-      </w:r>
-      <w:r>
-        <w:rPr>
-          <w:lang w:val="ru-RU"/>
-        </w:rPr>
-        <w:t xml:space="preserve">-граммы длиной от 3 до 6 символов. Разные формы одного слова могут иметь общие символьные фрагменты. Благодаря этому </w:t>
-      </w:r>
-      <w:proofErr w:type="spellStart"/>
-      <w:r>
-        <w:t>fastText</w:t>
-      </w:r>
-      <w:proofErr w:type="spellEnd"/>
-      <w:r>
-        <w:rPr>
-          <w:lang w:val="ru-RU"/>
-        </w:rPr>
-        <w:t xml:space="preserve"> лучше работает с редкими и </w:t>
-      </w:r>
-      <w:r>
-        <w:t>OOV</w:t>
-      </w:r>
-      <w:r>
-        <w:rPr>
-          <w:lang w:val="ru-RU"/>
-        </w:rPr>
-        <w:t>-словами, что отдельно проверяется по покрытию токенов.</w:t>
+      <w:r>
+        <w:rPr>
+          <w:lang w:val="ru-RU"/>
+        </w:rPr>
+        <w:t xml:space="preserve">Распределительная гипотеза утверждает, что значение слова можно оценивать по тому, в каком окружении оно встречается. Если слова имеют похожие контексты, их векторы становятся близкими. </w:t>
+      </w:r>
+      <w:r>
+        <w:t>Word</w:t>
+      </w:r>
+      <w:r>
+        <w:rPr>
+          <w:lang w:val="ru-RU"/>
+        </w:rPr>
+        <w:t>2</w:t>
+      </w:r>
+      <w:r>
+        <w:t>Vec</w:t>
+      </w:r>
+      <w:r>
+        <w:rPr>
+          <w:lang w:val="ru-RU"/>
+        </w:rPr>
+        <w:t xml:space="preserve"> обучает такое пространство из статистики совместных появлений. </w:t>
+      </w:r>
+      <w:r>
+        <w:t>CBOW</w:t>
+      </w:r>
+      <w:r>
+        <w:rPr>
+          <w:lang w:val="ru-RU"/>
+        </w:rPr>
+        <w:t xml:space="preserve"> предсказывает слово по контексту, а </w:t>
+      </w:r>
+      <w:r>
+        <w:t>Skip</w:t>
+      </w:r>
+      <w:r>
+        <w:rPr>
+          <w:lang w:val="ru-RU"/>
+        </w:rPr>
+        <w:t>-</w:t>
+      </w:r>
+      <w:r>
+        <w:t>gram</w:t>
+      </w:r>
+      <w:r>
+        <w:rPr>
+          <w:lang w:val="ru-RU"/>
+        </w:rPr>
+        <w:t xml:space="preserve"> — слова контекста по целевому слову. Поэтому геометрия векторов отражает часть структуры корпуса. Косинусная близость может использоваться как приближённая мера семантического сходства. Результат зависит от конкретного корпуса и не является универсальным словарным определением.</w:t>
       </w:r>
     </w:p>
     <w:p>
       <w:pPr>
-        <w:pStyle w:val="1"/>
-        <w:rPr>
-          <w:lang w:val="ru-RU"/>
-        </w:rPr>
+        <w:pStyle w:val="Heading2"/>
       </w:pPr>
       <w:r>
-        <w:rPr>
-          <w:lang w:val="ru-RU"/>
-        </w:rPr>
-        <w:t xml:space="preserve">3. Подбор </w:t>
-      </w:r>
-      <w:r>
-        <w:t>Word</w:t>
-      </w:r>
-      <w:r>
-        <w:rPr>
-          <w:lang w:val="ru-RU"/>
-        </w:rPr>
-        <w:t>2</w:t>
-      </w:r>
-      <w:proofErr w:type="spellStart"/>
-      <w:r>
-        <w:t>Vec</w:t>
-      </w:r>
-      <w:proofErr w:type="spellEnd"/>
+        <w:t>Q2. Различия CBOW vs Skip-gram; negative sampling vs hierarchical softmax.</w:t>
+      </w:r>
     </w:p>
     <w:p>
       <w:pPr>
@@ -506,6 +377,226 @@
         </w:rPr>
       </w:pPr>
       <w:r>
+        <w:t>CBOW</w:t>
+      </w:r>
+      <w:r>
+        <w:rPr>
+          <w:lang w:val="ru-RU"/>
+        </w:rPr>
+        <w:t xml:space="preserve"> предсказывает центральное слово по контексту и обычно обучается быстрее. </w:t>
+      </w:r>
+      <w:r>
+        <w:t>Skip</w:t>
+      </w:r>
+      <w:r>
+        <w:rPr>
+          <w:lang w:val="ru-RU"/>
+        </w:rPr>
+        <w:t>-</w:t>
+      </w:r>
+      <w:r>
+        <w:t>gram</w:t>
+      </w:r>
+      <w:r>
+        <w:rPr>
+          <w:lang w:val="ru-RU"/>
+        </w:rPr>
+        <w:t xml:space="preserve"> предсказывает слова контекста по центральному слову и часто лучше использует информацию о редких словах. </w:t>
+      </w:r>
+      <w:r>
+        <w:t>Negative</w:t>
+      </w:r>
+      <w:r>
+        <w:rPr>
+          <w:lang w:val="ru-RU"/>
+        </w:rPr>
+        <w:t xml:space="preserve"> </w:t>
+      </w:r>
+      <w:r>
+        <w:t>sampling</w:t>
+      </w:r>
+      <w:r>
+        <w:rPr>
+          <w:lang w:val="ru-RU"/>
+        </w:rPr>
+        <w:t xml:space="preserve"> обучается на нескольких отрицательных примерах вместо полного словаря и снижает вычислительную стоимость шага. </w:t>
+      </w:r>
+      <w:r>
+        <w:t>Hierarchical</w:t>
+      </w:r>
+      <w:r>
+        <w:rPr>
+          <w:lang w:val="ru-RU"/>
+        </w:rPr>
+        <w:t xml:space="preserve"> </w:t>
+      </w:r>
+      <w:r>
+        <w:t>softmax</w:t>
+      </w:r>
+      <w:r>
+        <w:rPr>
+          <w:lang w:val="ru-RU"/>
+        </w:rPr>
+        <w:t xml:space="preserve"> использует дерево словаря и путь от корня к слову. В работе используется </w:t>
+      </w:r>
+      <w:r>
+        <w:t>negative</w:t>
+      </w:r>
+      <w:r>
+        <w:rPr>
+          <w:lang w:val="ru-RU"/>
+        </w:rPr>
+        <w:t xml:space="preserve"> </w:t>
+      </w:r>
+      <w:r>
+        <w:t>sampling</w:t>
+      </w:r>
+      <w:r>
+        <w:rPr>
+          <w:lang w:val="ru-RU"/>
+        </w:rPr>
+        <w:t xml:space="preserve"> одинаково во всех конфигурациях </w:t>
+      </w:r>
+      <w:r>
+        <w:t>Word</w:t>
+      </w:r>
+      <w:r>
+        <w:rPr>
+          <w:lang w:val="ru-RU"/>
+        </w:rPr>
+        <w:t>2</w:t>
+      </w:r>
+      <w:r>
+        <w:t>Vec</w:t>
+      </w:r>
+      <w:r>
+        <w:rPr>
+          <w:lang w:val="ru-RU"/>
+        </w:rPr>
+        <w:t>. Это делает сравнение гиперпараметров более контролируемым и воспроизводимым.</w:t>
+      </w:r>
+    </w:p>
+    <w:p>
+      <w:pPr>
+        <w:pStyle w:val="Heading2"/>
+        <w:rPr>
+          <w:lang w:val="ru-RU"/>
+        </w:rPr>
+      </w:pPr>
+      <w:r>
+        <w:t>Q</w:t>
+      </w:r>
+      <w:r>
+        <w:rPr>
+          <w:lang w:val="ru-RU"/>
+        </w:rPr>
+        <w:t xml:space="preserve">3. Почему </w:t>
+      </w:r>
+      <w:r>
+        <w:t>fastText</w:t>
+      </w:r>
+      <w:r>
+        <w:rPr>
+          <w:lang w:val="ru-RU"/>
+        </w:rPr>
+        <w:t xml:space="preserve"> устойчив к </w:t>
+      </w:r>
+      <w:r>
+        <w:t>OOV</w:t>
+      </w:r>
+      <w:r>
+        <w:rPr>
+          <w:lang w:val="ru-RU"/>
+        </w:rPr>
+        <w:t xml:space="preserve"> и морфологии?</w:t>
+      </w:r>
+    </w:p>
+    <w:p>
+      <w:pPr>
+        <w:rPr>
+          <w:lang w:val="ru-RU"/>
+        </w:rPr>
+      </w:pPr>
+      <w:r>
+        <w:t>FastText</w:t>
+      </w:r>
+      <w:r>
+        <w:rPr>
+          <w:lang w:val="ru-RU"/>
+        </w:rPr>
+        <w:t xml:space="preserve"> использует символьные </w:t>
+      </w:r>
+      <w:r>
+        <w:t>n</w:t>
+      </w:r>
+      <w:r>
+        <w:rPr>
+          <w:lang w:val="ru-RU"/>
+        </w:rPr>
+        <w:t xml:space="preserve">-граммы вместе с представлением целого слова. Поэтому вектор для неизвестной словоформы можно построить по известным фрагментам. Это особенно полезно для русского языка с большим числом морфологических форм. В работе используются </w:t>
+      </w:r>
+      <w:r>
+        <w:t>n</w:t>
+      </w:r>
+      <w:r>
+        <w:rPr>
+          <w:lang w:val="ru-RU"/>
+        </w:rPr>
+        <w:t xml:space="preserve">-граммы длиной от 3 до 6 символов. Разные формы одного слова могут иметь общие символьные фрагменты. Благодаря этому </w:t>
+      </w:r>
+      <w:r>
+        <w:t>fastText</w:t>
+      </w:r>
+      <w:r>
+        <w:rPr>
+          <w:lang w:val="ru-RU"/>
+        </w:rPr>
+        <w:t xml:space="preserve"> лучше работает с редкими и </w:t>
+      </w:r>
+      <w:r>
+        <w:t>OOV</w:t>
+      </w:r>
+      <w:r>
+        <w:rPr>
+          <w:lang w:val="ru-RU"/>
+        </w:rPr>
+        <w:t>-словами, что отдельно проверяется по покрытию токенов.</w:t>
+      </w:r>
+    </w:p>
+    <w:p>
+      <w:pPr>
+        <w:pStyle w:val="Heading1"/>
+        <w:rPr>
+          <w:lang w:val="ru-RU"/>
+        </w:rPr>
+      </w:pPr>
+      <w:r>
+        <w:rPr>
+          <w:lang w:val="ru-RU"/>
+        </w:rPr>
+        <w:lastRenderedPageBreak/>
+        <w:t xml:space="preserve">3. Подбор </w:t>
+      </w:r>
+      <w:r>
+        <w:t>Word</w:t>
+      </w:r>
+      <w:r>
+        <w:rPr>
+          <w:lang w:val="ru-RU"/>
+        </w:rPr>
+        <w:t>2</w:t>
+      </w:r>
+      <w:r>
+        <w:t>Vec</w:t>
+      </w:r>
+    </w:p>
+    <w:p>
+      <w:pPr>
+        <w:rPr>
+          <w:lang w:val="ru-RU"/>
+        </w:rPr>
+      </w:pPr>
+      <w:r>
         <w:rPr>
           <w:lang w:val="ru-RU"/>
         </w:rPr>
@@ -577,7 +668,7 @@
     </w:p>
     <w:tbl>
       <w:tblPr>
-        <w:tblStyle w:val="aff0"/>
+        <w:tblStyle w:val="TableGrid"/>
         <w:tblW w:w="0" w:type="auto"/>
         <w:jc w:val="center"/>
         <w:tblLook w:val="04A0" w:firstRow="1" w:lastRow="0" w:firstColumn="1" w:lastColumn="0" w:noHBand="0" w:noVBand="1"/>
@@ -598,11 +689,9 @@
             <w:tcW w:w="1987" w:type="dxa"/>
           </w:tcPr>
           <w:p>
-            <w:proofErr w:type="spellStart"/>
             <w:r>
               <w:t>Конфигурация</w:t>
             </w:r>
-            <w:proofErr w:type="spellEnd"/>
           </w:p>
         </w:tc>
         <w:tc>
@@ -821,7 +910,6 @@
           </w:tcPr>
           <w:p>
             <w:r>
-              <w:lastRenderedPageBreak/>
               <w:t>Skip-gram epochs=10</w:t>
             </w:r>
           </w:p>
@@ -1030,29 +1118,8 @@
         </w:rPr>
         <w:t xml:space="preserve">1. Увеличение размерности до 200 в проверенной конфигурации, наоборот, не дало прироста. </w:t>
       </w:r>
-      <w:proofErr w:type="spellStart"/>
-      <w:r>
-        <w:t>Поэтому</w:t>
-      </w:r>
-      <w:proofErr w:type="spellEnd"/>
-      <w:r>
-        <w:t xml:space="preserve"> </w:t>
-      </w:r>
-      <w:proofErr w:type="spellStart"/>
-      <w:r>
-        <w:t>итоговая</w:t>
-      </w:r>
-      <w:proofErr w:type="spellEnd"/>
-      <w:r>
-        <w:t xml:space="preserve"> </w:t>
-      </w:r>
-      <w:proofErr w:type="spellStart"/>
-      <w:r>
-        <w:t>конфигурация</w:t>
-      </w:r>
-      <w:proofErr w:type="spellEnd"/>
-      <w:r>
-        <w:t xml:space="preserve"> Word2Vec: Skip-gram, vector_size=100, window=8, negative=10, min_count=10, epochs=10.</w:t>
+      <w:r>
+        <w:t>Поэтому итоговая конфигурация Word2Vec: Skip-gram, vector_size=100, window=8, negative=10, min_count=10, epochs=10.</w:t>
       </w:r>
     </w:p>
     <w:p>
@@ -1133,39 +1200,15 @@
     </w:p>
     <w:p>
       <w:pPr>
-        <w:pStyle w:val="1"/>
+        <w:pStyle w:val="Heading1"/>
       </w:pPr>
       <w:r>
-        <w:t xml:space="preserve">4. </w:t>
-      </w:r>
-      <w:proofErr w:type="spellStart"/>
-      <w:r>
-        <w:t>Подбор</w:t>
-      </w:r>
-      <w:proofErr w:type="spellEnd"/>
-      <w:r>
-        <w:t xml:space="preserve"> </w:t>
-      </w:r>
-      <w:proofErr w:type="spellStart"/>
-      <w:r>
-        <w:t>fastText</w:t>
-      </w:r>
-      <w:proofErr w:type="spellEnd"/>
-      <w:r>
-        <w:t xml:space="preserve"> и </w:t>
-      </w:r>
-      <w:proofErr w:type="spellStart"/>
-      <w:r>
-        <w:t>сравнение</w:t>
-      </w:r>
-      <w:proofErr w:type="spellEnd"/>
-      <w:r>
-        <w:t xml:space="preserve"> bucket</w:t>
+        <w:t>4. Подбор fastText и сравнение bucket</w:t>
       </w:r>
     </w:p>
     <w:tbl>
       <w:tblPr>
-        <w:tblStyle w:val="aff0"/>
+        <w:tblStyle w:val="TableGrid"/>
         <w:tblW w:w="0" w:type="auto"/>
         <w:tblLook w:val="04A0" w:firstRow="1" w:lastRow="0" w:firstColumn="1" w:lastColumn="0" w:noHBand="0" w:noVBand="1"/>
       </w:tblPr>
@@ -1354,6 +1397,7 @@
         <w:rPr>
           <w:lang w:val="ru-RU"/>
         </w:rPr>
+        <w:lastRenderedPageBreak/>
         <w:t xml:space="preserve">Из таблицы следует, что 100000 даёт максимальный </w:t>
       </w:r>
       <w:r>
@@ -1428,7 +1472,6 @@
         <w:rPr>
           <w:noProof/>
         </w:rPr>
-        <w:lastRenderedPageBreak/>
         <w:drawing>
           <wp:inline distT="0" distB="0" distL="0" distR="0" wp14:anchorId="02EEC600" wp14:editId="1D2EB303">
             <wp:extent cx="5669280" cy="3342270"/>
@@ -1481,7 +1524,7 @@
     </w:p>
     <w:p>
       <w:pPr>
-        <w:pStyle w:val="1"/>
+        <w:pStyle w:val="Heading1"/>
       </w:pPr>
       <w:r>
         <w:t>5. Прямое сравнение Word2Vec и fastText</w:t>
@@ -1489,7 +1532,7 @@
     </w:p>
     <w:tbl>
       <w:tblPr>
-        <w:tblStyle w:val="aff0"/>
+        <w:tblStyle w:val="TableGrid"/>
         <w:tblW w:w="0" w:type="auto"/>
         <w:tblLook w:val="04A0" w:firstRow="1" w:lastRow="0" w:firstColumn="1" w:lastColumn="0" w:noHBand="0" w:noVBand="1"/>
       </w:tblPr>
@@ -1665,11 +1708,9 @@
         </w:rPr>
         <w:t>2</w:t>
       </w:r>
-      <w:proofErr w:type="spellStart"/>
       <w:r>
         <w:t>Vec</w:t>
       </w:r>
-      <w:proofErr w:type="spellEnd"/>
       <w:r>
         <w:rPr>
           <w:lang w:val="ru-RU"/>
@@ -1703,11 +1744,9 @@
         </w:rPr>
         <w:t xml:space="preserve">, тогда как </w:t>
       </w:r>
-      <w:proofErr w:type="spellStart"/>
       <w:r>
         <w:t>fastText</w:t>
       </w:r>
-      <w:proofErr w:type="spellEnd"/>
       <w:r>
         <w:rPr>
           <w:lang w:val="ru-RU"/>
@@ -1741,22 +1780,18 @@
         </w:rPr>
         <w:t>2</w:t>
       </w:r>
-      <w:proofErr w:type="spellStart"/>
       <w:r>
         <w:t>Vec</w:t>
       </w:r>
-      <w:proofErr w:type="spellEnd"/>
       <w:r>
         <w:rPr>
           <w:lang w:val="ru-RU"/>
         </w:rPr>
         <w:t xml:space="preserve"> в этом эксперименте лучше решает задачу классификации, а </w:t>
       </w:r>
-      <w:proofErr w:type="spellStart"/>
       <w:r>
         <w:t>fastText</w:t>
       </w:r>
-      <w:proofErr w:type="spellEnd"/>
       <w:r>
         <w:rPr>
           <w:lang w:val="ru-RU"/>
@@ -1893,7 +1928,7 @@
     </w:p>
     <w:p>
       <w:pPr>
-        <w:pStyle w:val="1"/>
+        <w:pStyle w:val="Heading1"/>
         <w:rPr>
           <w:lang w:val="ru-RU"/>
         </w:rPr>
@@ -1916,7 +1951,7 @@
     </w:p>
     <w:tbl>
       <w:tblPr>
-        <w:tblStyle w:val="aff0"/>
+        <w:tblStyle w:val="TableGrid"/>
         <w:tblW w:w="0" w:type="auto"/>
         <w:tblLook w:val="04A0" w:firstRow="1" w:lastRow="0" w:firstColumn="1" w:lastColumn="0" w:noHBand="0" w:noVBand="1"/>
       </w:tblPr>
@@ -1931,11 +1966,9 @@
             <w:tcW w:w="3312" w:type="dxa"/>
           </w:tcPr>
           <w:p>
-            <w:proofErr w:type="spellStart"/>
             <w:r>
               <w:t>Класс</w:t>
             </w:r>
-            <w:proofErr w:type="spellEnd"/>
           </w:p>
         </w:tc>
         <w:tc>
@@ -2158,20 +2191,12 @@
           <w:lang w:val="ru-RU"/>
         </w:rPr>
       </w:pPr>
-      <w:proofErr w:type="spellStart"/>
       <w:r>
         <w:rPr>
           <w:lang w:val="ru-RU"/>
         </w:rPr>
         <w:lastRenderedPageBreak/>
-        <w:t>Поклассовая</w:t>
-      </w:r>
-      <w:proofErr w:type="spellEnd"/>
-      <w:r>
-        <w:rPr>
-          <w:lang w:val="ru-RU"/>
-        </w:rPr>
-        <w:t xml:space="preserve"> таблица показывает, в каких направлениях резюме различия моделей проявляются сильнее. Это дополняет </w:t>
+        <w:t xml:space="preserve">Поклассовая таблица показывает, в каких направлениях резюме различия моделей проявляются сильнее. Это дополняет </w:t>
       </w:r>
       <w:r>
         <w:t>Macro</w:t>
@@ -2261,7 +2286,7 @@
     </w:p>
     <w:p>
       <w:pPr>
-        <w:pStyle w:val="1"/>
+        <w:pStyle w:val="Heading1"/>
         <w:rPr>
           <w:lang w:val="ru-RU"/>
         </w:rPr>
@@ -2297,11 +2322,9 @@
         </w:rPr>
         <w:t>2</w:t>
       </w:r>
-      <w:proofErr w:type="spellStart"/>
       <w:r>
         <w:t>Vec</w:t>
       </w:r>
-      <w:proofErr w:type="spellEnd"/>
       <w:r>
         <w:rPr>
           <w:lang w:val="ru-RU"/>
@@ -2310,37 +2333,8 @@
       </w:r>
     </w:p>
     <w:p>
-      <w:proofErr w:type="spellStart"/>
-      <w:r>
-        <w:t>fastText</w:t>
-      </w:r>
-      <w:proofErr w:type="spellEnd"/>
-      <w:r>
-        <w:t xml:space="preserve">: </w:t>
-      </w:r>
-      <w:proofErr w:type="spellStart"/>
-      <w:r>
-        <w:t>покрытие</w:t>
-      </w:r>
-      <w:proofErr w:type="spellEnd"/>
-      <w:r>
-        <w:t xml:space="preserve"> </w:t>
-      </w:r>
-      <w:proofErr w:type="spellStart"/>
-      <w:r>
-        <w:t>тестовых</w:t>
-      </w:r>
-      <w:proofErr w:type="spellEnd"/>
-      <w:r>
-        <w:t xml:space="preserve"> </w:t>
-      </w:r>
-      <w:proofErr w:type="spellStart"/>
-      <w:r>
-        <w:t>токенов</w:t>
-      </w:r>
-      <w:proofErr w:type="spellEnd"/>
-      <w:r>
-        <w:t xml:space="preserve"> 1.000.</w:t>
+      <w:r>
+        <w:t>fastText: покрытие тестовых токенов 1.000.</w:t>
       </w:r>
     </w:p>
     <w:p>
@@ -2400,11 +2394,9 @@
         </w:rPr>
         <w:t xml:space="preserve">График показывает практическое преимущество </w:t>
       </w:r>
-      <w:proofErr w:type="spellStart"/>
       <w:r>
         <w:t>fastText</w:t>
       </w:r>
-      <w:proofErr w:type="spellEnd"/>
       <w:r>
         <w:rPr>
           <w:lang w:val="ru-RU"/>
@@ -2438,11 +2430,9 @@
         </w:rPr>
         <w:t>2</w:t>
       </w:r>
-      <w:proofErr w:type="spellStart"/>
       <w:r>
         <w:t>Vec</w:t>
       </w:r>
-      <w:proofErr w:type="spellEnd"/>
       <w:r>
         <w:rPr>
           <w:lang w:val="ru-RU"/>
@@ -2459,7 +2449,7 @@
     </w:p>
     <w:p>
       <w:pPr>
-        <w:pStyle w:val="1"/>
+        <w:pStyle w:val="Heading1"/>
       </w:pPr>
       <w:r>
         <w:t>8. t-SNE</w:t>
@@ -2585,11 +2575,9 @@
         </w:rPr>
         <w:t xml:space="preserve"> </w:t>
       </w:r>
-      <w:proofErr w:type="spellStart"/>
       <w:r>
         <w:t>fastText</w:t>
       </w:r>
-      <w:proofErr w:type="spellEnd"/>
       <w:r>
         <w:rPr>
           <w:lang w:val="ru-RU"/>
@@ -2666,7 +2654,7 @@
     </w:p>
     <w:p>
       <w:pPr>
-        <w:pStyle w:val="1"/>
+        <w:pStyle w:val="Heading1"/>
         <w:rPr>
           <w:lang w:val="ru-RU"/>
         </w:rPr>
@@ -2699,11 +2687,9 @@
         </w:rPr>
         <w:t>2</w:t>
       </w:r>
-      <w:proofErr w:type="spellStart"/>
       <w:r>
         <w:t>Vec</w:t>
       </w:r>
-      <w:proofErr w:type="spellEnd"/>
       <w:r>
         <w:rPr>
           <w:lang w:val="ru-RU"/>
@@ -2737,11 +2723,9 @@
         </w:rPr>
         <w:t xml:space="preserve"> 0.761, а </w:t>
       </w:r>
-      <w:proofErr w:type="spellStart"/>
       <w:r>
         <w:t>fastText</w:t>
       </w:r>
-      <w:proofErr w:type="spellEnd"/>
       <w:r>
         <w:rPr>
           <w:lang w:val="ru-RU"/>
@@ -2775,11 +2759,9 @@
         </w:rPr>
         <w:t xml:space="preserve"> 0.749. При этом </w:t>
       </w:r>
-      <w:proofErr w:type="spellStart"/>
       <w:r>
         <w:t>fastText</w:t>
       </w:r>
-      <w:proofErr w:type="spellEnd"/>
       <w:r>
         <w:rPr>
           <w:lang w:val="ru-RU"/>
@@ -2813,11 +2795,9 @@
         </w:rPr>
         <w:t>2</w:t>
       </w:r>
-      <w:proofErr w:type="spellStart"/>
       <w:r>
         <w:t>Vec</w:t>
       </w:r>
-      <w:proofErr w:type="spellEnd"/>
       <w:r>
         <w:rPr>
           <w:lang w:val="ru-RU"/>
@@ -2842,22 +2822,18 @@
         </w:rPr>
         <w:t>2</w:t>
       </w:r>
-      <w:proofErr w:type="spellStart"/>
       <w:r>
         <w:t>Vec</w:t>
       </w:r>
-      <w:proofErr w:type="spellEnd"/>
       <w:r>
         <w:rPr>
           <w:lang w:val="ru-RU"/>
         </w:rPr>
         <w:t xml:space="preserve"> оказывается сильнее, а </w:t>
       </w:r>
-      <w:proofErr w:type="spellStart"/>
       <w:r>
         <w:t>fastText</w:t>
       </w:r>
-      <w:proofErr w:type="spellEnd"/>
       <w:r>
         <w:rPr>
           <w:lang w:val="ru-RU"/>
@@ -2894,7 +2870,7 @@
 </file>
 
 <file path=word/numbering.xml><?xml version="1.0" encoding="utf-8"?>
-<w:numbering xmlns:wpc="http://schemas.microsoft.com/office/word/2010/wordprocessingCanvas" xmlns:cx="http://schemas.microsoft.com/office/drawing/2014/chartex" xmlns:cx1="http://schemas.microsoft.com/office/drawing/2015/9/8/chartex" xmlns:cx2="http://schemas.microsoft.com/office/drawing/2015/10/21/chartex" xmlns:cx3="http://schemas.microsoft.com/office/drawing/2016/5/9/chartex" xmlns:cx4="http://schemas.microsoft.com/office/drawing/2016/5/10/chartex" xmlns:cx5="http://schemas.microsoft.com/office/drawing/2016/5/11/chartex" xmlns:cx6="http://schemas.microsoft.com/office/drawing/2016/5/12/chartex" xmlns:cx7="http://schemas.microsoft.com/office/drawing/2016/5/13/chartex" xmlns:cx8="http://schemas.microsoft.com/office/drawing/2016/5/14/chartex" xmlns:mc="http://schemas.openxmlformats.org/markup-compatibility/2006" xmlns:aink="http://schemas.microsoft.com/office/drawing/2016/ink" xmlns:am3d="http://schemas.microsoft.com/office/drawing/2017/model3d" xmlns:o="urn:schemas-microsoft-com:office:office" xmlns:oel="http://schemas.microsoft.com/office/2019/extlst" xmlns:r="http://schemas.openxmlformats.org/officeDocument/2006/relationships" xmlns:m="http://schemas.openxmlformats.org/officeDocument/2006/math" xmlns:v="urn:schemas-microsoft-com:vml" xmlns:wp14="http://schemas.microsoft.com/office/word/2010/wordprocessingDrawing" xmlns:wp="http://schemas.openxmlformats.org/drawingml/2006/wordprocessingDrawing" xmlns:w10="urn:schemas-microsoft-com:office:word" xmlns:w="http://schemas.openxmlformats.org/wordprocessingml/2006/main" xmlns:w14="http://schemas.microsoft.com/office/word/2010/wordml" xmlns:w15="http://schemas.microsoft.com/office/word/2012/wordml" xmlns:w16cex="http://schemas.microsoft.com/office/word/2018/wordml/cex" xmlns:w16cid="http://schemas.microsoft.com/office/word/2016/wordml/cid" xmlns:w16="http://schemas.microsoft.com/office/word/2018/wordml" xmlns:w16sdtdh="http://schemas.microsoft.com/office/word/2020/wordml/sdtdatahash" xmlns:w16se="http://schemas.microsoft.com/office/word/2015/wordml/symex" xmlns:wpg="http://schemas.microsoft.com/office/word/2010/wordprocessingGroup" xmlns:wpi="http://schemas.microsoft.com/office/word/2010/wordprocessingInk" xmlns:wne="http://schemas.microsoft.com/office/word/2006/wordml" xmlns:wps="http://schemas.microsoft.com/office/word/2010/wordprocessingShape" mc:Ignorable="w14 w15 w16se w16cid w16 w16cex w16sdtdh wp14">
+<w:numbering xmlns:wpc="http://schemas.microsoft.com/office/word/2010/wordprocessingCanvas" xmlns:cx="http://schemas.microsoft.com/office/drawing/2014/chartex" xmlns:cx1="http://schemas.microsoft.com/office/drawing/2015/9/8/chartex" xmlns:cx2="http://schemas.microsoft.com/office/drawing/2015/10/21/chartex" xmlns:cx3="http://schemas.microsoft.com/office/drawing/2016/5/9/chartex" xmlns:cx4="http://schemas.microsoft.com/office/drawing/2016/5/10/chartex" xmlns:cx5="http://schemas.microsoft.com/office/drawing/2016/5/11/chartex" xmlns:cx6="http://schemas.microsoft.com/office/drawing/2016/5/12/chartex" xmlns:cx7="http://schemas.microsoft.com/office/drawing/2016/5/13/chartex" xmlns:cx8="http://schemas.microsoft.com/office/drawing/2016/5/14/chartex" xmlns:mc="http://schemas.openxmlformats.org/markup-compatibility/2006" xmlns:aink="http://schemas.microsoft.com/office/drawing/2016/ink" xmlns:am3d="http://schemas.microsoft.com/office/drawing/2017/model3d" xmlns:o="urn:schemas-microsoft-com:office:office" xmlns:oel="http://schemas.microsoft.com/office/2019/extlst" xmlns:r="http://schemas.openxmlformats.org/officeDocument/2006/relationships" xmlns:m="http://schemas.openxmlformats.org/officeDocument/2006/math" xmlns:v="urn:schemas-microsoft-com:vml" xmlns:wp14="http://schemas.microsoft.com/office/word/2010/wordprocessingDrawing" xmlns:wp="http://schemas.openxmlformats.org/drawingml/2006/wordprocessingDrawing" xmlns:w10="urn:schemas-microsoft-com:office:word" xmlns:w="http://schemas.openxmlformats.org/wordprocessingml/2006/main" xmlns:w14="http://schemas.microsoft.com/office/word/2010/wordml" xmlns:w15="http://schemas.microsoft.com/office/word/2012/wordml" xmlns:w16cex="http://schemas.microsoft.com/office/word/2018/wordml/cex" xmlns:w16cid="http://schemas.microsoft.com/office/word/2016/wordml/cid" xmlns:w16="http://schemas.microsoft.com/office/word/2018/wordml" xmlns:w16du="http://schemas.microsoft.com/office/word/2023/wordml/word16du" xmlns:w16sdtdh="http://schemas.microsoft.com/office/word/2020/wordml/sdtdatahash" xmlns:w16sdtfl="http://schemas.microsoft.com/office/word/2024/wordml/sdtformatlock" xmlns:w16se="http://schemas.microsoft.com/office/word/2015/wordml/symex" xmlns:wpg="http://schemas.microsoft.com/office/word/2010/wordprocessingGroup" xmlns:wpi="http://schemas.microsoft.com/office/word/2010/wordprocessingInk" xmlns:wne="http://schemas.microsoft.com/office/word/2006/wordml" xmlns:wps="http://schemas.microsoft.com/office/word/2010/wordprocessingShape" mc:Ignorable="w14 w15 w16se w16cid w16 w16cex w16sdtdh w16sdtfl w16du wp14">
   <w:abstractNum w:abstractNumId="0" w15:restartNumberingAfterBreak="0">
     <w:nsid w:val="FFFFFF7C"/>
     <w:multiLevelType w:val="singleLevel"/>
@@ -2936,7 +2912,7 @@
     <w:lvl w:ilvl="0">
       <w:start w:val="1"/>
       <w:numFmt w:val="decimal"/>
-      <w:pStyle w:val="3"/>
+      <w:pStyle w:val="ListNumber3"/>
       <w:lvlText w:val="%1."/>
       <w:lvlJc w:val="left"/>
       <w:pPr>
@@ -2954,7 +2930,7 @@
     <w:lvl w:ilvl="0">
       <w:start w:val="1"/>
       <w:numFmt w:val="decimal"/>
-      <w:pStyle w:val="2"/>
+      <w:pStyle w:val="ListNumber2"/>
       <w:lvlText w:val="%1."/>
       <w:lvlJc w:val="left"/>
       <w:pPr>
@@ -2992,7 +2968,7 @@
     <w:lvl w:ilvl="0">
       <w:start w:val="1"/>
       <w:numFmt w:val="bullet"/>
-      <w:pStyle w:val="30"/>
+      <w:pStyle w:val="ListBullet3"/>
       <w:lvlText w:val=""/>
       <w:lvlJc w:val="left"/>
       <w:pPr>
@@ -3013,7 +2989,7 @@
     <w:lvl w:ilvl="0">
       <w:start w:val="1"/>
       <w:numFmt w:val="bullet"/>
-      <w:pStyle w:val="20"/>
+      <w:pStyle w:val="ListBullet2"/>
       <w:lvlText w:val=""/>
       <w:lvlJc w:val="left"/>
       <w:pPr>
@@ -3034,7 +3010,7 @@
     <w:lvl w:ilvl="0">
       <w:start w:val="1"/>
       <w:numFmt w:val="decimal"/>
-      <w:pStyle w:val="a"/>
+      <w:pStyle w:val="ListNumber"/>
       <w:lvlText w:val="%1."/>
       <w:lvlJc w:val="left"/>
       <w:pPr>
@@ -3052,7 +3028,7 @@
     <w:lvl w:ilvl="0">
       <w:start w:val="1"/>
       <w:numFmt w:val="bullet"/>
-      <w:pStyle w:val="a0"/>
+      <w:pStyle w:val="ListBullet"/>
       <w:lvlText w:val=""/>
       <w:lvlJc w:val="left"/>
       <w:pPr>
@@ -3063,6 +3039,232 @@
       </w:pPr>
       <w:rPr>
         <w:rFonts w:ascii="Symbol" w:hAnsi="Symbol" w:hint="default"/>
+      </w:rPr>
+    </w:lvl>
+  </w:abstractNum>
+  <w:abstractNum w:abstractNumId="9" w15:restartNumberingAfterBreak="0">
+    <w:nsid w:val="204E13CB"/>
+    <w:multiLevelType w:val="hybridMultilevel"/>
+    <w:tmpl w:val="F7DAEB6E"/>
+    <w:lvl w:ilvl="0" w:tplc="04090001">
+      <w:start w:val="1"/>
+      <w:numFmt w:val="bullet"/>
+      <w:lvlText w:val=""/>
+      <w:lvlJc w:val="left"/>
+      <w:pPr>
+        <w:ind w:left="720" w:hanging="360"/>
+      </w:pPr>
+      <w:rPr>
+        <w:rFonts w:ascii="Symbol" w:hAnsi="Symbol" w:hint="default"/>
+      </w:rPr>
+    </w:lvl>
+    <w:lvl w:ilvl="1" w:tplc="04090003" w:tentative="1">
+      <w:start w:val="1"/>
+      <w:numFmt w:val="bullet"/>
+      <w:lvlText w:val="o"/>
+      <w:lvlJc w:val="left"/>
+      <w:pPr>
+        <w:ind w:left="1440" w:hanging="360"/>
+      </w:pPr>
+      <w:rPr>
+        <w:rFonts w:ascii="Courier New" w:hAnsi="Courier New" w:cs="Courier New" w:hint="default"/>
+      </w:rPr>
+    </w:lvl>
+    <w:lvl w:ilvl="2" w:tplc="04090005" w:tentative="1">
+      <w:start w:val="1"/>
+      <w:numFmt w:val="bullet"/>
+      <w:lvlText w:val=""/>
+      <w:lvlJc w:val="left"/>
+      <w:pPr>
+        <w:ind w:left="2160" w:hanging="360"/>
+      </w:pPr>
+      <w:rPr>
+        <w:rFonts w:ascii="Wingdings" w:hAnsi="Wingdings" w:hint="default"/>
+      </w:rPr>
+    </w:lvl>
+    <w:lvl w:ilvl="3" w:tplc="04090001" w:tentative="1">
+      <w:start w:val="1"/>
+      <w:numFmt w:val="bullet"/>
+      <w:lvlText w:val=""/>
+      <w:lvlJc w:val="left"/>
+      <w:pPr>
+        <w:ind w:left="2880" w:hanging="360"/>
+      </w:pPr>
+      <w:rPr>
+        <w:rFonts w:ascii="Symbol" w:hAnsi="Symbol" w:hint="default"/>
+      </w:rPr>
+    </w:lvl>
+    <w:lvl w:ilvl="4" w:tplc="04090003" w:tentative="1">
+      <w:start w:val="1"/>
+      <w:numFmt w:val="bullet"/>
+      <w:lvlText w:val="o"/>
+      <w:lvlJc w:val="left"/>
+      <w:pPr>
+        <w:ind w:left="3600" w:hanging="360"/>
+      </w:pPr>
+      <w:rPr>
+        <w:rFonts w:ascii="Courier New" w:hAnsi="Courier New" w:cs="Courier New" w:hint="default"/>
+      </w:rPr>
+    </w:lvl>
+    <w:lvl w:ilvl="5" w:tplc="04090005" w:tentative="1">
+      <w:start w:val="1"/>
+      <w:numFmt w:val="bullet"/>
+      <w:lvlText w:val=""/>
+      <w:lvlJc w:val="left"/>
+      <w:pPr>
+        <w:ind w:left="4320" w:hanging="360"/>
+      </w:pPr>
+      <w:rPr>
+        <w:rFonts w:ascii="Wingdings" w:hAnsi="Wingdings" w:hint="default"/>
+      </w:rPr>
+    </w:lvl>
+    <w:lvl w:ilvl="6" w:tplc="04090001" w:tentative="1">
+      <w:start w:val="1"/>
+      <w:numFmt w:val="bullet"/>
+      <w:lvlText w:val=""/>
+      <w:lvlJc w:val="left"/>
+      <w:pPr>
+        <w:ind w:left="5040" w:hanging="360"/>
+      </w:pPr>
+      <w:rPr>
+        <w:rFonts w:ascii="Symbol" w:hAnsi="Symbol" w:hint="default"/>
+      </w:rPr>
+    </w:lvl>
+    <w:lvl w:ilvl="7" w:tplc="04090003" w:tentative="1">
+      <w:start w:val="1"/>
+      <w:numFmt w:val="bullet"/>
+      <w:lvlText w:val="o"/>
+      <w:lvlJc w:val="left"/>
+      <w:pPr>
+        <w:ind w:left="5760" w:hanging="360"/>
+      </w:pPr>
+      <w:rPr>
+        <w:rFonts w:ascii="Courier New" w:hAnsi="Courier New" w:cs="Courier New" w:hint="default"/>
+      </w:rPr>
+    </w:lvl>
+    <w:lvl w:ilvl="8" w:tplc="04090005" w:tentative="1">
+      <w:start w:val="1"/>
+      <w:numFmt w:val="bullet"/>
+      <w:lvlText w:val=""/>
+      <w:lvlJc w:val="left"/>
+      <w:pPr>
+        <w:ind w:left="6480" w:hanging="360"/>
+      </w:pPr>
+      <w:rPr>
+        <w:rFonts w:ascii="Wingdings" w:hAnsi="Wingdings" w:hint="default"/>
+      </w:rPr>
+    </w:lvl>
+  </w:abstractNum>
+  <w:abstractNum w:abstractNumId="10" w15:restartNumberingAfterBreak="0">
+    <w:nsid w:val="20D41208"/>
+    <w:multiLevelType w:val="hybridMultilevel"/>
+    <w:tmpl w:val="E4320B64"/>
+    <w:lvl w:ilvl="0" w:tplc="04090001">
+      <w:start w:val="1"/>
+      <w:numFmt w:val="bullet"/>
+      <w:lvlText w:val=""/>
+      <w:lvlJc w:val="left"/>
+      <w:pPr>
+        <w:ind w:left="720" w:hanging="360"/>
+      </w:pPr>
+      <w:rPr>
+        <w:rFonts w:ascii="Symbol" w:hAnsi="Symbol" w:hint="default"/>
+      </w:rPr>
+    </w:lvl>
+    <w:lvl w:ilvl="1" w:tplc="04090003" w:tentative="1">
+      <w:start w:val="1"/>
+      <w:numFmt w:val="bullet"/>
+      <w:lvlText w:val="o"/>
+      <w:lvlJc w:val="left"/>
+      <w:pPr>
+        <w:ind w:left="1440" w:hanging="360"/>
+      </w:pPr>
+      <w:rPr>
+        <w:rFonts w:ascii="Courier New" w:hAnsi="Courier New" w:cs="Courier New" w:hint="default"/>
+      </w:rPr>
+    </w:lvl>
+    <w:lvl w:ilvl="2" w:tplc="04090005" w:tentative="1">
+      <w:start w:val="1"/>
+      <w:numFmt w:val="bullet"/>
+      <w:lvlText w:val=""/>
+      <w:lvlJc w:val="left"/>
+      <w:pPr>
+        <w:ind w:left="2160" w:hanging="360"/>
+      </w:pPr>
+      <w:rPr>
+        <w:rFonts w:ascii="Wingdings" w:hAnsi="Wingdings" w:hint="default"/>
+      </w:rPr>
+    </w:lvl>
+    <w:lvl w:ilvl="3" w:tplc="04090001" w:tentative="1">
+      <w:start w:val="1"/>
+      <w:numFmt w:val="bullet"/>
+      <w:lvlText w:val=""/>
+      <w:lvlJc w:val="left"/>
+      <w:pPr>
+        <w:ind w:left="2880" w:hanging="360"/>
+      </w:pPr>
+      <w:rPr>
+        <w:rFonts w:ascii="Symbol" w:hAnsi="Symbol" w:hint="default"/>
+      </w:rPr>
+    </w:lvl>
+    <w:lvl w:ilvl="4" w:tplc="04090003" w:tentative="1">
+      <w:start w:val="1"/>
+      <w:numFmt w:val="bullet"/>
+      <w:lvlText w:val="o"/>
+      <w:lvlJc w:val="left"/>
+      <w:pPr>
+        <w:ind w:left="3600" w:hanging="360"/>
+      </w:pPr>
+      <w:rPr>
+        <w:rFonts w:ascii="Courier New" w:hAnsi="Courier New" w:cs="Courier New" w:hint="default"/>
+      </w:rPr>
+    </w:lvl>
+    <w:lvl w:ilvl="5" w:tplc="04090005" w:tentative="1">
+      <w:start w:val="1"/>
+      <w:numFmt w:val="bullet"/>
+      <w:lvlText w:val=""/>
+      <w:lvlJc w:val="left"/>
+      <w:pPr>
+        <w:ind w:left="4320" w:hanging="360"/>
+      </w:pPr>
+      <w:rPr>
+        <w:rFonts w:ascii="Wingdings" w:hAnsi="Wingdings" w:hint="default"/>
+      </w:rPr>
+    </w:lvl>
+    <w:lvl w:ilvl="6" w:tplc="04090001" w:tentative="1">
+      <w:start w:val="1"/>
+      <w:numFmt w:val="bullet"/>
+      <w:lvlText w:val=""/>
+      <w:lvlJc w:val="left"/>
+      <w:pPr>
+        <w:ind w:left="5040" w:hanging="360"/>
+      </w:pPr>
+      <w:rPr>
+        <w:rFonts w:ascii="Symbol" w:hAnsi="Symbol" w:hint="default"/>
+      </w:rPr>
+    </w:lvl>
+    <w:lvl w:ilvl="7" w:tplc="04090003" w:tentative="1">
+      <w:start w:val="1"/>
+      <w:numFmt w:val="bullet"/>
+      <w:lvlText w:val="o"/>
+      <w:lvlJc w:val="left"/>
+      <w:pPr>
+        <w:ind w:left="5760" w:hanging="360"/>
+      </w:pPr>
+      <w:rPr>
+        <w:rFonts w:ascii="Courier New" w:hAnsi="Courier New" w:cs="Courier New" w:hint="default"/>
+      </w:rPr>
+    </w:lvl>
+    <w:lvl w:ilvl="8" w:tplc="04090005" w:tentative="1">
+      <w:start w:val="1"/>
+      <w:numFmt w:val="bullet"/>
+      <w:lvlText w:val=""/>
+      <w:lvlJc w:val="left"/>
+      <w:pPr>
+        <w:ind w:left="6480" w:hanging="360"/>
+      </w:pPr>
+      <w:rPr>
+        <w:rFonts w:ascii="Wingdings" w:hAnsi="Wingdings" w:hint="default"/>
       </w:rPr>
     </w:lvl>
   </w:abstractNum>
@@ -3093,11 +3295,17 @@
   <w:num w:numId="9" w16cid:durableId="616254175">
     <w:abstractNumId w:val="0"/>
   </w:num>
+  <w:num w:numId="10" w16cid:durableId="1350597417">
+    <w:abstractNumId w:val="9"/>
+  </w:num>
+  <w:num w:numId="11" w16cid:durableId="91364370">
+    <w:abstractNumId w:val="10"/>
+  </w:num>
 </w:numbering>
 </file>
 
 <file path=word/styles.xml><?xml version="1.0" encoding="utf-8"?>
-<w:styles xmlns:mc="http://schemas.openxmlformats.org/markup-compatibility/2006" xmlns:r="http://schemas.openxmlformats.org/officeDocument/2006/relationships" xmlns:w="http://schemas.openxmlformats.org/wordprocessingml/2006/main" xmlns:w14="http://schemas.microsoft.com/office/word/2010/wordml" xmlns:w15="http://schemas.microsoft.com/office/word/2012/wordml" xmlns:w16cex="http://schemas.microsoft.com/office/word/2018/wordml/cex" xmlns:w16cid="http://schemas.microsoft.com/office/word/2016/wordml/cid" xmlns:w16="http://schemas.microsoft.com/office/word/2018/wordml" xmlns:w16sdtdh="http://schemas.microsoft.com/office/word/2020/wordml/sdtdatahash" xmlns:w16se="http://schemas.microsoft.com/office/word/2015/wordml/symex" mc:Ignorable="w14 w15 w16se w16cid w16 w16cex w16sdtdh">
+<w:styles xmlns:mc="http://schemas.openxmlformats.org/markup-compatibility/2006" xmlns:r="http://schemas.openxmlformats.org/officeDocument/2006/relationships" xmlns:w="http://schemas.openxmlformats.org/wordprocessingml/2006/main" xmlns:w14="http://schemas.microsoft.com/office/word/2010/wordml" xmlns:w15="http://schemas.microsoft.com/office/word/2012/wordml" xmlns:w16cex="http://schemas.microsoft.com/office/word/2018/wordml/cex" xmlns:w16cid="http://schemas.microsoft.com/office/word/2016/wordml/cid" xmlns:w16="http://schemas.microsoft.com/office/word/2018/wordml" xmlns:w16du="http://schemas.microsoft.com/office/word/2023/wordml/word16du" xmlns:w16sdtdh="http://schemas.microsoft.com/office/word/2020/wordml/sdtdatahash" xmlns:w16sdtfl="http://schemas.microsoft.com/office/word/2024/wordml/sdtformatlock" xmlns:w16se="http://schemas.microsoft.com/office/word/2015/wordml/symex" mc:Ignorable="w14 w15 w16se w16cid w16 w16cex w16sdtdh w16sdtfl w16du">
   <w:docDefaults>
     <w:rPrDefault>
       <w:rPr>
@@ -3482,7 +3690,7 @@
     <w:lsdException w:name="Unresolved Mention" w:semiHidden="1" w:unhideWhenUsed="1"/>
     <w:lsdException w:name="Smart Link" w:semiHidden="1" w:unhideWhenUsed="1"/>
   </w:latentStyles>
-  <w:style w:type="paragraph" w:default="1" w:styleId="a1">
+  <w:style w:type="paragraph" w:default="1" w:styleId="Normal">
     <w:name w:val="Normal"/>
     <w:qFormat/>
     <w:rsid w:val="00FC693F"/>
@@ -3491,11 +3699,11 @@
       <w:sz w:val="21"/>
     </w:rPr>
   </w:style>
-  <w:style w:type="paragraph" w:styleId="1">
+  <w:style w:type="paragraph" w:styleId="Heading1">
     <w:name w:val="heading 1"/>
-    <w:basedOn w:val="a1"/>
-    <w:next w:val="a1"/>
-    <w:link w:val="10"/>
+    <w:basedOn w:val="Normal"/>
+    <w:next w:val="Normal"/>
+    <w:link w:val="Heading1Char"/>
     <w:uiPriority w:val="9"/>
     <w:qFormat/>
     <w:rsid w:val="00FC693F"/>
@@ -3514,11 +3722,11 @@
       <w:szCs w:val="28"/>
     </w:rPr>
   </w:style>
-  <w:style w:type="paragraph" w:styleId="21">
+  <w:style w:type="paragraph" w:styleId="Heading2">
     <w:name w:val="heading 2"/>
-    <w:basedOn w:val="a1"/>
-    <w:next w:val="a1"/>
-    <w:link w:val="22"/>
+    <w:basedOn w:val="Normal"/>
+    <w:next w:val="Normal"/>
+    <w:link w:val="Heading2Char"/>
     <w:uiPriority w:val="9"/>
     <w:unhideWhenUsed/>
     <w:qFormat/>
@@ -3538,11 +3746,11 @@
       <w:szCs w:val="26"/>
     </w:rPr>
   </w:style>
-  <w:style w:type="paragraph" w:styleId="31">
+  <w:style w:type="paragraph" w:styleId="Heading3">
     <w:name w:val="heading 3"/>
-    <w:basedOn w:val="a1"/>
-    <w:next w:val="a1"/>
-    <w:link w:val="32"/>
+    <w:basedOn w:val="Normal"/>
+    <w:next w:val="Normal"/>
+    <w:link w:val="Heading3Char"/>
     <w:uiPriority w:val="9"/>
     <w:unhideWhenUsed/>
     <w:qFormat/>
@@ -3560,11 +3768,11 @@
       <w:color w:val="4F81BD" w:themeColor="accent1"/>
     </w:rPr>
   </w:style>
-  <w:style w:type="paragraph" w:styleId="4">
+  <w:style w:type="paragraph" w:styleId="Heading4">
     <w:name w:val="heading 4"/>
-    <w:basedOn w:val="a1"/>
-    <w:next w:val="a1"/>
-    <w:link w:val="40"/>
+    <w:basedOn w:val="Normal"/>
+    <w:next w:val="Normal"/>
+    <w:link w:val="Heading4Char"/>
     <w:uiPriority w:val="9"/>
     <w:semiHidden/>
     <w:unhideWhenUsed/>
@@ -3585,11 +3793,11 @@
       <w:color w:val="4F81BD" w:themeColor="accent1"/>
     </w:rPr>
   </w:style>
-  <w:style w:type="paragraph" w:styleId="5">
+  <w:style w:type="paragraph" w:styleId="Heading5">
     <w:name w:val="heading 5"/>
-    <w:basedOn w:val="a1"/>
-    <w:next w:val="a1"/>
-    <w:link w:val="50"/>
+    <w:basedOn w:val="Normal"/>
+    <w:next w:val="Normal"/>
+    <w:link w:val="Heading5Char"/>
     <w:uiPriority w:val="9"/>
     <w:semiHidden/>
     <w:unhideWhenUsed/>
@@ -3606,11 +3814,11 @@
       <w:color w:val="243F60" w:themeColor="accent1" w:themeShade="7F"/>
     </w:rPr>
   </w:style>
-  <w:style w:type="paragraph" w:styleId="6">
+  <w:style w:type="paragraph" w:styleId="Heading6">
     <w:name w:val="heading 6"/>
-    <w:basedOn w:val="a1"/>
-    <w:next w:val="a1"/>
-    <w:link w:val="60"/>
+    <w:basedOn w:val="Normal"/>
+    <w:next w:val="Normal"/>
+    <w:link w:val="Heading6Char"/>
     <w:uiPriority w:val="9"/>
     <w:semiHidden/>
     <w:unhideWhenUsed/>
@@ -3629,11 +3837,11 @@
       <w:color w:val="243F60" w:themeColor="accent1" w:themeShade="7F"/>
     </w:rPr>
   </w:style>
-  <w:style w:type="paragraph" w:styleId="7">
+  <w:style w:type="paragraph" w:styleId="Heading7">
     <w:name w:val="heading 7"/>
-    <w:basedOn w:val="a1"/>
-    <w:next w:val="a1"/>
-    <w:link w:val="70"/>
+    <w:basedOn w:val="Normal"/>
+    <w:next w:val="Normal"/>
+    <w:link w:val="Heading7Char"/>
     <w:uiPriority w:val="9"/>
     <w:semiHidden/>
     <w:unhideWhenUsed/>
@@ -3652,11 +3860,11 @@
       <w:color w:val="404040" w:themeColor="text1" w:themeTint="BF"/>
     </w:rPr>
   </w:style>
-  <w:style w:type="paragraph" w:styleId="8">
+  <w:style w:type="paragraph" w:styleId="Heading8">
     <w:name w:val="heading 8"/>
-    <w:basedOn w:val="a1"/>
-    <w:next w:val="a1"/>
-    <w:link w:val="80"/>
+    <w:basedOn w:val="Normal"/>
+    <w:next w:val="Normal"/>
+    <w:link w:val="Heading8Char"/>
     <w:uiPriority w:val="9"/>
     <w:semiHidden/>
     <w:unhideWhenUsed/>
@@ -3675,11 +3883,11 @@
       <w:szCs w:val="20"/>
     </w:rPr>
   </w:style>
-  <w:style w:type="paragraph" w:styleId="9">
+  <w:style w:type="paragraph" w:styleId="Heading9">
     <w:name w:val="heading 9"/>
-    <w:basedOn w:val="a1"/>
-    <w:next w:val="a1"/>
-    <w:link w:val="90"/>
+    <w:basedOn w:val="Normal"/>
+    <w:next w:val="Normal"/>
+    <w:link w:val="Heading9Char"/>
     <w:uiPriority w:val="9"/>
     <w:semiHidden/>
     <w:unhideWhenUsed/>
@@ -3700,13 +3908,13 @@
       <w:szCs w:val="20"/>
     </w:rPr>
   </w:style>
-  <w:style w:type="character" w:default="1" w:styleId="a2">
+  <w:style w:type="character" w:default="1" w:styleId="DefaultParagraphFont">
     <w:name w:val="Default Paragraph Font"/>
     <w:uiPriority w:val="1"/>
     <w:semiHidden/>
     <w:unhideWhenUsed/>
   </w:style>
-  <w:style w:type="table" w:default="1" w:styleId="a3">
+  <w:style w:type="table" w:default="1" w:styleId="TableNormal">
     <w:name w:val="Normal Table"/>
     <w:uiPriority w:val="99"/>
     <w:semiHidden/>
@@ -3721,16 +3929,16 @@
       </w:tblCellMar>
     </w:tblPr>
   </w:style>
-  <w:style w:type="numbering" w:default="1" w:styleId="a4">
+  <w:style w:type="numbering" w:default="1" w:styleId="NoList">
     <w:name w:val="No List"/>
     <w:uiPriority w:val="99"/>
     <w:semiHidden/>
     <w:unhideWhenUsed/>
   </w:style>
-  <w:style w:type="paragraph" w:styleId="a5">
+  <w:style w:type="paragraph" w:styleId="Header">
     <w:name w:val="header"/>
-    <w:basedOn w:val="a1"/>
-    <w:link w:val="a6"/>
+    <w:basedOn w:val="Normal"/>
+    <w:link w:val="HeaderChar"/>
     <w:uiPriority w:val="99"/>
     <w:unhideWhenUsed/>
     <w:rsid w:val="00E618BF"/>
@@ -3742,17 +3950,17 @@
       <w:spacing w:after="0" w:line="240" w:lineRule="auto"/>
     </w:pPr>
   </w:style>
-  <w:style w:type="character" w:customStyle="1" w:styleId="a6">
-    <w:name w:val="Верхний колонтитул Знак"/>
-    <w:basedOn w:val="a2"/>
-    <w:link w:val="a5"/>
+  <w:style w:type="character" w:customStyle="1" w:styleId="HeaderChar">
+    <w:name w:val="Header Char"/>
+    <w:basedOn w:val="DefaultParagraphFont"/>
+    <w:link w:val="Header"/>
     <w:uiPriority w:val="99"/>
     <w:rsid w:val="00E618BF"/>
   </w:style>
-  <w:style w:type="paragraph" w:styleId="a7">
+  <w:style w:type="paragraph" w:styleId="Footer">
     <w:name w:val="footer"/>
-    <w:basedOn w:val="a1"/>
-    <w:link w:val="a8"/>
+    <w:basedOn w:val="Normal"/>
+    <w:link w:val="FooterChar"/>
     <w:uiPriority w:val="99"/>
     <w:unhideWhenUsed/>
     <w:rsid w:val="00E618BF"/>
@@ -3764,14 +3972,14 @@
       <w:spacing w:after="0" w:line="240" w:lineRule="auto"/>
     </w:pPr>
   </w:style>
-  <w:style w:type="character" w:customStyle="1" w:styleId="a8">
-    <w:name w:val="Нижний колонтитул Знак"/>
-    <w:basedOn w:val="a2"/>
-    <w:link w:val="a7"/>
+  <w:style w:type="character" w:customStyle="1" w:styleId="FooterChar">
+    <w:name w:val="Footer Char"/>
+    <w:basedOn w:val="DefaultParagraphFont"/>
+    <w:link w:val="Footer"/>
     <w:uiPriority w:val="99"/>
     <w:rsid w:val="00E618BF"/>
   </w:style>
-  <w:style w:type="paragraph" w:styleId="a9">
+  <w:style w:type="paragraph" w:styleId="NoSpacing">
     <w:name w:val="No Spacing"/>
     <w:uiPriority w:val="1"/>
     <w:qFormat/>
@@ -3780,10 +3988,10 @@
       <w:spacing w:after="0" w:line="240" w:lineRule="auto"/>
     </w:pPr>
   </w:style>
-  <w:style w:type="character" w:customStyle="1" w:styleId="10">
-    <w:name w:val="Заголовок 1 Знак"/>
-    <w:basedOn w:val="a2"/>
-    <w:link w:val="1"/>
+  <w:style w:type="character" w:customStyle="1" w:styleId="Heading1Char">
+    <w:name w:val="Heading 1 Char"/>
+    <w:basedOn w:val="DefaultParagraphFont"/>
+    <w:link w:val="Heading1"/>
     <w:uiPriority w:val="9"/>
     <w:rsid w:val="00FC693F"/>
     <w:rPr>
@@ -3795,10 +4003,10 @@
       <w:szCs w:val="28"/>
     </w:rPr>
   </w:style>
-  <w:style w:type="character" w:customStyle="1" w:styleId="22">
-    <w:name w:val="Заголовок 2 Знак"/>
-    <w:basedOn w:val="a2"/>
-    <w:link w:val="21"/>
+  <w:style w:type="character" w:customStyle="1" w:styleId="Heading2Char">
+    <w:name w:val="Heading 2 Char"/>
+    <w:basedOn w:val="DefaultParagraphFont"/>
+    <w:link w:val="Heading2"/>
     <w:uiPriority w:val="9"/>
     <w:rsid w:val="00FC693F"/>
     <w:rPr>
@@ -3810,10 +4018,10 @@
       <w:szCs w:val="26"/>
     </w:rPr>
   </w:style>
-  <w:style w:type="character" w:customStyle="1" w:styleId="32">
-    <w:name w:val="Заголовок 3 Знак"/>
-    <w:basedOn w:val="a2"/>
-    <w:link w:val="31"/>
+  <w:style w:type="character" w:customStyle="1" w:styleId="Heading3Char">
+    <w:name w:val="Heading 3 Char"/>
+    <w:basedOn w:val="DefaultParagraphFont"/>
+    <w:link w:val="Heading3"/>
     <w:uiPriority w:val="9"/>
     <w:rsid w:val="00FC693F"/>
     <w:rPr>
@@ -3823,11 +4031,11 @@
       <w:color w:val="4F81BD" w:themeColor="accent1"/>
     </w:rPr>
   </w:style>
-  <w:style w:type="paragraph" w:styleId="aa">
+  <w:style w:type="paragraph" w:styleId="Title">
     <w:name w:val="Title"/>
-    <w:basedOn w:val="a1"/>
-    <w:next w:val="a1"/>
-    <w:link w:val="ab"/>
+    <w:basedOn w:val="Normal"/>
+    <w:next w:val="Normal"/>
+    <w:link w:val="TitleChar"/>
     <w:uiPriority w:val="10"/>
     <w:qFormat/>
     <w:rsid w:val="00FC693F"/>
@@ -3847,10 +4055,10 @@
       <w:szCs w:val="52"/>
     </w:rPr>
   </w:style>
-  <w:style w:type="character" w:customStyle="1" w:styleId="ab">
-    <w:name w:val="Заголовок Знак"/>
-    <w:basedOn w:val="a2"/>
-    <w:link w:val="aa"/>
+  <w:style w:type="character" w:customStyle="1" w:styleId="TitleChar">
+    <w:name w:val="Title Char"/>
+    <w:basedOn w:val="DefaultParagraphFont"/>
+    <w:link w:val="Title"/>
     <w:uiPriority w:val="10"/>
     <w:rsid w:val="00FC693F"/>
     <w:rPr>
@@ -3862,11 +4070,11 @@
       <w:szCs w:val="52"/>
     </w:rPr>
   </w:style>
-  <w:style w:type="paragraph" w:styleId="ac">
+  <w:style w:type="paragraph" w:styleId="Subtitle">
     <w:name w:val="Subtitle"/>
-    <w:basedOn w:val="a1"/>
-    <w:next w:val="a1"/>
-    <w:link w:val="ad"/>
+    <w:basedOn w:val="Normal"/>
+    <w:next w:val="Normal"/>
+    <w:link w:val="SubtitleChar"/>
     <w:uiPriority w:val="11"/>
     <w:qFormat/>
     <w:rsid w:val="00FC693F"/>
@@ -3885,10 +4093,10 @@
       <w:szCs w:val="24"/>
     </w:rPr>
   </w:style>
-  <w:style w:type="character" w:customStyle="1" w:styleId="ad">
-    <w:name w:val="Подзаголовок Знак"/>
-    <w:basedOn w:val="a2"/>
-    <w:link w:val="ac"/>
+  <w:style w:type="character" w:customStyle="1" w:styleId="SubtitleChar">
+    <w:name w:val="Subtitle Char"/>
+    <w:basedOn w:val="DefaultParagraphFont"/>
+    <w:link w:val="Subtitle"/>
     <w:uiPriority w:val="11"/>
     <w:rsid w:val="00FC693F"/>
     <w:rPr>
@@ -3901,9 +4109,9 @@
       <w:szCs w:val="24"/>
     </w:rPr>
   </w:style>
-  <w:style w:type="paragraph" w:styleId="ae">
+  <w:style w:type="paragraph" w:styleId="ListParagraph">
     <w:name w:val="List Paragraph"/>
-    <w:basedOn w:val="a1"/>
+    <w:basedOn w:val="Normal"/>
     <w:uiPriority w:val="34"/>
     <w:qFormat/>
     <w:rsid w:val="00FC693F"/>
@@ -3912,10 +4120,10 @@
       <w:contextualSpacing/>
     </w:pPr>
   </w:style>
-  <w:style w:type="paragraph" w:styleId="af">
+  <w:style w:type="paragraph" w:styleId="BodyText">
     <w:name w:val="Body Text"/>
-    <w:basedOn w:val="a1"/>
-    <w:link w:val="af0"/>
+    <w:basedOn w:val="Normal"/>
+    <w:link w:val="BodyTextChar"/>
     <w:uiPriority w:val="99"/>
     <w:unhideWhenUsed/>
     <w:rsid w:val="00AA1D8D"/>
@@ -3923,17 +4131,17 @@
       <w:spacing w:after="120"/>
     </w:pPr>
   </w:style>
-  <w:style w:type="character" w:customStyle="1" w:styleId="af0">
-    <w:name w:val="Основной текст Знак"/>
-    <w:basedOn w:val="a2"/>
-    <w:link w:val="af"/>
+  <w:style w:type="character" w:customStyle="1" w:styleId="BodyTextChar">
+    <w:name w:val="Body Text Char"/>
+    <w:basedOn w:val="DefaultParagraphFont"/>
+    <w:link w:val="BodyText"/>
     <w:uiPriority w:val="99"/>
     <w:rsid w:val="00AA1D8D"/>
   </w:style>
-  <w:style w:type="paragraph" w:styleId="23">
+  <w:style w:type="paragraph" w:styleId="BodyText2">
     <w:name w:val="Body Text 2"/>
-    <w:basedOn w:val="a1"/>
-    <w:link w:val="24"/>
+    <w:basedOn w:val="Normal"/>
+    <w:link w:val="BodyText2Char"/>
     <w:uiPriority w:val="99"/>
     <w:unhideWhenUsed/>
     <w:rsid w:val="00AA1D8D"/>
@@ -3941,17 +4149,17 @@
       <w:spacing w:after="120" w:line="480" w:lineRule="auto"/>
     </w:pPr>
   </w:style>
-  <w:style w:type="character" w:customStyle="1" w:styleId="24">
-    <w:name w:val="Основной текст 2 Знак"/>
-    <w:basedOn w:val="a2"/>
-    <w:link w:val="23"/>
+  <w:style w:type="character" w:customStyle="1" w:styleId="BodyText2Char">
+    <w:name w:val="Body Text 2 Char"/>
+    <w:basedOn w:val="DefaultParagraphFont"/>
+    <w:link w:val="BodyText2"/>
     <w:uiPriority w:val="99"/>
     <w:rsid w:val="00AA1D8D"/>
   </w:style>
-  <w:style w:type="paragraph" w:styleId="33">
+  <w:style w:type="paragraph" w:styleId="BodyText3">
     <w:name w:val="Body Text 3"/>
-    <w:basedOn w:val="a1"/>
-    <w:link w:val="34"/>
+    <w:basedOn w:val="Normal"/>
+    <w:link w:val="BodyText3Char"/>
     <w:uiPriority w:val="99"/>
     <w:unhideWhenUsed/>
     <w:rsid w:val="00AA1D8D"/>
@@ -3963,10 +4171,10 @@
       <w:szCs w:val="16"/>
     </w:rPr>
   </w:style>
-  <w:style w:type="character" w:customStyle="1" w:styleId="34">
-    <w:name w:val="Основной текст 3 Знак"/>
-    <w:basedOn w:val="a2"/>
-    <w:link w:val="33"/>
+  <w:style w:type="character" w:customStyle="1" w:styleId="BodyText3Char">
+    <w:name w:val="Body Text 3 Char"/>
+    <w:basedOn w:val="DefaultParagraphFont"/>
+    <w:link w:val="BodyText3"/>
     <w:uiPriority w:val="99"/>
     <w:rsid w:val="00AA1D8D"/>
     <w:rPr>
@@ -3974,9 +4182,9 @@
       <w:szCs w:val="16"/>
     </w:rPr>
   </w:style>
-  <w:style w:type="paragraph" w:styleId="af1">
+  <w:style w:type="paragraph" w:styleId="List">
     <w:name w:val="List"/>
-    <w:basedOn w:val="a1"/>
+    <w:basedOn w:val="Normal"/>
     <w:uiPriority w:val="99"/>
     <w:unhideWhenUsed/>
     <w:rsid w:val="00AA1D8D"/>
@@ -3985,9 +4193,9 @@
       <w:contextualSpacing/>
     </w:pPr>
   </w:style>
-  <w:style w:type="paragraph" w:styleId="25">
+  <w:style w:type="paragraph" w:styleId="List2">
     <w:name w:val="List 2"/>
-    <w:basedOn w:val="a1"/>
+    <w:basedOn w:val="Normal"/>
     <w:uiPriority w:val="99"/>
     <w:unhideWhenUsed/>
     <w:rsid w:val="00326F90"/>
@@ -3996,9 +4204,9 @@
       <w:contextualSpacing/>
     </w:pPr>
   </w:style>
-  <w:style w:type="paragraph" w:styleId="35">
+  <w:style w:type="paragraph" w:styleId="List3">
     <w:name w:val="List 3"/>
-    <w:basedOn w:val="a1"/>
+    <w:basedOn w:val="Normal"/>
     <w:uiPriority w:val="99"/>
     <w:unhideWhenUsed/>
     <w:rsid w:val="00326F90"/>
@@ -4007,9 +4215,9 @@
       <w:contextualSpacing/>
     </w:pPr>
   </w:style>
-  <w:style w:type="paragraph" w:styleId="a0">
+  <w:style w:type="paragraph" w:styleId="ListBullet">
     <w:name w:val="List Bullet"/>
-    <w:basedOn w:val="a1"/>
+    <w:basedOn w:val="Normal"/>
     <w:uiPriority w:val="99"/>
     <w:unhideWhenUsed/>
     <w:rsid w:val="00326F90"/>
@@ -4020,9 +4228,9 @@
       <w:contextualSpacing/>
     </w:pPr>
   </w:style>
-  <w:style w:type="paragraph" w:styleId="20">
+  <w:style w:type="paragraph" w:styleId="ListBullet2">
     <w:name w:val="List Bullet 2"/>
-    <w:basedOn w:val="a1"/>
+    <w:basedOn w:val="Normal"/>
     <w:uiPriority w:val="99"/>
     <w:unhideWhenUsed/>
     <w:rsid w:val="00326F90"/>
@@ -4033,9 +4241,9 @@
       <w:contextualSpacing/>
     </w:pPr>
   </w:style>
-  <w:style w:type="paragraph" w:styleId="30">
+  <w:style w:type="paragraph" w:styleId="ListBullet3">
     <w:name w:val="List Bullet 3"/>
-    <w:basedOn w:val="a1"/>
+    <w:basedOn w:val="Normal"/>
     <w:uiPriority w:val="99"/>
     <w:unhideWhenUsed/>
     <w:rsid w:val="00326F90"/>
@@ -4046,9 +4254,9 @@
       <w:contextualSpacing/>
     </w:pPr>
   </w:style>
-  <w:style w:type="paragraph" w:styleId="a">
+  <w:style w:type="paragraph" w:styleId="ListNumber">
     <w:name w:val="List Number"/>
-    <w:basedOn w:val="a1"/>
+    <w:basedOn w:val="Normal"/>
     <w:uiPriority w:val="99"/>
     <w:unhideWhenUsed/>
     <w:rsid w:val="00326F90"/>
@@ -4059,9 +4267,9 @@
       <w:contextualSpacing/>
     </w:pPr>
   </w:style>
-  <w:style w:type="paragraph" w:styleId="2">
+  <w:style w:type="paragraph" w:styleId="ListNumber2">
     <w:name w:val="List Number 2"/>
-    <w:basedOn w:val="a1"/>
+    <w:basedOn w:val="Normal"/>
     <w:uiPriority w:val="99"/>
     <w:unhideWhenUsed/>
     <w:rsid w:val="0029639D"/>
@@ -4072,9 +4280,9 @@
       <w:contextualSpacing/>
     </w:pPr>
   </w:style>
-  <w:style w:type="paragraph" w:styleId="3">
+  <w:style w:type="paragraph" w:styleId="ListNumber3">
     <w:name w:val="List Number 3"/>
-    <w:basedOn w:val="a1"/>
+    <w:basedOn w:val="Normal"/>
     <w:uiPriority w:val="99"/>
     <w:unhideWhenUsed/>
     <w:rsid w:val="0029639D"/>
@@ -4085,9 +4293,9 @@
       <w:contextualSpacing/>
     </w:pPr>
   </w:style>
-  <w:style w:type="paragraph" w:styleId="af2">
+  <w:style w:type="paragraph" w:styleId="ListContinue">
     <w:name w:val="List Continue"/>
-    <w:basedOn w:val="a1"/>
+    <w:basedOn w:val="Normal"/>
     <w:uiPriority w:val="99"/>
     <w:unhideWhenUsed/>
     <w:rsid w:val="0029639D"/>
@@ -4097,9 +4305,9 @@
       <w:contextualSpacing/>
     </w:pPr>
   </w:style>
-  <w:style w:type="paragraph" w:styleId="26">
+  <w:style w:type="paragraph" w:styleId="ListContinue2">
     <w:name w:val="List Continue 2"/>
-    <w:basedOn w:val="a1"/>
+    <w:basedOn w:val="Normal"/>
     <w:uiPriority w:val="99"/>
     <w:unhideWhenUsed/>
     <w:rsid w:val="0029639D"/>
@@ -4109,9 +4317,9 @@
       <w:contextualSpacing/>
     </w:pPr>
   </w:style>
-  <w:style w:type="paragraph" w:styleId="36">
+  <w:style w:type="paragraph" w:styleId="ListContinue3">
     <w:name w:val="List Continue 3"/>
-    <w:basedOn w:val="a1"/>
+    <w:basedOn w:val="Normal"/>
     <w:uiPriority w:val="99"/>
     <w:unhideWhenUsed/>
     <w:rsid w:val="0029639D"/>
@@ -4121,9 +4329,9 @@
       <w:contextualSpacing/>
     </w:pPr>
   </w:style>
-  <w:style w:type="paragraph" w:styleId="af3">
+  <w:style w:type="paragraph" w:styleId="MacroText">
     <w:name w:val="macro"/>
-    <w:link w:val="af4"/>
+    <w:link w:val="MacroTextChar"/>
     <w:uiPriority w:val="99"/>
     <w:unhideWhenUsed/>
     <w:rsid w:val="0029639D"/>
@@ -4144,10 +4352,10 @@
       <w:szCs w:val="20"/>
     </w:rPr>
   </w:style>
-  <w:style w:type="character" w:customStyle="1" w:styleId="af4">
-    <w:name w:val="Текст макроса Знак"/>
-    <w:basedOn w:val="a2"/>
-    <w:link w:val="af3"/>
+  <w:style w:type="character" w:customStyle="1" w:styleId="MacroTextChar">
+    <w:name w:val="Macro Text Char"/>
+    <w:basedOn w:val="DefaultParagraphFont"/>
+    <w:link w:val="MacroText"/>
     <w:uiPriority w:val="99"/>
     <w:rsid w:val="0029639D"/>
     <w:rPr>
@@ -4156,11 +4364,11 @@
       <w:szCs w:val="20"/>
     </w:rPr>
   </w:style>
-  <w:style w:type="paragraph" w:styleId="27">
+  <w:style w:type="paragraph" w:styleId="Quote">
     <w:name w:val="Quote"/>
-    <w:basedOn w:val="a1"/>
-    <w:next w:val="a1"/>
-    <w:link w:val="28"/>
+    <w:basedOn w:val="Normal"/>
+    <w:next w:val="Normal"/>
+    <w:link w:val="QuoteChar"/>
     <w:uiPriority w:val="29"/>
     <w:qFormat/>
     <w:rsid w:val="00FC693F"/>
@@ -4170,10 +4378,10 @@
       <w:color w:val="000000" w:themeColor="text1"/>
     </w:rPr>
   </w:style>
-  <w:style w:type="character" w:customStyle="1" w:styleId="28">
-    <w:name w:val="Цитата 2 Знак"/>
-    <w:basedOn w:val="a2"/>
-    <w:link w:val="27"/>
+  <w:style w:type="character" w:customStyle="1" w:styleId="QuoteChar">
+    <w:name w:val="Quote Char"/>
+    <w:basedOn w:val="DefaultParagraphFont"/>
+    <w:link w:val="Quote"/>
     <w:uiPriority w:val="29"/>
     <w:rsid w:val="00FC693F"/>
     <w:rPr>
@@ -4182,10 +4390,10 @@
       <w:color w:val="000000" w:themeColor="text1"/>
     </w:rPr>
   </w:style>
-  <w:style w:type="character" w:customStyle="1" w:styleId="40">
-    <w:name w:val="Заголовок 4 Знак"/>
-    <w:basedOn w:val="a2"/>
-    <w:link w:val="4"/>
+  <w:style w:type="character" w:customStyle="1" w:styleId="Heading4Char">
+    <w:name w:val="Heading 4 Char"/>
+    <w:basedOn w:val="DefaultParagraphFont"/>
+    <w:link w:val="Heading4"/>
     <w:uiPriority w:val="9"/>
     <w:semiHidden/>
     <w:rsid w:val="00FC693F"/>
@@ -4198,10 +4406,10 @@
       <w:color w:val="4F81BD" w:themeColor="accent1"/>
     </w:rPr>
   </w:style>
-  <w:style w:type="character" w:customStyle="1" w:styleId="50">
-    <w:name w:val="Заголовок 5 Знак"/>
-    <w:basedOn w:val="a2"/>
-    <w:link w:val="5"/>
+  <w:style w:type="character" w:customStyle="1" w:styleId="Heading5Char">
+    <w:name w:val="Heading 5 Char"/>
+    <w:basedOn w:val="DefaultParagraphFont"/>
+    <w:link w:val="Heading5"/>
     <w:uiPriority w:val="9"/>
     <w:semiHidden/>
     <w:rsid w:val="00FC693F"/>
@@ -4210,10 +4418,10 @@
       <w:color w:val="243F60" w:themeColor="accent1" w:themeShade="7F"/>
     </w:rPr>
   </w:style>
-  <w:style w:type="character" w:customStyle="1" w:styleId="60">
-    <w:name w:val="Заголовок 6 Знак"/>
-    <w:basedOn w:val="a2"/>
-    <w:link w:val="6"/>
+  <w:style w:type="character" w:customStyle="1" w:styleId="Heading6Char">
+    <w:name w:val="Heading 6 Char"/>
+    <w:basedOn w:val="DefaultParagraphFont"/>
+    <w:link w:val="Heading6"/>
     <w:uiPriority w:val="9"/>
     <w:semiHidden/>
     <w:rsid w:val="00FC693F"/>
@@ -4224,10 +4432,10 @@
       <w:color w:val="243F60" w:themeColor="accent1" w:themeShade="7F"/>
     </w:rPr>
   </w:style>
-  <w:style w:type="character" w:customStyle="1" w:styleId="70">
-    <w:name w:val="Заголовок 7 Знак"/>
-    <w:basedOn w:val="a2"/>
-    <w:link w:val="7"/>
+  <w:style w:type="character" w:customStyle="1" w:styleId="Heading7Char">
+    <w:name w:val="Heading 7 Char"/>
+    <w:basedOn w:val="DefaultParagraphFont"/>
+    <w:link w:val="Heading7"/>
     <w:uiPriority w:val="9"/>
     <w:semiHidden/>
     <w:rsid w:val="00FC693F"/>
@@ -4238,10 +4446,10 @@
       <w:color w:val="404040" w:themeColor="text1" w:themeTint="BF"/>
     </w:rPr>
   </w:style>
-  <w:style w:type="character" w:customStyle="1" w:styleId="80">
-    <w:name w:val="Заголовок 8 Знак"/>
-    <w:basedOn w:val="a2"/>
-    <w:link w:val="8"/>
+  <w:style w:type="character" w:customStyle="1" w:styleId="Heading8Char">
+    <w:name w:val="Heading 8 Char"/>
+    <w:basedOn w:val="DefaultParagraphFont"/>
+    <w:link w:val="Heading8"/>
     <w:uiPriority w:val="9"/>
     <w:semiHidden/>
     <w:rsid w:val="00FC693F"/>
@@ -4252,10 +4460,10 @@
       <w:szCs w:val="20"/>
     </w:rPr>
   </w:style>
-  <w:style w:type="character" w:customStyle="1" w:styleId="90">
-    <w:name w:val="Заголовок 9 Знак"/>
-    <w:basedOn w:val="a2"/>
-    <w:link w:val="9"/>
+  <w:style w:type="character" w:customStyle="1" w:styleId="Heading9Char">
+    <w:name w:val="Heading 9 Char"/>
+    <w:basedOn w:val="DefaultParagraphFont"/>
+    <w:link w:val="Heading9"/>
     <w:uiPriority w:val="9"/>
     <w:semiHidden/>
     <w:rsid w:val="00FC693F"/>
@@ -4268,10 +4476,10 @@
       <w:szCs w:val="20"/>
     </w:rPr>
   </w:style>
-  <w:style w:type="paragraph" w:styleId="af5">
+  <w:style w:type="paragraph" w:styleId="Caption">
     <w:name w:val="caption"/>
-    <w:basedOn w:val="a1"/>
-    <w:next w:val="a1"/>
+    <w:basedOn w:val="Normal"/>
+    <w:next w:val="Normal"/>
     <w:uiPriority w:val="35"/>
     <w:semiHidden/>
     <w:unhideWhenUsed/>
@@ -4288,9 +4496,9 @@
       <w:szCs w:val="18"/>
     </w:rPr>
   </w:style>
-  <w:style w:type="character" w:styleId="af6">
+  <w:style w:type="character" w:styleId="Strong">
     <w:name w:val="Strong"/>
-    <w:basedOn w:val="a2"/>
+    <w:basedOn w:val="DefaultParagraphFont"/>
     <w:uiPriority w:val="22"/>
     <w:qFormat/>
     <w:rsid w:val="00FC693F"/>
@@ -4299,9 +4507,9 @@
       <w:bCs/>
     </w:rPr>
   </w:style>
-  <w:style w:type="character" w:styleId="af7">
+  <w:style w:type="character" w:styleId="Emphasis">
     <w:name w:val="Emphasis"/>
-    <w:basedOn w:val="a2"/>
+    <w:basedOn w:val="DefaultParagraphFont"/>
     <w:uiPriority w:val="20"/>
     <w:qFormat/>
     <w:rsid w:val="00FC693F"/>
@@ -4310,11 +4518,11 @@
       <w:iCs/>
     </w:rPr>
   </w:style>
-  <w:style w:type="paragraph" w:styleId="af8">
+  <w:style w:type="paragraph" w:styleId="IntenseQuote">
     <w:name w:val="Intense Quote"/>
-    <w:basedOn w:val="a1"/>
-    <w:next w:val="a1"/>
-    <w:link w:val="af9"/>
+    <w:basedOn w:val="Normal"/>
+    <w:next w:val="Normal"/>
+    <w:link w:val="IntenseQuoteChar"/>
     <w:uiPriority w:val="30"/>
     <w:qFormat/>
     <w:rsid w:val="00FC693F"/>
@@ -4333,10 +4541,10 @@
       <w:color w:val="4F81BD" w:themeColor="accent1"/>
     </w:rPr>
   </w:style>
-  <w:style w:type="character" w:customStyle="1" w:styleId="af9">
-    <w:name w:val="Выделенная цитата Знак"/>
-    <w:basedOn w:val="a2"/>
-    <w:link w:val="af8"/>
+  <w:style w:type="character" w:customStyle="1" w:styleId="IntenseQuoteChar">
+    <w:name w:val="Intense Quote Char"/>
+    <w:basedOn w:val="DefaultParagraphFont"/>
+    <w:link w:val="IntenseQuote"/>
     <w:uiPriority w:val="30"/>
     <w:rsid w:val="00FC693F"/>
     <w:rPr>
@@ -4347,9 +4555,9 @@
       <w:color w:val="4F81BD" w:themeColor="accent1"/>
     </w:rPr>
   </w:style>
-  <w:style w:type="character" w:styleId="afa">
+  <w:style w:type="character" w:styleId="SubtleEmphasis">
     <w:name w:val="Subtle Emphasis"/>
-    <w:basedOn w:val="a2"/>
+    <w:basedOn w:val="DefaultParagraphFont"/>
     <w:uiPriority w:val="19"/>
     <w:qFormat/>
     <w:rsid w:val="00FC693F"/>
@@ -4359,9 +4567,9 @@
       <w:color w:val="808080" w:themeColor="text1" w:themeTint="7F"/>
     </w:rPr>
   </w:style>
-  <w:style w:type="character" w:styleId="afb">
+  <w:style w:type="character" w:styleId="IntenseEmphasis">
     <w:name w:val="Intense Emphasis"/>
-    <w:basedOn w:val="a2"/>
+    <w:basedOn w:val="DefaultParagraphFont"/>
     <w:uiPriority w:val="21"/>
     <w:qFormat/>
     <w:rsid w:val="00FC693F"/>
@@ -4373,9 +4581,9 @@
       <w:color w:val="4F81BD" w:themeColor="accent1"/>
     </w:rPr>
   </w:style>
-  <w:style w:type="character" w:styleId="afc">
+  <w:style w:type="character" w:styleId="SubtleReference">
     <w:name w:val="Subtle Reference"/>
-    <w:basedOn w:val="a2"/>
+    <w:basedOn w:val="DefaultParagraphFont"/>
     <w:uiPriority w:val="31"/>
     <w:qFormat/>
     <w:rsid w:val="00FC693F"/>
@@ -4385,9 +4593,9 @@
       <w:u w:val="single"/>
     </w:rPr>
   </w:style>
-  <w:style w:type="character" w:styleId="afd">
+  <w:style w:type="character" w:styleId="IntenseReference">
     <w:name w:val="Intense Reference"/>
-    <w:basedOn w:val="a2"/>
+    <w:basedOn w:val="DefaultParagraphFont"/>
     <w:uiPriority w:val="32"/>
     <w:qFormat/>
     <w:rsid w:val="00FC693F"/>
@@ -4400,9 +4608,9 @@
       <w:u w:val="single"/>
     </w:rPr>
   </w:style>
-  <w:style w:type="character" w:styleId="afe">
+  <w:style w:type="character" w:styleId="BookTitle">
     <w:name w:val="Book Title"/>
-    <w:basedOn w:val="a2"/>
+    <w:basedOn w:val="DefaultParagraphFont"/>
     <w:uiPriority w:val="33"/>
     <w:qFormat/>
     <w:rsid w:val="00FC693F"/>
@@ -4413,10 +4621,10 @@
       <w:spacing w:val="5"/>
     </w:rPr>
   </w:style>
-  <w:style w:type="paragraph" w:styleId="aff">
+  <w:style w:type="paragraph" w:styleId="TOCHeading">
     <w:name w:val="TOC Heading"/>
-    <w:basedOn w:val="1"/>
-    <w:next w:val="a1"/>
+    <w:basedOn w:val="Heading1"/>
+    <w:next w:val="Normal"/>
     <w:uiPriority w:val="39"/>
     <w:semiHidden/>
     <w:unhideWhenUsed/>
@@ -4426,9 +4634,9 @@
       <w:outlineLvl w:val="9"/>
     </w:pPr>
   </w:style>
-  <w:style w:type="table" w:styleId="aff0">
+  <w:style w:type="table" w:styleId="TableGrid">
     <w:name w:val="Table Grid"/>
-    <w:basedOn w:val="a3"/>
+    <w:basedOn w:val="TableNormal"/>
     <w:uiPriority w:val="59"/>
     <w:rsid w:val="00FC693F"/>
     <w:pPr>
@@ -4445,9 +4653,9 @@
       </w:tblBorders>
     </w:tblPr>
   </w:style>
-  <w:style w:type="table" w:styleId="aff1">
+  <w:style w:type="table" w:styleId="LightShading">
     <w:name w:val="Light Shading"/>
-    <w:basedOn w:val="a3"/>
+    <w:basedOn w:val="TableNormal"/>
     <w:uiPriority w:val="60"/>
     <w:rsid w:val="00FC693F"/>
     <w:pPr>
@@ -4541,9 +4749,9 @@
       </w:tcPr>
     </w:tblStylePr>
   </w:style>
-  <w:style w:type="table" w:styleId="-1">
+  <w:style w:type="table" w:styleId="LightShading-Accent1">
     <w:name w:val="Light Shading Accent 1"/>
-    <w:basedOn w:val="a3"/>
+    <w:basedOn w:val="TableNormal"/>
     <w:uiPriority w:val="60"/>
     <w:rsid w:val="00FC693F"/>
     <w:pPr>
@@ -4637,9 +4845,9 @@
       </w:tcPr>
     </w:tblStylePr>
   </w:style>
-  <w:style w:type="table" w:styleId="-2">
+  <w:style w:type="table" w:styleId="LightShading-Accent2">
     <w:name w:val="Light Shading Accent 2"/>
-    <w:basedOn w:val="a3"/>
+    <w:basedOn w:val="TableNormal"/>
     <w:uiPriority w:val="60"/>
     <w:rsid w:val="00FC693F"/>
     <w:pPr>
@@ -4733,9 +4941,9 @@
       </w:tcPr>
     </w:tblStylePr>
   </w:style>
-  <w:style w:type="table" w:styleId="-3">
+  <w:style w:type="table" w:styleId="LightShading-Accent3">
     <w:name w:val="Light Shading Accent 3"/>
-    <w:basedOn w:val="a3"/>
+    <w:basedOn w:val="TableNormal"/>
     <w:uiPriority w:val="60"/>
     <w:rsid w:val="00FC693F"/>
     <w:pPr>
@@ -4829,9 +5037,9 @@
       </w:tcPr>
     </w:tblStylePr>
   </w:style>
-  <w:style w:type="table" w:styleId="-4">
+  <w:style w:type="table" w:styleId="LightShading-Accent4">
     <w:name w:val="Light Shading Accent 4"/>
-    <w:basedOn w:val="a3"/>
+    <w:basedOn w:val="TableNormal"/>
     <w:uiPriority w:val="60"/>
     <w:rsid w:val="00FC693F"/>
     <w:pPr>
@@ -4925,9 +5133,9 @@
       </w:tcPr>
     </w:tblStylePr>
   </w:style>
-  <w:style w:type="table" w:styleId="-5">
+  <w:style w:type="table" w:styleId="LightShading-Accent5">
     <w:name w:val="Light Shading Accent 5"/>
-    <w:basedOn w:val="a3"/>
+    <w:basedOn w:val="TableNormal"/>
     <w:uiPriority w:val="60"/>
     <w:rsid w:val="00FC693F"/>
     <w:pPr>
@@ -5021,9 +5229,9 @@
       </w:tcPr>
     </w:tblStylePr>
   </w:style>
-  <w:style w:type="table" w:styleId="-6">
+  <w:style w:type="table" w:styleId="LightShading-Accent6">
     <w:name w:val="Light Shading Accent 6"/>
-    <w:basedOn w:val="a3"/>
+    <w:basedOn w:val="TableNormal"/>
     <w:uiPriority w:val="60"/>
     <w:rsid w:val="00FC693F"/>
     <w:pPr>
@@ -5117,9 +5325,9 @@
       </w:tcPr>
     </w:tblStylePr>
   </w:style>
-  <w:style w:type="table" w:styleId="aff2">
+  <w:style w:type="table" w:styleId="LightList">
     <w:name w:val="Light List"/>
-    <w:basedOn w:val="a3"/>
+    <w:basedOn w:val="TableNormal"/>
     <w:uiPriority w:val="61"/>
     <w:rsid w:val="00FC693F"/>
     <w:pPr>
@@ -5202,9 +5410,9 @@
       </w:tcPr>
     </w:tblStylePr>
   </w:style>
-  <w:style w:type="table" w:styleId="-10">
+  <w:style w:type="table" w:styleId="LightList-Accent1">
     <w:name w:val="Light List Accent 1"/>
-    <w:basedOn w:val="a3"/>
+    <w:basedOn w:val="TableNormal"/>
     <w:uiPriority w:val="61"/>
     <w:rsid w:val="00FC693F"/>
     <w:pPr>
@@ -5287,9 +5495,9 @@
       </w:tcPr>
     </w:tblStylePr>
   </w:style>
-  <w:style w:type="table" w:styleId="-20">
+  <w:style w:type="table" w:styleId="LightList-Accent2">
     <w:name w:val="Light List Accent 2"/>
-    <w:basedOn w:val="a3"/>
+    <w:basedOn w:val="TableNormal"/>
     <w:uiPriority w:val="61"/>
     <w:rsid w:val="00CB0664"/>
     <w:pPr>
@@ -5372,9 +5580,9 @@
       </w:tcPr>
     </w:tblStylePr>
   </w:style>
-  <w:style w:type="table" w:styleId="-30">
+  <w:style w:type="table" w:styleId="LightList-Accent3">
     <w:name w:val="Light List Accent 3"/>
-    <w:basedOn w:val="a3"/>
+    <w:basedOn w:val="TableNormal"/>
     <w:uiPriority w:val="61"/>
     <w:rsid w:val="00CB0664"/>
     <w:pPr>
@@ -5457,9 +5665,9 @@
       </w:tcPr>
     </w:tblStylePr>
   </w:style>
-  <w:style w:type="table" w:styleId="-40">
+  <w:style w:type="table" w:styleId="LightList-Accent4">
     <w:name w:val="Light List Accent 4"/>
-    <w:basedOn w:val="a3"/>
+    <w:basedOn w:val="TableNormal"/>
     <w:uiPriority w:val="61"/>
     <w:rsid w:val="00CB0664"/>
     <w:pPr>
@@ -5542,9 +5750,9 @@
       </w:tcPr>
     </w:tblStylePr>
   </w:style>
-  <w:style w:type="table" w:styleId="-50">
+  <w:style w:type="table" w:styleId="LightList-Accent5">
     <w:name w:val="Light List Accent 5"/>
-    <w:basedOn w:val="a3"/>
+    <w:basedOn w:val="TableNormal"/>
     <w:uiPriority w:val="61"/>
     <w:rsid w:val="00CB0664"/>
     <w:pPr>
@@ -5627,9 +5835,9 @@
       </w:tcPr>
     </w:tblStylePr>
   </w:style>
-  <w:style w:type="table" w:styleId="-60">
+  <w:style w:type="table" w:styleId="LightList-Accent6">
     <w:name w:val="Light List Accent 6"/>
-    <w:basedOn w:val="a3"/>
+    <w:basedOn w:val="TableNormal"/>
     <w:uiPriority w:val="61"/>
     <w:rsid w:val="00CB0664"/>
     <w:pPr>
@@ -5712,9 +5920,9 @@
       </w:tcPr>
     </w:tblStylePr>
   </w:style>
-  <w:style w:type="table" w:styleId="aff3">
+  <w:style w:type="table" w:styleId="LightGrid">
     <w:name w:val="Light Grid"/>
-    <w:basedOn w:val="a3"/>
+    <w:basedOn w:val="TableNormal"/>
     <w:uiPriority w:val="62"/>
     <w:rsid w:val="00CB0664"/>
     <w:pPr>
@@ -5835,9 +6043,9 @@
       </w:tcPr>
     </w:tblStylePr>
   </w:style>
-  <w:style w:type="table" w:styleId="-11">
+  <w:style w:type="table" w:styleId="LightGrid-Accent1">
     <w:name w:val="Light Grid Accent 1"/>
-    <w:basedOn w:val="a3"/>
+    <w:basedOn w:val="TableNormal"/>
     <w:uiPriority w:val="62"/>
     <w:rsid w:val="00CB0664"/>
     <w:pPr>
@@ -5958,9 +6166,9 @@
       </w:tcPr>
     </w:tblStylePr>
   </w:style>
-  <w:style w:type="table" w:styleId="-21">
+  <w:style w:type="table" w:styleId="LightGrid-Accent2">
     <w:name w:val="Light Grid Accent 2"/>
-    <w:basedOn w:val="a3"/>
+    <w:basedOn w:val="TableNormal"/>
     <w:uiPriority w:val="62"/>
     <w:rsid w:val="00CB0664"/>
     <w:pPr>
@@ -6081,9 +6289,9 @@
       </w:tcPr>
     </w:tblStylePr>
   </w:style>
-  <w:style w:type="table" w:styleId="-31">
+  <w:style w:type="table" w:styleId="LightGrid-Accent3">
     <w:name w:val="Light Grid Accent 3"/>
-    <w:basedOn w:val="a3"/>
+    <w:basedOn w:val="TableNormal"/>
     <w:uiPriority w:val="62"/>
     <w:rsid w:val="00CB0664"/>
     <w:pPr>
@@ -6204,9 +6412,9 @@
       </w:tcPr>
     </w:tblStylePr>
   </w:style>
-  <w:style w:type="table" w:styleId="-41">
+  <w:style w:type="table" w:styleId="LightGrid-Accent4">
     <w:name w:val="Light Grid Accent 4"/>
-    <w:basedOn w:val="a3"/>
+    <w:basedOn w:val="TableNormal"/>
     <w:uiPriority w:val="62"/>
     <w:rsid w:val="00CB0664"/>
     <w:pPr>
@@ -6327,9 +6535,9 @@
       </w:tcPr>
     </w:tblStylePr>
   </w:style>
-  <w:style w:type="table" w:styleId="-51">
+  <w:style w:type="table" w:styleId="LightGrid-Accent5">
     <w:name w:val="Light Grid Accent 5"/>
-    <w:basedOn w:val="a3"/>
+    <w:basedOn w:val="TableNormal"/>
     <w:uiPriority w:val="62"/>
     <w:rsid w:val="00CB0664"/>
     <w:pPr>
@@ -6450,9 +6658,9 @@
       </w:tcPr>
     </w:tblStylePr>
   </w:style>
-  <w:style w:type="table" w:styleId="-61">
+  <w:style w:type="table" w:styleId="LightGrid-Accent6">
     <w:name w:val="Light Grid Accent 6"/>
-    <w:basedOn w:val="a3"/>
+    <w:basedOn w:val="TableNormal"/>
     <w:uiPriority w:val="62"/>
     <w:rsid w:val="00CB0664"/>
     <w:pPr>
@@ -6573,9 +6781,9 @@
       </w:tcPr>
     </w:tblStylePr>
   </w:style>
-  <w:style w:type="table" w:styleId="11">
+  <w:style w:type="table" w:styleId="MediumShading1">
     <w:name w:val="Medium Shading 1"/>
-    <w:basedOn w:val="a3"/>
+    <w:basedOn w:val="TableNormal"/>
     <w:uiPriority w:val="63"/>
     <w:rsid w:val="00CB0664"/>
     <w:pPr>
@@ -6672,9 +6880,9 @@
       </w:tcPr>
     </w:tblStylePr>
   </w:style>
-  <w:style w:type="table" w:styleId="1-1">
+  <w:style w:type="table" w:styleId="MediumShading1-Accent1">
     <w:name w:val="Medium Shading 1 Accent 1"/>
-    <w:basedOn w:val="a3"/>
+    <w:basedOn w:val="TableNormal"/>
     <w:uiPriority w:val="63"/>
     <w:rsid w:val="00CB0664"/>
     <w:pPr>
@@ -6771,9 +6979,9 @@
       </w:tcPr>
     </w:tblStylePr>
   </w:style>
-  <w:style w:type="table" w:styleId="1-2">
+  <w:style w:type="table" w:styleId="MediumShading1-Accent2">
     <w:name w:val="Medium Shading 1 Accent 2"/>
-    <w:basedOn w:val="a3"/>
+    <w:basedOn w:val="TableNormal"/>
     <w:uiPriority w:val="63"/>
     <w:rsid w:val="00CB0664"/>
     <w:pPr>
@@ -6870,9 +7078,9 @@
       </w:tcPr>
     </w:tblStylePr>
   </w:style>
-  <w:style w:type="table" w:styleId="1-3">
+  <w:style w:type="table" w:styleId="MediumShading1-Accent3">
     <w:name w:val="Medium Shading 1 Accent 3"/>
-    <w:basedOn w:val="a3"/>
+    <w:basedOn w:val="TableNormal"/>
     <w:uiPriority w:val="63"/>
     <w:rsid w:val="00CB0664"/>
     <w:pPr>
@@ -6969,9 +7177,9 @@
       </w:tcPr>
     </w:tblStylePr>
   </w:style>
-  <w:style w:type="table" w:styleId="1-4">
+  <w:style w:type="table" w:styleId="MediumShading1-Accent4">
     <w:name w:val="Medium Shading 1 Accent 4"/>
-    <w:basedOn w:val="a3"/>
+    <w:basedOn w:val="TableNormal"/>
     <w:uiPriority w:val="63"/>
     <w:rsid w:val="00CB0664"/>
     <w:pPr>
@@ -7068,9 +7276,9 @@
       </w:tcPr>
     </w:tblStylePr>
   </w:style>
-  <w:style w:type="table" w:styleId="1-5">
+  <w:style w:type="table" w:styleId="MediumShading1-Accent5">
     <w:name w:val="Medium Shading 1 Accent 5"/>
-    <w:basedOn w:val="a3"/>
+    <w:basedOn w:val="TableNormal"/>
     <w:uiPriority w:val="63"/>
     <w:rsid w:val="00CB0664"/>
     <w:pPr>
@@ -7167,9 +7375,9 @@
       </w:tcPr>
     </w:tblStylePr>
   </w:style>
-  <w:style w:type="table" w:styleId="1-6">
+  <w:style w:type="table" w:styleId="MediumShading1-Accent6">
     <w:name w:val="Medium Shading 1 Accent 6"/>
-    <w:basedOn w:val="a3"/>
+    <w:basedOn w:val="TableNormal"/>
     <w:uiPriority w:val="63"/>
     <w:rsid w:val="00CB0664"/>
     <w:pPr>
@@ -7266,9 +7474,9 @@
       </w:tcPr>
     </w:tblStylePr>
   </w:style>
-  <w:style w:type="table" w:styleId="29">
+  <w:style w:type="table" w:styleId="MediumShading2">
     <w:name w:val="Medium Shading 2"/>
-    <w:basedOn w:val="a3"/>
+    <w:basedOn w:val="TableNormal"/>
     <w:uiPriority w:val="64"/>
     <w:rsid w:val="00CB0664"/>
     <w:pPr>
@@ -7408,9 +7616,9 @@
       </w:tcPr>
     </w:tblStylePr>
   </w:style>
-  <w:style w:type="table" w:styleId="2-1">
+  <w:style w:type="table" w:styleId="MediumShading2-Accent1">
     <w:name w:val="Medium Shading 2 Accent 1"/>
-    <w:basedOn w:val="a3"/>
+    <w:basedOn w:val="TableNormal"/>
     <w:uiPriority w:val="64"/>
     <w:rsid w:val="00CB0664"/>
     <w:pPr>
@@ -7550,9 +7758,9 @@
       </w:tcPr>
     </w:tblStylePr>
   </w:style>
-  <w:style w:type="table" w:styleId="2-2">
+  <w:style w:type="table" w:styleId="MediumShading2-Accent2">
     <w:name w:val="Medium Shading 2 Accent 2"/>
-    <w:basedOn w:val="a3"/>
+    <w:basedOn w:val="TableNormal"/>
     <w:uiPriority w:val="64"/>
     <w:rsid w:val="00CB0664"/>
     <w:pPr>
@@ -7692,9 +7900,9 @@
       </w:tcPr>
     </w:tblStylePr>
   </w:style>
-  <w:style w:type="table" w:styleId="2-3">
+  <w:style w:type="table" w:styleId="MediumShading2-Accent3">
     <w:name w:val="Medium Shading 2 Accent 3"/>
-    <w:basedOn w:val="a3"/>
+    <w:basedOn w:val="TableNormal"/>
     <w:uiPriority w:val="64"/>
     <w:rsid w:val="00CB0664"/>
     <w:pPr>
@@ -7834,9 +8042,9 @@
       </w:tcPr>
     </w:tblStylePr>
   </w:style>
-  <w:style w:type="table" w:styleId="2-4">
+  <w:style w:type="table" w:styleId="MediumShading2-Accent4">
     <w:name w:val="Medium Shading 2 Accent 4"/>
-    <w:basedOn w:val="a3"/>
+    <w:basedOn w:val="TableNormal"/>
     <w:uiPriority w:val="64"/>
     <w:rsid w:val="00CB0664"/>
     <w:pPr>
@@ -7976,9 +8184,9 @@
       </w:tcPr>
     </w:tblStylePr>
   </w:style>
-  <w:style w:type="table" w:styleId="2-5">
+  <w:style w:type="table" w:styleId="MediumShading2-Accent5">
     <w:name w:val="Medium Shading 2 Accent 5"/>
-    <w:basedOn w:val="a3"/>
+    <w:basedOn w:val="TableNormal"/>
     <w:uiPriority w:val="64"/>
     <w:rsid w:val="00CB0664"/>
     <w:pPr>
@@ -8118,9 +8326,9 @@
       </w:tcPr>
     </w:tblStylePr>
   </w:style>
-  <w:style w:type="table" w:styleId="2-6">
+  <w:style w:type="table" w:styleId="MediumShading2-Accent6">
     <w:name w:val="Medium Shading 2 Accent 6"/>
-    <w:basedOn w:val="a3"/>
+    <w:basedOn w:val="TableNormal"/>
     <w:uiPriority w:val="64"/>
     <w:rsid w:val="00CB0664"/>
     <w:pPr>
@@ -8260,9 +8468,9 @@
       </w:tcPr>
     </w:tblStylePr>
   </w:style>
-  <w:style w:type="table" w:styleId="12">
+  <w:style w:type="table" w:styleId="MediumList1">
     <w:name w:val="Medium List 1"/>
-    <w:basedOn w:val="a3"/>
+    <w:basedOn w:val="TableNormal"/>
     <w:uiPriority w:val="65"/>
     <w:rsid w:val="00CB0664"/>
     <w:pPr>
@@ -8337,9 +8545,9 @@
       </w:tcPr>
     </w:tblStylePr>
   </w:style>
-  <w:style w:type="table" w:styleId="1-10">
+  <w:style w:type="table" w:styleId="MediumList1-Accent1">
     <w:name w:val="Medium List 1 Accent 1"/>
-    <w:basedOn w:val="a3"/>
+    <w:basedOn w:val="TableNormal"/>
     <w:uiPriority w:val="65"/>
     <w:rsid w:val="00CB0664"/>
     <w:pPr>
@@ -8414,9 +8622,9 @@
       </w:tcPr>
     </w:tblStylePr>
   </w:style>
-  <w:style w:type="table" w:styleId="1-20">
+  <w:style w:type="table" w:styleId="MediumList1-Accent2">
     <w:name w:val="Medium List 1 Accent 2"/>
-    <w:basedOn w:val="a3"/>
+    <w:basedOn w:val="TableNormal"/>
     <w:uiPriority w:val="65"/>
     <w:rsid w:val="00CB0664"/>
     <w:pPr>
@@ -8491,9 +8699,9 @@
       </w:tcPr>
     </w:tblStylePr>
   </w:style>
-  <w:style w:type="table" w:styleId="1-30">
+  <w:style w:type="table" w:styleId="MediumList1-Accent3">
     <w:name w:val="Medium List 1 Accent 3"/>
-    <w:basedOn w:val="a3"/>
+    <w:basedOn w:val="TableNormal"/>
     <w:uiPriority w:val="65"/>
     <w:rsid w:val="00CB0664"/>
     <w:pPr>
@@ -8568,9 +8776,9 @@
       </w:tcPr>
     </w:tblStylePr>
   </w:style>
-  <w:style w:type="table" w:styleId="1-40">
+  <w:style w:type="table" w:styleId="MediumList1-Accent4">
     <w:name w:val="Medium List 1 Accent 4"/>
-    <w:basedOn w:val="a3"/>
+    <w:basedOn w:val="TableNormal"/>
     <w:uiPriority w:val="65"/>
     <w:rsid w:val="00CB0664"/>
     <w:pPr>
@@ -8645,9 +8853,9 @@
       </w:tcPr>
     </w:tblStylePr>
   </w:style>
-  <w:style w:type="table" w:styleId="1-50">
+  <w:style w:type="table" w:styleId="MediumList1-Accent5">
     <w:name w:val="Medium List 1 Accent 5"/>
-    <w:basedOn w:val="a3"/>
+    <w:basedOn w:val="TableNormal"/>
     <w:uiPriority w:val="65"/>
     <w:rsid w:val="00CB0664"/>
     <w:pPr>
@@ -8722,9 +8930,9 @@
       </w:tcPr>
     </w:tblStylePr>
   </w:style>
-  <w:style w:type="table" w:styleId="1-60">
+  <w:style w:type="table" w:styleId="MediumList1-Accent6">
     <w:name w:val="Medium List 1 Accent 6"/>
-    <w:basedOn w:val="a3"/>
+    <w:basedOn w:val="TableNormal"/>
     <w:uiPriority w:val="65"/>
     <w:rsid w:val="00CB0664"/>
     <w:pPr>
@@ -8799,9 +9007,9 @@
       </w:tcPr>
     </w:tblStylePr>
   </w:style>
-  <w:style w:type="table" w:styleId="2a">
+  <w:style w:type="table" w:styleId="MediumList2">
     <w:name w:val="Medium List 2"/>
-    <w:basedOn w:val="a3"/>
+    <w:basedOn w:val="TableNormal"/>
     <w:uiPriority w:val="66"/>
     <w:rsid w:val="00CB0664"/>
     <w:pPr>
@@ -8920,9 +9128,9 @@
       </w:tcPr>
     </w:tblStylePr>
   </w:style>
-  <w:style w:type="table" w:styleId="2-10">
+  <w:style w:type="table" w:styleId="MediumList2-Accent1">
     <w:name w:val="Medium List 2 Accent 1"/>
-    <w:basedOn w:val="a3"/>
+    <w:basedOn w:val="TableNormal"/>
     <w:uiPriority w:val="66"/>
     <w:rsid w:val="00CB0664"/>
     <w:pPr>
@@ -9041,9 +9249,9 @@
       </w:tcPr>
     </w:tblStylePr>
   </w:style>
-  <w:style w:type="table" w:styleId="2-20">
+  <w:style w:type="table" w:styleId="MediumList2-Accent2">
     <w:name w:val="Medium List 2 Accent 2"/>
-    <w:basedOn w:val="a3"/>
+    <w:basedOn w:val="TableNormal"/>
     <w:uiPriority w:val="66"/>
     <w:rsid w:val="00CB0664"/>
     <w:pPr>
@@ -9162,9 +9370,9 @@
       </w:tcPr>
     </w:tblStylePr>
   </w:style>
-  <w:style w:type="table" w:styleId="2-30">
+  <w:style w:type="table" w:styleId="MediumList2-Accent3">
     <w:name w:val="Medium List 2 Accent 3"/>
-    <w:basedOn w:val="a3"/>
+    <w:basedOn w:val="TableNormal"/>
     <w:uiPriority w:val="66"/>
     <w:rsid w:val="00CB0664"/>
     <w:pPr>
@@ -9283,9 +9491,9 @@
       </w:tcPr>
     </w:tblStylePr>
   </w:style>
-  <w:style w:type="table" w:styleId="2-40">
+  <w:style w:type="table" w:styleId="MediumList2-Accent4">
     <w:name w:val="Medium List 2 Accent 4"/>
-    <w:basedOn w:val="a3"/>
+    <w:basedOn w:val="TableNormal"/>
     <w:uiPriority w:val="66"/>
     <w:rsid w:val="00CB0664"/>
     <w:pPr>
@@ -9404,9 +9612,9 @@
       </w:tcPr>
     </w:tblStylePr>
   </w:style>
-  <w:style w:type="table" w:styleId="2-50">
+  <w:style w:type="table" w:styleId="MediumList2-Accent5">
     <w:name w:val="Medium List 2 Accent 5"/>
-    <w:basedOn w:val="a3"/>
+    <w:basedOn w:val="TableNormal"/>
     <w:uiPriority w:val="66"/>
     <w:rsid w:val="00CB0664"/>
     <w:pPr>
@@ -9525,9 +9733,9 @@
       </w:tcPr>
     </w:tblStylePr>
   </w:style>
-  <w:style w:type="table" w:styleId="2-60">
+  <w:style w:type="table" w:styleId="MediumList2-Accent6">
     <w:name w:val="Medium List 2 Accent 6"/>
-    <w:basedOn w:val="a3"/>
+    <w:basedOn w:val="TableNormal"/>
     <w:uiPriority w:val="66"/>
     <w:rsid w:val="00CB0664"/>
     <w:pPr>
@@ -9646,9 +9854,9 @@
       </w:tcPr>
     </w:tblStylePr>
   </w:style>
-  <w:style w:type="table" w:styleId="13">
+  <w:style w:type="table" w:styleId="MediumGrid1">
     <w:name w:val="Medium Grid 1"/>
-    <w:basedOn w:val="a3"/>
+    <w:basedOn w:val="TableNormal"/>
     <w:uiPriority w:val="67"/>
     <w:rsid w:val="00CB0664"/>
     <w:pPr>
@@ -9712,9 +9920,9 @@
       </w:tcPr>
     </w:tblStylePr>
   </w:style>
-  <w:style w:type="table" w:styleId="1-11">
+  <w:style w:type="table" w:styleId="MediumGrid1-Accent1">
     <w:name w:val="Medium Grid 1 Accent 1"/>
-    <w:basedOn w:val="a3"/>
+    <w:basedOn w:val="TableNormal"/>
     <w:uiPriority w:val="67"/>
     <w:rsid w:val="00CB0664"/>
     <w:pPr>
@@ -9778,9 +9986,9 @@
       </w:tcPr>
     </w:tblStylePr>
   </w:style>
-  <w:style w:type="table" w:styleId="1-21">
+  <w:style w:type="table" w:styleId="MediumGrid1-Accent2">
     <w:name w:val="Medium Grid 1 Accent 2"/>
-    <w:basedOn w:val="a3"/>
+    <w:basedOn w:val="TableNormal"/>
     <w:uiPriority w:val="67"/>
     <w:rsid w:val="00CB0664"/>
     <w:pPr>
@@ -9844,9 +10052,9 @@
       </w:tcPr>
     </w:tblStylePr>
   </w:style>
-  <w:style w:type="table" w:styleId="1-31">
+  <w:style w:type="table" w:styleId="MediumGrid1-Accent3">
     <w:name w:val="Medium Grid 1 Accent 3"/>
-    <w:basedOn w:val="a3"/>
+    <w:basedOn w:val="TableNormal"/>
     <w:uiPriority w:val="67"/>
     <w:rsid w:val="00CB0664"/>
     <w:pPr>
@@ -9910,9 +10118,9 @@
       </w:tcPr>
     </w:tblStylePr>
   </w:style>
-  <w:style w:type="table" w:styleId="1-41">
+  <w:style w:type="table" w:styleId="MediumGrid1-Accent4">
     <w:name w:val="Medium Grid 1 Accent 4"/>
-    <w:basedOn w:val="a3"/>
+    <w:basedOn w:val="TableNormal"/>
     <w:uiPriority w:val="67"/>
     <w:rsid w:val="00CB0664"/>
     <w:pPr>
@@ -9976,9 +10184,9 @@
       </w:tcPr>
     </w:tblStylePr>
   </w:style>
-  <w:style w:type="table" w:styleId="1-51">
+  <w:style w:type="table" w:styleId="MediumGrid1-Accent5">
     <w:name w:val="Medium Grid 1 Accent 5"/>
-    <w:basedOn w:val="a3"/>
+    <w:basedOn w:val="TableNormal"/>
     <w:uiPriority w:val="67"/>
     <w:rsid w:val="00CB0664"/>
     <w:pPr>
@@ -10042,9 +10250,9 @@
       </w:tcPr>
     </w:tblStylePr>
   </w:style>
-  <w:style w:type="table" w:styleId="1-61">
+  <w:style w:type="table" w:styleId="MediumGrid1-Accent6">
     <w:name w:val="Medium Grid 1 Accent 6"/>
-    <w:basedOn w:val="a3"/>
+    <w:basedOn w:val="TableNormal"/>
     <w:uiPriority w:val="67"/>
     <w:rsid w:val="00CB0664"/>
     <w:pPr>
@@ -10108,9 +10316,9 @@
       </w:tcPr>
     </w:tblStylePr>
   </w:style>
-  <w:style w:type="table" w:styleId="2b">
+  <w:style w:type="table" w:styleId="MediumGrid2">
     <w:name w:val="Medium Grid 2"/>
-    <w:basedOn w:val="a3"/>
+    <w:basedOn w:val="TableNormal"/>
     <w:uiPriority w:val="68"/>
     <w:rsid w:val="00CB0664"/>
     <w:pPr>
@@ -10226,9 +10434,9 @@
       </w:tcPr>
     </w:tblStylePr>
   </w:style>
-  <w:style w:type="table" w:styleId="2-11">
+  <w:style w:type="table" w:styleId="MediumGrid2-Accent1">
     <w:name w:val="Medium Grid 2 Accent 1"/>
-    <w:basedOn w:val="a3"/>
+    <w:basedOn w:val="TableNormal"/>
     <w:uiPriority w:val="68"/>
     <w:rsid w:val="00CB0664"/>
     <w:pPr>
@@ -10344,9 +10552,9 @@
       </w:tcPr>
     </w:tblStylePr>
   </w:style>
-  <w:style w:type="table" w:styleId="2-21">
+  <w:style w:type="table" w:styleId="MediumGrid2-Accent2">
     <w:name w:val="Medium Grid 2 Accent 2"/>
-    <w:basedOn w:val="a3"/>
+    <w:basedOn w:val="TableNormal"/>
     <w:uiPriority w:val="68"/>
     <w:rsid w:val="00CB0664"/>
     <w:pPr>
@@ -10462,9 +10670,9 @@
       </w:tcPr>
     </w:tblStylePr>
   </w:style>
-  <w:style w:type="table" w:styleId="2-31">
+  <w:style w:type="table" w:styleId="MediumGrid2-Accent3">
     <w:name w:val="Medium Grid 2 Accent 3"/>
-    <w:basedOn w:val="a3"/>
+    <w:basedOn w:val="TableNormal"/>
     <w:uiPriority w:val="68"/>
     <w:rsid w:val="00CB0664"/>
     <w:pPr>
@@ -10580,9 +10788,9 @@
       </w:tcPr>
     </w:tblStylePr>
   </w:style>
-  <w:style w:type="table" w:styleId="2-41">
+  <w:style w:type="table" w:styleId="MediumGrid2-Accent4">
     <w:name w:val="Medium Grid 2 Accent 4"/>
-    <w:basedOn w:val="a3"/>
+    <w:basedOn w:val="TableNormal"/>
     <w:uiPriority w:val="68"/>
     <w:rsid w:val="00CB0664"/>
     <w:pPr>
@@ -10698,9 +10906,9 @@
       </w:tcPr>
     </w:tblStylePr>
   </w:style>
-  <w:style w:type="table" w:styleId="2-51">
+  <w:style w:type="table" w:styleId="MediumGrid2-Accent5">
     <w:name w:val="Medium Grid 2 Accent 5"/>
-    <w:basedOn w:val="a3"/>
+    <w:basedOn w:val="TableNormal"/>
     <w:uiPriority w:val="68"/>
     <w:rsid w:val="00CB0664"/>
     <w:pPr>
@@ -10816,9 +11024,9 @@
       </w:tcPr>
     </w:tblStylePr>
   </w:style>
-  <w:style w:type="table" w:styleId="2-61">
+  <w:style w:type="table" w:styleId="MediumGrid2-Accent6">
     <w:name w:val="Medium Grid 2 Accent 6"/>
-    <w:basedOn w:val="a3"/>
+    <w:basedOn w:val="TableNormal"/>
     <w:uiPriority w:val="68"/>
     <w:rsid w:val="00CB0664"/>
     <w:pPr>
@@ -10934,9 +11142,9 @@
       </w:tcPr>
     </w:tblStylePr>
   </w:style>
-  <w:style w:type="table" w:styleId="37">
+  <w:style w:type="table" w:styleId="MediumGrid3">
     <w:name w:val="Medium Grid 3"/>
-    <w:basedOn w:val="a3"/>
+    <w:basedOn w:val="TableNormal"/>
     <w:uiPriority w:val="69"/>
     <w:rsid w:val="00CB0664"/>
     <w:pPr>
@@ -11068,9 +11276,9 @@
       </w:tcPr>
     </w:tblStylePr>
   </w:style>
-  <w:style w:type="table" w:styleId="3-1">
+  <w:style w:type="table" w:styleId="MediumGrid3-Accent1">
     <w:name w:val="Medium Grid 3 Accent 1"/>
-    <w:basedOn w:val="a3"/>
+    <w:basedOn w:val="TableNormal"/>
     <w:uiPriority w:val="69"/>
     <w:rsid w:val="00CB0664"/>
     <w:pPr>
@@ -11202,9 +11410,9 @@
       </w:tcPr>
     </w:tblStylePr>
   </w:style>
-  <w:style w:type="table" w:styleId="3-2">
+  <w:style w:type="table" w:styleId="MediumGrid3-Accent2">
     <w:name w:val="Medium Grid 3 Accent 2"/>
-    <w:basedOn w:val="a3"/>
+    <w:basedOn w:val="TableNormal"/>
     <w:uiPriority w:val="69"/>
     <w:rsid w:val="00CB0664"/>
     <w:pPr>
@@ -11336,9 +11544,9 @@
       </w:tcPr>
     </w:tblStylePr>
   </w:style>
-  <w:style w:type="table" w:styleId="3-3">
+  <w:style w:type="table" w:styleId="MediumGrid3-Accent3">
     <w:name w:val="Medium Grid 3 Accent 3"/>
-    <w:basedOn w:val="a3"/>
+    <w:basedOn w:val="TableNormal"/>
     <w:uiPriority w:val="69"/>
     <w:rsid w:val="00CB0664"/>
     <w:pPr>
@@ -11470,9 +11678,9 @@
       </w:tcPr>
     </w:tblStylePr>
   </w:style>
-  <w:style w:type="table" w:styleId="3-4">
+  <w:style w:type="table" w:styleId="MediumGrid3-Accent4">
     <w:name w:val="Medium Grid 3 Accent 4"/>
-    <w:basedOn w:val="a3"/>
+    <w:basedOn w:val="TableNormal"/>
     <w:uiPriority w:val="69"/>
     <w:rsid w:val="00CB0664"/>
     <w:pPr>
@@ -11604,9 +11812,9 @@
       </w:tcPr>
     </w:tblStylePr>
   </w:style>
-  <w:style w:type="table" w:styleId="3-5">
+  <w:style w:type="table" w:styleId="MediumGrid3-Accent5">
     <w:name w:val="Medium Grid 3 Accent 5"/>
-    <w:basedOn w:val="a3"/>
+    <w:basedOn w:val="TableNormal"/>
     <w:uiPriority w:val="69"/>
     <w:rsid w:val="00CB0664"/>
     <w:pPr>
@@ -11738,9 +11946,9 @@
       </w:tcPr>
     </w:tblStylePr>
   </w:style>
-  <w:style w:type="table" w:styleId="3-6">
+  <w:style w:type="table" w:styleId="MediumGrid3-Accent6">
     <w:name w:val="Medium Grid 3 Accent 6"/>
-    <w:basedOn w:val="a3"/>
+    <w:basedOn w:val="TableNormal"/>
     <w:uiPriority w:val="69"/>
     <w:rsid w:val="00CB0664"/>
     <w:pPr>
@@ -11872,9 +12080,9 @@
       </w:tcPr>
     </w:tblStylePr>
   </w:style>
-  <w:style w:type="table" w:styleId="aff4">
+  <w:style w:type="table" w:styleId="DarkList">
     <w:name w:val="Dark List"/>
-    <w:basedOn w:val="a3"/>
+    <w:basedOn w:val="TableNormal"/>
     <w:uiPriority w:val="70"/>
     <w:rsid w:val="00CB0664"/>
     <w:pPr>
@@ -11979,9 +12187,9 @@
       </w:tcPr>
     </w:tblStylePr>
   </w:style>
-  <w:style w:type="table" w:styleId="-12">
+  <w:style w:type="table" w:styleId="DarkList-Accent1">
     <w:name w:val="Dark List Accent 1"/>
-    <w:basedOn w:val="a3"/>
+    <w:basedOn w:val="TableNormal"/>
     <w:uiPriority w:val="70"/>
     <w:rsid w:val="00CB0664"/>
     <w:pPr>
@@ -12086,9 +12294,9 @@
       </w:tcPr>
     </w:tblStylePr>
   </w:style>
-  <w:style w:type="table" w:styleId="-22">
+  <w:style w:type="table" w:styleId="DarkList-Accent2">
     <w:name w:val="Dark List Accent 2"/>
-    <w:basedOn w:val="a3"/>
+    <w:basedOn w:val="TableNormal"/>
     <w:uiPriority w:val="70"/>
     <w:rsid w:val="00CB0664"/>
     <w:pPr>
@@ -12193,9 +12401,9 @@
       </w:tcPr>
     </w:tblStylePr>
   </w:style>
-  <w:style w:type="table" w:styleId="-32">
+  <w:style w:type="table" w:styleId="DarkList-Accent3">
     <w:name w:val="Dark List Accent 3"/>
-    <w:basedOn w:val="a3"/>
+    <w:basedOn w:val="TableNormal"/>
     <w:uiPriority w:val="70"/>
     <w:rsid w:val="00CB0664"/>
     <w:pPr>
@@ -12300,9 +12508,9 @@
       </w:tcPr>
     </w:tblStylePr>
   </w:style>
-  <w:style w:type="table" w:styleId="-42">
+  <w:style w:type="table" w:styleId="DarkList-Accent4">
     <w:name w:val="Dark List Accent 4"/>
-    <w:basedOn w:val="a3"/>
+    <w:basedOn w:val="TableNormal"/>
     <w:uiPriority w:val="70"/>
     <w:rsid w:val="00CB0664"/>
     <w:pPr>
@@ -12407,9 +12615,9 @@
       </w:tcPr>
     </w:tblStylePr>
   </w:style>
-  <w:style w:type="table" w:styleId="-52">
+  <w:style w:type="table" w:styleId="DarkList-Accent5">
     <w:name w:val="Dark List Accent 5"/>
-    <w:basedOn w:val="a3"/>
+    <w:basedOn w:val="TableNormal"/>
     <w:uiPriority w:val="70"/>
     <w:rsid w:val="00CB0664"/>
     <w:pPr>
@@ -12514,9 +12722,9 @@
       </w:tcPr>
     </w:tblStylePr>
   </w:style>
-  <w:style w:type="table" w:styleId="-62">
+  <w:style w:type="table" w:styleId="DarkList-Accent6">
     <w:name w:val="Dark List Accent 6"/>
-    <w:basedOn w:val="a3"/>
+    <w:basedOn w:val="TableNormal"/>
     <w:uiPriority w:val="70"/>
     <w:rsid w:val="00CB0664"/>
     <w:pPr>
@@ -12621,9 +12829,9 @@
       </w:tcPr>
     </w:tblStylePr>
   </w:style>
-  <w:style w:type="table" w:styleId="aff5">
+  <w:style w:type="table" w:styleId="ColorfulShading">
     <w:name w:val="Colorful Shading"/>
-    <w:basedOn w:val="a3"/>
+    <w:basedOn w:val="TableNormal"/>
     <w:uiPriority w:val="71"/>
     <w:rsid w:val="00CB0664"/>
     <w:pPr>
@@ -12736,9 +12944,9 @@
       </w:rPr>
     </w:tblStylePr>
   </w:style>
-  <w:style w:type="table" w:styleId="-13">
+  <w:style w:type="table" w:styleId="ColorfulShading-Accent1">
     <w:name w:val="Colorful Shading Accent 1"/>
-    <w:basedOn w:val="a3"/>
+    <w:basedOn w:val="TableNormal"/>
     <w:uiPriority w:val="71"/>
     <w:rsid w:val="00CB0664"/>
     <w:pPr>
@@ -12851,9 +13059,9 @@
       </w:rPr>
     </w:tblStylePr>
   </w:style>
-  <w:style w:type="table" w:styleId="-23">
+  <w:style w:type="table" w:styleId="ColorfulShading-Accent2">
     <w:name w:val="Colorful Shading Accent 2"/>
-    <w:basedOn w:val="a3"/>
+    <w:basedOn w:val="TableNormal"/>
     <w:uiPriority w:val="71"/>
     <w:rsid w:val="00CB0664"/>
     <w:pPr>
@@ -12966,9 +13174,9 @@
       </w:rPr>
     </w:tblStylePr>
   </w:style>
-  <w:style w:type="table" w:styleId="-33">
+  <w:style w:type="table" w:styleId="ColorfulShading-Accent3">
     <w:name w:val="Colorful Shading Accent 3"/>
-    <w:basedOn w:val="a3"/>
+    <w:basedOn w:val="TableNormal"/>
     <w:uiPriority w:val="71"/>
     <w:rsid w:val="00CB0664"/>
     <w:pPr>
@@ -13071,9 +13279,9 @@
       </w:tcPr>
     </w:tblStylePr>
   </w:style>
-  <w:style w:type="table" w:styleId="-43">
+  <w:style w:type="table" w:styleId="ColorfulShading-Accent4">
     <w:name w:val="Colorful Shading Accent 4"/>
-    <w:basedOn w:val="a3"/>
+    <w:basedOn w:val="TableNormal"/>
     <w:uiPriority w:val="71"/>
     <w:rsid w:val="00CB0664"/>
     <w:pPr>
@@ -13186,9 +13394,9 @@
       </w:rPr>
     </w:tblStylePr>
   </w:style>
-  <w:style w:type="table" w:styleId="-53">
+  <w:style w:type="table" w:styleId="ColorfulShading-Accent5">
     <w:name w:val="Colorful Shading Accent 5"/>
-    <w:basedOn w:val="a3"/>
+    <w:basedOn w:val="TableNormal"/>
     <w:uiPriority w:val="71"/>
     <w:rsid w:val="00CB0664"/>
     <w:pPr>
@@ -13301,9 +13509,9 @@
       </w:rPr>
     </w:tblStylePr>
   </w:style>
-  <w:style w:type="table" w:styleId="-63">
+  <w:style w:type="table" w:styleId="ColorfulShading-Accent6">
     <w:name w:val="Colorful Shading Accent 6"/>
-    <w:basedOn w:val="a3"/>
+    <w:basedOn w:val="TableNormal"/>
     <w:uiPriority w:val="71"/>
     <w:rsid w:val="00CB0664"/>
     <w:pPr>
@@ -13416,9 +13624,9 @@
       </w:rPr>
     </w:tblStylePr>
   </w:style>
-  <w:style w:type="table" w:styleId="aff6">
+  <w:style w:type="table" w:styleId="ColorfulList">
     <w:name w:val="Colorful List"/>
-    <w:basedOn w:val="a3"/>
+    <w:basedOn w:val="TableNormal"/>
     <w:uiPriority w:val="72"/>
     <w:rsid w:val="00CB0664"/>
     <w:pPr>
@@ -13495,9 +13703,9 @@
       </w:tcPr>
     </w:tblStylePr>
   </w:style>
-  <w:style w:type="table" w:styleId="-14">
+  <w:style w:type="table" w:styleId="ColorfulList-Accent1">
     <w:name w:val="Colorful List Accent 1"/>
-    <w:basedOn w:val="a3"/>
+    <w:basedOn w:val="TableNormal"/>
     <w:uiPriority w:val="72"/>
     <w:rsid w:val="00CB0664"/>
     <w:pPr>
@@ -13574,9 +13782,9 @@
       </w:tcPr>
     </w:tblStylePr>
   </w:style>
-  <w:style w:type="table" w:styleId="-24">
+  <w:style w:type="table" w:styleId="ColorfulList-Accent2">
     <w:name w:val="Colorful List Accent 2"/>
-    <w:basedOn w:val="a3"/>
+    <w:basedOn w:val="TableNormal"/>
     <w:uiPriority w:val="72"/>
     <w:rsid w:val="00CB0664"/>
     <w:pPr>
@@ -13653,9 +13861,9 @@
       </w:tcPr>
     </w:tblStylePr>
   </w:style>
-  <w:style w:type="table" w:styleId="-34">
+  <w:style w:type="table" w:styleId="ColorfulList-Accent3">
     <w:name w:val="Colorful List Accent 3"/>
-    <w:basedOn w:val="a3"/>
+    <w:basedOn w:val="TableNormal"/>
     <w:uiPriority w:val="72"/>
     <w:rsid w:val="00CB0664"/>
     <w:pPr>
@@ -13732,9 +13940,9 @@
       </w:tcPr>
     </w:tblStylePr>
   </w:style>
-  <w:style w:type="table" w:styleId="-44">
+  <w:style w:type="table" w:styleId="ColorfulList-Accent4">
     <w:name w:val="Colorful List Accent 4"/>
-    <w:basedOn w:val="a3"/>
+    <w:basedOn w:val="TableNormal"/>
     <w:uiPriority w:val="72"/>
     <w:rsid w:val="00CB0664"/>
     <w:pPr>
@@ -13811,9 +14019,9 @@
       </w:tcPr>
     </w:tblStylePr>
   </w:style>
-  <w:style w:type="table" w:styleId="-54">
+  <w:style w:type="table" w:styleId="ColorfulList-Accent5">
     <w:name w:val="Colorful List Accent 5"/>
-    <w:basedOn w:val="a3"/>
+    <w:basedOn w:val="TableNormal"/>
     <w:uiPriority w:val="72"/>
     <w:rsid w:val="00CB0664"/>
     <w:pPr>
@@ -13890,9 +14098,9 @@
       </w:tcPr>
     </w:tblStylePr>
   </w:style>
-  <w:style w:type="table" w:styleId="-64">
+  <w:style w:type="table" w:styleId="ColorfulList-Accent6">
     <w:name w:val="Colorful List Accent 6"/>
-    <w:basedOn w:val="a3"/>
+    <w:basedOn w:val="TableNormal"/>
     <w:uiPriority w:val="72"/>
     <w:rsid w:val="00CB0664"/>
     <w:pPr>
@@ -13969,9 +14177,9 @@
       </w:tcPr>
     </w:tblStylePr>
   </w:style>
-  <w:style w:type="table" w:styleId="aff7">
+  <w:style w:type="table" w:styleId="ColorfulGrid">
     <w:name w:val="Colorful Grid"/>
-    <w:basedOn w:val="a3"/>
+    <w:basedOn w:val="TableNormal"/>
     <w:uiPriority w:val="73"/>
     <w:rsid w:val="00CB0664"/>
     <w:pPr>
@@ -14042,9 +14250,9 @@
       </w:tcPr>
     </w:tblStylePr>
   </w:style>
-  <w:style w:type="table" w:styleId="-15">
+  <w:style w:type="table" w:styleId="ColorfulGrid-Accent1">
     <w:name w:val="Colorful Grid Accent 1"/>
-    <w:basedOn w:val="a3"/>
+    <w:basedOn w:val="TableNormal"/>
     <w:uiPriority w:val="73"/>
     <w:rsid w:val="00CB0664"/>
     <w:pPr>
@@ -14115,9 +14323,9 @@
       </w:tcPr>
     </w:tblStylePr>
   </w:style>
-  <w:style w:type="table" w:styleId="-25">
+  <w:style w:type="table" w:styleId="ColorfulGrid-Accent2">
     <w:name w:val="Colorful Grid Accent 2"/>
-    <w:basedOn w:val="a3"/>
+    <w:basedOn w:val="TableNormal"/>
     <w:uiPriority w:val="73"/>
     <w:rsid w:val="00CB0664"/>
     <w:pPr>
@@ -14188,9 +14396,9 @@
       </w:tcPr>
     </w:tblStylePr>
   </w:style>
-  <w:style w:type="table" w:styleId="-35">
+  <w:style w:type="table" w:styleId="ColorfulGrid-Accent3">
     <w:name w:val="Colorful Grid Accent 3"/>
-    <w:basedOn w:val="a3"/>
+    <w:basedOn w:val="TableNormal"/>
     <w:uiPriority w:val="73"/>
     <w:rsid w:val="00CB0664"/>
     <w:pPr>
@@ -14261,9 +14469,9 @@
       </w:tcPr>
     </w:tblStylePr>
   </w:style>
-  <w:style w:type="table" w:styleId="-45">
+  <w:style w:type="table" w:styleId="ColorfulGrid-Accent4">
     <w:name w:val="Colorful Grid Accent 4"/>
-    <w:basedOn w:val="a3"/>
+    <w:basedOn w:val="TableNormal"/>
     <w:uiPriority w:val="73"/>
     <w:rsid w:val="00CB0664"/>
     <w:pPr>
@@ -14334,9 +14542,9 @@
       </w:tcPr>
     </w:tblStylePr>
   </w:style>
-  <w:style w:type="table" w:styleId="-55">
+  <w:style w:type="table" w:styleId="ColorfulGrid-Accent5">
     <w:name w:val="Colorful Grid Accent 5"/>
-    <w:basedOn w:val="a3"/>
+    <w:basedOn w:val="TableNormal"/>
     <w:uiPriority w:val="73"/>
     <w:rsid w:val="00CB0664"/>
     <w:pPr>
@@ -14407,9 +14615,9 @@
       </w:tcPr>
     </w:tblStylePr>
   </w:style>
-  <w:style w:type="table" w:styleId="-65">
+  <w:style w:type="table" w:styleId="ColorfulGrid-Accent6">
     <w:name w:val="Colorful Grid Accent 6"/>
-    <w:basedOn w:val="a3"/>
+    <w:basedOn w:val="TableNormal"/>
     <w:uiPriority w:val="73"/>
     <w:rsid w:val="00CB0664"/>
     <w:pPr>

</xml_diff>

<commit_message>
feat: lab2 add vector grafic and clusters tsne
</commit_message>
<xml_diff>
--- a/labs/Lab02_Word2Vec_FastText_resumes.docx
+++ b/labs/Lab02_Word2Vec_FastText_resumes.docx
@@ -1,6 +1,6 @@
 
 <file path=word/document.xml><?xml version="1.0" encoding="utf-8"?>
-<w:document xmlns:wpc="http://schemas.microsoft.com/office/word/2010/wordprocessingCanvas" xmlns:cx="http://schemas.microsoft.com/office/drawing/2014/chartex" xmlns:cx1="http://schemas.microsoft.com/office/drawing/2015/9/8/chartex" xmlns:cx2="http://schemas.microsoft.com/office/drawing/2015/10/21/chartex" xmlns:cx3="http://schemas.microsoft.com/office/drawing/2016/5/9/chartex" xmlns:cx4="http://schemas.microsoft.com/office/drawing/2016/5/10/chartex" xmlns:cx5="http://schemas.microsoft.com/office/drawing/2016/5/11/chartex" xmlns:cx6="http://schemas.microsoft.com/office/drawing/2016/5/12/chartex" xmlns:cx7="http://schemas.microsoft.com/office/drawing/2016/5/13/chartex" xmlns:cx8="http://schemas.microsoft.com/office/drawing/2016/5/14/chartex" xmlns:mc="http://schemas.openxmlformats.org/markup-compatibility/2006" xmlns:aink="http://schemas.microsoft.com/office/drawing/2016/ink" xmlns:am3d="http://schemas.microsoft.com/office/drawing/2017/model3d" xmlns:o="urn:schemas-microsoft-com:office:office" xmlns:oel="http://schemas.microsoft.com/office/2019/extlst" xmlns:r="http://schemas.openxmlformats.org/officeDocument/2006/relationships" xmlns:m="http://schemas.openxmlformats.org/officeDocument/2006/math" xmlns:v="urn:schemas-microsoft-com:vml" xmlns:wp14="http://schemas.microsoft.com/office/word/2010/wordprocessingDrawing" xmlns:wp="http://schemas.openxmlformats.org/drawingml/2006/wordprocessingDrawing" xmlns:w10="urn:schemas-microsoft-com:office:word" xmlns:w="http://schemas.openxmlformats.org/wordprocessingml/2006/main" xmlns:w14="http://schemas.microsoft.com/office/word/2010/wordml" xmlns:w15="http://schemas.microsoft.com/office/word/2012/wordml" xmlns:w16cex="http://schemas.microsoft.com/office/word/2018/wordml/cex" xmlns:w16cid="http://schemas.microsoft.com/office/word/2016/wordml/cid" xmlns:w16="http://schemas.microsoft.com/office/word/2018/wordml" xmlns:w16du="http://schemas.microsoft.com/office/word/2023/wordml/word16du" xmlns:w16sdtdh="http://schemas.microsoft.com/office/word/2020/wordml/sdtdatahash" xmlns:w16sdtfl="http://schemas.microsoft.com/office/word/2024/wordml/sdtformatlock" xmlns:w16se="http://schemas.microsoft.com/office/word/2015/wordml/symex" xmlns:wpg="http://schemas.microsoft.com/office/word/2010/wordprocessingGroup" xmlns:wpi="http://schemas.microsoft.com/office/word/2010/wordprocessingInk" xmlns:wne="http://schemas.microsoft.com/office/word/2006/wordml" xmlns:wps="http://schemas.microsoft.com/office/word/2010/wordprocessingShape" mc:Ignorable="w14 w15 w16se w16cid w16 w16cex w16sdtdh w16sdtfl w16du wp14">
+<w:document xmlns:wpc="http://schemas.microsoft.com/office/word/2010/wordprocessingCanvas" xmlns:cx="http://schemas.microsoft.com/office/drawing/2014/chartex" xmlns:cx1="http://schemas.microsoft.com/office/drawing/2015/9/8/chartex" xmlns:cx2="http://schemas.microsoft.com/office/drawing/2015/10/21/chartex" xmlns:cx3="http://schemas.microsoft.com/office/drawing/2016/5/9/chartex" xmlns:cx4="http://schemas.microsoft.com/office/drawing/2016/5/10/chartex" xmlns:cx5="http://schemas.microsoft.com/office/drawing/2016/5/11/chartex" xmlns:cx6="http://schemas.microsoft.com/office/drawing/2016/5/12/chartex" xmlns:cx7="http://schemas.microsoft.com/office/drawing/2016/5/13/chartex" xmlns:cx8="http://schemas.microsoft.com/office/drawing/2016/5/14/chartex" xmlns:mc="http://schemas.openxmlformats.org/markup-compatibility/2006" xmlns:aink="http://schemas.microsoft.com/office/drawing/2016/ink" xmlns:am3d="http://schemas.microsoft.com/office/drawing/2017/model3d" xmlns:o="urn:schemas-microsoft-com:office:office" xmlns:oel="http://schemas.microsoft.com/office/2019/extlst" xmlns:r="http://schemas.openxmlformats.org/officeDocument/2006/relationships" xmlns:m="http://schemas.openxmlformats.org/officeDocument/2006/math" xmlns:v="urn:schemas-microsoft-com:vml" xmlns:wp14="http://schemas.microsoft.com/office/word/2010/wordprocessingDrawing" xmlns:wp="http://schemas.openxmlformats.org/drawingml/2006/wordprocessingDrawing" xmlns:w10="urn:schemas-microsoft-com:office:word" xmlns:w="http://schemas.openxmlformats.org/wordprocessingml/2006/main" xmlns:w14="http://schemas.microsoft.com/office/word/2010/wordml" xmlns:w15="http://schemas.microsoft.com/office/word/2012/wordml" xmlns:w16cex="http://schemas.microsoft.com/office/word/2018/wordml/cex" xmlns:w16cid="http://schemas.microsoft.com/office/word/2016/wordml/cid" xmlns:w16="http://schemas.microsoft.com/office/word/2018/wordml" xmlns:w16sdtdh="http://schemas.microsoft.com/office/word/2020/wordml/sdtdatahash" xmlns:w16se="http://schemas.microsoft.com/office/word/2015/wordml/symex" xmlns:wpg="http://schemas.microsoft.com/office/word/2010/wordprocessingGroup" xmlns:wpi="http://schemas.microsoft.com/office/word/2010/wordprocessingInk" xmlns:wne="http://schemas.microsoft.com/office/word/2006/wordml" xmlns:wps="http://schemas.microsoft.com/office/word/2010/wordprocessingShape" mc:Ignorable="w14 w15 w16se w16cid w16 w16cex w16sdtdh wp14">
   <w:body>
     <w:p>
       <w:pPr>
@@ -52,7 +52,7 @@
     </w:p>
     <w:p>
       <w:pPr>
-        <w:pStyle w:val="Heading1"/>
+        <w:pStyle w:val="1"/>
         <w:rPr>
           <w:lang w:val="ru-RU"/>
         </w:rPr>
@@ -69,52 +69,49 @@
         <w:t>ML</w:t>
       </w:r>
       <w:r>
-        <w:rPr>
-          <w:lang w:val="ru-RU"/>
-        </w:rPr>
         <w:t>-</w:t>
       </w:r>
       <w:r>
         <w:t>HW</w:t>
       </w:r>
       <w:r>
-        <w:rPr>
-          <w:lang w:val="ru-RU"/>
-        </w:rPr>
         <w:t>05-</w:t>
       </w:r>
       <w:r>
         <w:t>v</w:t>
       </w:r>
       <w:r>
-        <w:rPr>
-          <w:lang w:val="ru-RU"/>
-        </w:rPr>
         <w:t xml:space="preserve">1 </w:t>
       </w:r>
       <w:r>
         <w:t>TEAM</w:t>
       </w:r>
       <w:r>
-        <w:rPr>
-          <w:lang w:val="ru-RU"/>
-        </w:rPr>
-        <w:t>-11</w:t>
-      </w:r>
-      <w:r>
-        <w:rPr>
-          <w:lang w:val="ru-RU"/>
-        </w:rPr>
-        <w:t xml:space="preserve">. Эмбеддинги: </w:t>
+        <w:t xml:space="preserve">-11. </w:t>
+      </w:r>
+      <w:r>
+        <w:rPr>
+          <w:lang w:val="ru-RU"/>
+        </w:rPr>
+        <w:t>Эмбеддинги</w:t>
+      </w:r>
+      <w:r>
+        <w:t xml:space="preserve">: </w:t>
       </w:r>
       <w:r>
         <w:t>Word2Vec</w:t>
       </w:r>
       <w:r>
-        <w:rPr>
-          <w:lang w:val="ru-RU"/>
-        </w:rPr>
-        <w:t xml:space="preserve"> и </w:t>
+        <w:t xml:space="preserve"> </w:t>
+      </w:r>
+      <w:r>
+        <w:rPr>
+          <w:lang w:val="ru-RU"/>
+        </w:rPr>
+        <w:t>и</w:t>
+      </w:r>
+      <w:r>
+        <w:t xml:space="preserve"> </w:t>
       </w:r>
       <w:r>
         <w:t>fastText.</w:t>
@@ -122,7 +119,7 @@
     </w:p>
     <w:p>
       <w:pPr>
-        <w:pStyle w:val="ListParagraph"/>
+        <w:pStyle w:val="ae"/>
         <w:numPr>
           <w:ilvl w:val="0"/>
           <w:numId w:val="11"/>
@@ -140,7 +137,7 @@
     </w:p>
     <w:p>
       <w:pPr>
-        <w:pStyle w:val="ListParagraph"/>
+        <w:pStyle w:val="ae"/>
         <w:numPr>
           <w:ilvl w:val="0"/>
           <w:numId w:val="11"/>
@@ -158,7 +155,7 @@
     </w:p>
     <w:p>
       <w:pPr>
-        <w:pStyle w:val="ListParagraph"/>
+        <w:pStyle w:val="ae"/>
         <w:numPr>
           <w:ilvl w:val="0"/>
           <w:numId w:val="11"/>
@@ -176,7 +173,7 @@
     </w:p>
     <w:p>
       <w:pPr>
-        <w:pStyle w:val="Heading1"/>
+        <w:pStyle w:val="1"/>
         <w:rPr>
           <w:lang w:val="ru-RU"/>
         </w:rPr>
@@ -275,7 +272,7 @@
     </w:p>
     <w:p>
       <w:pPr>
-        <w:pStyle w:val="Heading1"/>
+        <w:pStyle w:val="1"/>
         <w:rPr>
           <w:lang w:val="ru-RU"/>
         </w:rPr>
@@ -289,7 +286,7 @@
     </w:p>
     <w:p>
       <w:pPr>
-        <w:pStyle w:val="Heading2"/>
+        <w:pStyle w:val="21"/>
         <w:rPr>
           <w:lang w:val="ru-RU"/>
         </w:rPr>
@@ -364,7 +361,7 @@
     </w:p>
     <w:p>
       <w:pPr>
-        <w:pStyle w:val="Heading2"/>
+        <w:pStyle w:val="21"/>
       </w:pPr>
       <w:r>
         <w:t>Q2. Различия CBOW vs Skip-gram; negative sampling vs hierarchical softmax.</w:t>
@@ -478,7 +475,7 @@
     </w:p>
     <w:p>
       <w:pPr>
-        <w:pStyle w:val="Heading2"/>
+        <w:pStyle w:val="21"/>
         <w:rPr>
           <w:lang w:val="ru-RU"/>
         </w:rPr>
@@ -565,7 +562,7 @@
     </w:p>
     <w:p>
       <w:pPr>
-        <w:pStyle w:val="Heading1"/>
+        <w:pStyle w:val="1"/>
         <w:rPr>
           <w:lang w:val="ru-RU"/>
         </w:rPr>
@@ -668,7 +665,7 @@
     </w:p>
     <w:tbl>
       <w:tblPr>
-        <w:tblStyle w:val="TableGrid"/>
+        <w:tblStyle w:val="aff0"/>
         <w:tblW w:w="0" w:type="auto"/>
         <w:jc w:val="center"/>
         <w:tblLook w:val="04A0" w:firstRow="1" w:lastRow="0" w:firstColumn="1" w:lastColumn="0" w:noHBand="0" w:noVBand="1"/>
@@ -1200,7 +1197,7 @@
     </w:p>
     <w:p>
       <w:pPr>
-        <w:pStyle w:val="Heading1"/>
+        <w:pStyle w:val="1"/>
       </w:pPr>
       <w:r>
         <w:t>4. Подбор fastText и сравнение bucket</w:t>
@@ -1208,7 +1205,7 @@
     </w:p>
     <w:tbl>
       <w:tblPr>
-        <w:tblStyle w:val="TableGrid"/>
+        <w:tblStyle w:val="aff0"/>
         <w:tblW w:w="0" w:type="auto"/>
         <w:tblLook w:val="04A0" w:firstRow="1" w:lastRow="0" w:firstColumn="1" w:lastColumn="0" w:noHBand="0" w:noVBand="1"/>
       </w:tblPr>
@@ -1524,7 +1521,7 @@
     </w:p>
     <w:p>
       <w:pPr>
-        <w:pStyle w:val="Heading1"/>
+        <w:pStyle w:val="1"/>
       </w:pPr>
       <w:r>
         <w:t>5. Прямое сравнение Word2Vec и fastText</w:t>
@@ -1532,7 +1529,7 @@
     </w:p>
     <w:tbl>
       <w:tblPr>
-        <w:tblStyle w:val="TableGrid"/>
+        <w:tblStyle w:val="aff0"/>
         <w:tblW w:w="0" w:type="auto"/>
         <w:tblLook w:val="04A0" w:firstRow="1" w:lastRow="0" w:firstColumn="1" w:lastColumn="0" w:noHBand="0" w:noVBand="1"/>
       </w:tblPr>
@@ -1928,7 +1925,7 @@
     </w:p>
     <w:p>
       <w:pPr>
-        <w:pStyle w:val="Heading1"/>
+        <w:pStyle w:val="1"/>
         <w:rPr>
           <w:lang w:val="ru-RU"/>
         </w:rPr>
@@ -1951,7 +1948,7 @@
     </w:p>
     <w:tbl>
       <w:tblPr>
-        <w:tblStyle w:val="TableGrid"/>
+        <w:tblStyle w:val="aff0"/>
         <w:tblW w:w="0" w:type="auto"/>
         <w:tblLook w:val="04A0" w:firstRow="1" w:lastRow="0" w:firstColumn="1" w:lastColumn="0" w:noHBand="0" w:noVBand="1"/>
       </w:tblPr>
@@ -2286,7 +2283,7 @@
     </w:p>
     <w:p>
       <w:pPr>
-        <w:pStyle w:val="Heading1"/>
+        <w:pStyle w:val="1"/>
         <w:rPr>
           <w:lang w:val="ru-RU"/>
         </w:rPr>
@@ -2333,8 +2330,19 @@
       </w:r>
     </w:p>
     <w:p>
-      <w:r>
-        <w:t>fastText: покрытие тестовых токенов 1.000.</w:t>
+      <w:pPr>
+        <w:rPr>
+          <w:lang w:val="ru-RU"/>
+        </w:rPr>
+      </w:pPr>
+      <w:r>
+        <w:t>fastText</w:t>
+      </w:r>
+      <w:r>
+        <w:rPr>
+          <w:lang w:val="ru-RU"/>
+        </w:rPr>
+        <w:t>: покрытие тестовых токенов 1.000.</w:t>
       </w:r>
     </w:p>
     <w:p>
@@ -2449,7 +2457,7 @@
     </w:p>
     <w:p>
       <w:pPr>
-        <w:pStyle w:val="Heading1"/>
+        <w:pStyle w:val="1"/>
       </w:pPr>
       <w:r>
         <w:t>8. t-SNE</w:t>
@@ -2460,14 +2468,11 @@
         <w:jc w:val="center"/>
       </w:pPr>
       <w:r>
-        <w:rPr>
-          <w:noProof/>
-        </w:rPr>
         <w:drawing>
-          <wp:inline distT="0" distB="0" distL="0" distR="0" wp14:anchorId="7AC69789" wp14:editId="2FB04D8B">
-            <wp:extent cx="5303520" cy="5282491"/>
-            <wp:effectExtent l="0" t="0" r="0" b="0"/>
-            <wp:docPr id="7" name="Picture 7"/>
+          <wp:inline distT="0" distB="0" distL="0" distR="0" wp14:anchorId="68EDB8A6" wp14:editId="54930C7F">
+            <wp:extent cx="6309360" cy="5706110"/>
+            <wp:effectExtent l="0" t="0" r="0" b="8890"/>
+            <wp:docPr id="9" name="Рисунок 9"/>
             <wp:cNvGraphicFramePr>
               <a:graphicFrameLocks xmlns:a="http://schemas.openxmlformats.org/drawingml/2006/main" noChangeAspect="1"/>
             </wp:cNvGraphicFramePr>
@@ -2475,7 +2480,7 @@
               <a:graphicData uri="http://schemas.openxmlformats.org/drawingml/2006/picture">
                 <pic:pic xmlns:pic="http://schemas.openxmlformats.org/drawingml/2006/picture">
                   <pic:nvPicPr>
-                    <pic:cNvPr id="0" name="tsne_w2v.png"/>
+                    <pic:cNvPr id="1" name=""/>
                     <pic:cNvPicPr/>
                   </pic:nvPicPr>
                   <pic:blipFill>
@@ -2487,7 +2492,7 @@
                   <pic:spPr>
                     <a:xfrm>
                       <a:off x="0" y="0"/>
-                      <a:ext cx="5303520" cy="5282491"/>
+                      <a:ext cx="6309360" cy="5706110"/>
                     </a:xfrm>
                     <a:prstGeom prst="rect">
                       <a:avLst/>
@@ -2510,15 +2515,12 @@
         <w:jc w:val="center"/>
       </w:pPr>
       <w:r>
-        <w:rPr>
-          <w:noProof/>
-        </w:rPr>
         <w:lastRenderedPageBreak/>
         <w:drawing>
-          <wp:inline distT="0" distB="0" distL="0" distR="0" wp14:anchorId="199BA132" wp14:editId="0283AA86">
-            <wp:extent cx="5303520" cy="5320464"/>
-            <wp:effectExtent l="0" t="0" r="0" b="0"/>
-            <wp:docPr id="8" name="Picture 8"/>
+          <wp:inline distT="0" distB="0" distL="0" distR="0" wp14:anchorId="11A622B6" wp14:editId="6363B385">
+            <wp:extent cx="6309360" cy="5671185"/>
+            <wp:effectExtent l="0" t="0" r="0" b="5715"/>
+            <wp:docPr id="10" name="Рисунок 10"/>
             <wp:cNvGraphicFramePr>
               <a:graphicFrameLocks xmlns:a="http://schemas.openxmlformats.org/drawingml/2006/main" noChangeAspect="1"/>
             </wp:cNvGraphicFramePr>
@@ -2526,7 +2528,7 @@
               <a:graphicData uri="http://schemas.openxmlformats.org/drawingml/2006/picture">
                 <pic:pic xmlns:pic="http://schemas.openxmlformats.org/drawingml/2006/picture">
                   <pic:nvPicPr>
-                    <pic:cNvPr id="0" name="tsne_ft.png"/>
+                    <pic:cNvPr id="1" name=""/>
                     <pic:cNvPicPr/>
                   </pic:nvPicPr>
                   <pic:blipFill>
@@ -2538,7 +2540,7 @@
                   <pic:spPr>
                     <a:xfrm>
                       <a:off x="0" y="0"/>
-                      <a:ext cx="5303520" cy="5320464"/>
+                      <a:ext cx="6309360" cy="5671185"/>
                     </a:xfrm>
                     <a:prstGeom prst="rect">
                       <a:avLst/>
@@ -2654,7 +2656,7 @@
     </w:p>
     <w:p>
       <w:pPr>
-        <w:pStyle w:val="Heading1"/>
+        <w:pStyle w:val="1"/>
         <w:rPr>
           <w:lang w:val="ru-RU"/>
         </w:rPr>
@@ -2870,7 +2872,7 @@
 </file>
 
 <file path=word/numbering.xml><?xml version="1.0" encoding="utf-8"?>
-<w:numbering xmlns:wpc="http://schemas.microsoft.com/office/word/2010/wordprocessingCanvas" xmlns:cx="http://schemas.microsoft.com/office/drawing/2014/chartex" xmlns:cx1="http://schemas.microsoft.com/office/drawing/2015/9/8/chartex" xmlns:cx2="http://schemas.microsoft.com/office/drawing/2015/10/21/chartex" xmlns:cx3="http://schemas.microsoft.com/office/drawing/2016/5/9/chartex" xmlns:cx4="http://schemas.microsoft.com/office/drawing/2016/5/10/chartex" xmlns:cx5="http://schemas.microsoft.com/office/drawing/2016/5/11/chartex" xmlns:cx6="http://schemas.microsoft.com/office/drawing/2016/5/12/chartex" xmlns:cx7="http://schemas.microsoft.com/office/drawing/2016/5/13/chartex" xmlns:cx8="http://schemas.microsoft.com/office/drawing/2016/5/14/chartex" xmlns:mc="http://schemas.openxmlformats.org/markup-compatibility/2006" xmlns:aink="http://schemas.microsoft.com/office/drawing/2016/ink" xmlns:am3d="http://schemas.microsoft.com/office/drawing/2017/model3d" xmlns:o="urn:schemas-microsoft-com:office:office" xmlns:oel="http://schemas.microsoft.com/office/2019/extlst" xmlns:r="http://schemas.openxmlformats.org/officeDocument/2006/relationships" xmlns:m="http://schemas.openxmlformats.org/officeDocument/2006/math" xmlns:v="urn:schemas-microsoft-com:vml" xmlns:wp14="http://schemas.microsoft.com/office/word/2010/wordprocessingDrawing" xmlns:wp="http://schemas.openxmlformats.org/drawingml/2006/wordprocessingDrawing" xmlns:w10="urn:schemas-microsoft-com:office:word" xmlns:w="http://schemas.openxmlformats.org/wordprocessingml/2006/main" xmlns:w14="http://schemas.microsoft.com/office/word/2010/wordml" xmlns:w15="http://schemas.microsoft.com/office/word/2012/wordml" xmlns:w16cex="http://schemas.microsoft.com/office/word/2018/wordml/cex" xmlns:w16cid="http://schemas.microsoft.com/office/word/2016/wordml/cid" xmlns:w16="http://schemas.microsoft.com/office/word/2018/wordml" xmlns:w16du="http://schemas.microsoft.com/office/word/2023/wordml/word16du" xmlns:w16sdtdh="http://schemas.microsoft.com/office/word/2020/wordml/sdtdatahash" xmlns:w16sdtfl="http://schemas.microsoft.com/office/word/2024/wordml/sdtformatlock" xmlns:w16se="http://schemas.microsoft.com/office/word/2015/wordml/symex" xmlns:wpg="http://schemas.microsoft.com/office/word/2010/wordprocessingGroup" xmlns:wpi="http://schemas.microsoft.com/office/word/2010/wordprocessingInk" xmlns:wne="http://schemas.microsoft.com/office/word/2006/wordml" xmlns:wps="http://schemas.microsoft.com/office/word/2010/wordprocessingShape" mc:Ignorable="w14 w15 w16se w16cid w16 w16cex w16sdtdh w16sdtfl w16du wp14">
+<w:numbering xmlns:wpc="http://schemas.microsoft.com/office/word/2010/wordprocessingCanvas" xmlns:cx="http://schemas.microsoft.com/office/drawing/2014/chartex" xmlns:cx1="http://schemas.microsoft.com/office/drawing/2015/9/8/chartex" xmlns:cx2="http://schemas.microsoft.com/office/drawing/2015/10/21/chartex" xmlns:cx3="http://schemas.microsoft.com/office/drawing/2016/5/9/chartex" xmlns:cx4="http://schemas.microsoft.com/office/drawing/2016/5/10/chartex" xmlns:cx5="http://schemas.microsoft.com/office/drawing/2016/5/11/chartex" xmlns:cx6="http://schemas.microsoft.com/office/drawing/2016/5/12/chartex" xmlns:cx7="http://schemas.microsoft.com/office/drawing/2016/5/13/chartex" xmlns:cx8="http://schemas.microsoft.com/office/drawing/2016/5/14/chartex" xmlns:mc="http://schemas.openxmlformats.org/markup-compatibility/2006" xmlns:aink="http://schemas.microsoft.com/office/drawing/2016/ink" xmlns:am3d="http://schemas.microsoft.com/office/drawing/2017/model3d" xmlns:o="urn:schemas-microsoft-com:office:office" xmlns:oel="http://schemas.microsoft.com/office/2019/extlst" xmlns:r="http://schemas.openxmlformats.org/officeDocument/2006/relationships" xmlns:m="http://schemas.openxmlformats.org/officeDocument/2006/math" xmlns:v="urn:schemas-microsoft-com:vml" xmlns:wp14="http://schemas.microsoft.com/office/word/2010/wordprocessingDrawing" xmlns:wp="http://schemas.openxmlformats.org/drawingml/2006/wordprocessingDrawing" xmlns:w10="urn:schemas-microsoft-com:office:word" xmlns:w="http://schemas.openxmlformats.org/wordprocessingml/2006/main" xmlns:w14="http://schemas.microsoft.com/office/word/2010/wordml" xmlns:w15="http://schemas.microsoft.com/office/word/2012/wordml" xmlns:w16cex="http://schemas.microsoft.com/office/word/2018/wordml/cex" xmlns:w16cid="http://schemas.microsoft.com/office/word/2016/wordml/cid" xmlns:w16="http://schemas.microsoft.com/office/word/2018/wordml" xmlns:w16sdtdh="http://schemas.microsoft.com/office/word/2020/wordml/sdtdatahash" xmlns:w16se="http://schemas.microsoft.com/office/word/2015/wordml/symex" xmlns:wpg="http://schemas.microsoft.com/office/word/2010/wordprocessingGroup" xmlns:wpi="http://schemas.microsoft.com/office/word/2010/wordprocessingInk" xmlns:wne="http://schemas.microsoft.com/office/word/2006/wordml" xmlns:wps="http://schemas.microsoft.com/office/word/2010/wordprocessingShape" mc:Ignorable="w14 w15 w16se w16cid w16 w16cex w16sdtdh wp14">
   <w:abstractNum w:abstractNumId="0" w15:restartNumberingAfterBreak="0">
     <w:nsid w:val="FFFFFF7C"/>
     <w:multiLevelType w:val="singleLevel"/>
@@ -2912,7 +2914,7 @@
     <w:lvl w:ilvl="0">
       <w:start w:val="1"/>
       <w:numFmt w:val="decimal"/>
-      <w:pStyle w:val="ListNumber3"/>
+      <w:pStyle w:val="3"/>
       <w:lvlText w:val="%1."/>
       <w:lvlJc w:val="left"/>
       <w:pPr>
@@ -2930,7 +2932,7 @@
     <w:lvl w:ilvl="0">
       <w:start w:val="1"/>
       <w:numFmt w:val="decimal"/>
-      <w:pStyle w:val="ListNumber2"/>
+      <w:pStyle w:val="2"/>
       <w:lvlText w:val="%1."/>
       <w:lvlJc w:val="left"/>
       <w:pPr>
@@ -2968,7 +2970,7 @@
     <w:lvl w:ilvl="0">
       <w:start w:val="1"/>
       <w:numFmt w:val="bullet"/>
-      <w:pStyle w:val="ListBullet3"/>
+      <w:pStyle w:val="30"/>
       <w:lvlText w:val=""/>
       <w:lvlJc w:val="left"/>
       <w:pPr>
@@ -2989,7 +2991,7 @@
     <w:lvl w:ilvl="0">
       <w:start w:val="1"/>
       <w:numFmt w:val="bullet"/>
-      <w:pStyle w:val="ListBullet2"/>
+      <w:pStyle w:val="20"/>
       <w:lvlText w:val=""/>
       <w:lvlJc w:val="left"/>
       <w:pPr>
@@ -3010,7 +3012,7 @@
     <w:lvl w:ilvl="0">
       <w:start w:val="1"/>
       <w:numFmt w:val="decimal"/>
-      <w:pStyle w:val="ListNumber"/>
+      <w:pStyle w:val="a"/>
       <w:lvlText w:val="%1."/>
       <w:lvlJc w:val="left"/>
       <w:pPr>
@@ -3028,7 +3030,7 @@
     <w:lvl w:ilvl="0">
       <w:start w:val="1"/>
       <w:numFmt w:val="bullet"/>
-      <w:pStyle w:val="ListBullet"/>
+      <w:pStyle w:val="a0"/>
       <w:lvlText w:val=""/>
       <w:lvlJc w:val="left"/>
       <w:pPr>
@@ -3305,7 +3307,7 @@
 </file>
 
 <file path=word/styles.xml><?xml version="1.0" encoding="utf-8"?>
-<w:styles xmlns:mc="http://schemas.openxmlformats.org/markup-compatibility/2006" xmlns:r="http://schemas.openxmlformats.org/officeDocument/2006/relationships" xmlns:w="http://schemas.openxmlformats.org/wordprocessingml/2006/main" xmlns:w14="http://schemas.microsoft.com/office/word/2010/wordml" xmlns:w15="http://schemas.microsoft.com/office/word/2012/wordml" xmlns:w16cex="http://schemas.microsoft.com/office/word/2018/wordml/cex" xmlns:w16cid="http://schemas.microsoft.com/office/word/2016/wordml/cid" xmlns:w16="http://schemas.microsoft.com/office/word/2018/wordml" xmlns:w16du="http://schemas.microsoft.com/office/word/2023/wordml/word16du" xmlns:w16sdtdh="http://schemas.microsoft.com/office/word/2020/wordml/sdtdatahash" xmlns:w16sdtfl="http://schemas.microsoft.com/office/word/2024/wordml/sdtformatlock" xmlns:w16se="http://schemas.microsoft.com/office/word/2015/wordml/symex" mc:Ignorable="w14 w15 w16se w16cid w16 w16cex w16sdtdh w16sdtfl w16du">
+<w:styles xmlns:mc="http://schemas.openxmlformats.org/markup-compatibility/2006" xmlns:r="http://schemas.openxmlformats.org/officeDocument/2006/relationships" xmlns:w="http://schemas.openxmlformats.org/wordprocessingml/2006/main" xmlns:w14="http://schemas.microsoft.com/office/word/2010/wordml" xmlns:w15="http://schemas.microsoft.com/office/word/2012/wordml" xmlns:w16cex="http://schemas.microsoft.com/office/word/2018/wordml/cex" xmlns:w16cid="http://schemas.microsoft.com/office/word/2016/wordml/cid" xmlns:w16="http://schemas.microsoft.com/office/word/2018/wordml" xmlns:w16sdtdh="http://schemas.microsoft.com/office/word/2020/wordml/sdtdatahash" xmlns:w16se="http://schemas.microsoft.com/office/word/2015/wordml/symex" mc:Ignorable="w14 w15 w16se w16cid w16 w16cex w16sdtdh">
   <w:docDefaults>
     <w:rPrDefault>
       <w:rPr>
@@ -3690,7 +3692,7 @@
     <w:lsdException w:name="Unresolved Mention" w:semiHidden="1" w:unhideWhenUsed="1"/>
     <w:lsdException w:name="Smart Link" w:semiHidden="1" w:unhideWhenUsed="1"/>
   </w:latentStyles>
-  <w:style w:type="paragraph" w:default="1" w:styleId="Normal">
+  <w:style w:type="paragraph" w:default="1" w:styleId="a1">
     <w:name w:val="Normal"/>
     <w:qFormat/>
     <w:rsid w:val="00FC693F"/>
@@ -3699,11 +3701,11 @@
       <w:sz w:val="21"/>
     </w:rPr>
   </w:style>
-  <w:style w:type="paragraph" w:styleId="Heading1">
+  <w:style w:type="paragraph" w:styleId="1">
     <w:name w:val="heading 1"/>
-    <w:basedOn w:val="Normal"/>
-    <w:next w:val="Normal"/>
-    <w:link w:val="Heading1Char"/>
+    <w:basedOn w:val="a1"/>
+    <w:next w:val="a1"/>
+    <w:link w:val="10"/>
     <w:uiPriority w:val="9"/>
     <w:qFormat/>
     <w:rsid w:val="00FC693F"/>
@@ -3722,11 +3724,11 @@
       <w:szCs w:val="28"/>
     </w:rPr>
   </w:style>
-  <w:style w:type="paragraph" w:styleId="Heading2">
+  <w:style w:type="paragraph" w:styleId="21">
     <w:name w:val="heading 2"/>
-    <w:basedOn w:val="Normal"/>
-    <w:next w:val="Normal"/>
-    <w:link w:val="Heading2Char"/>
+    <w:basedOn w:val="a1"/>
+    <w:next w:val="a1"/>
+    <w:link w:val="22"/>
     <w:uiPriority w:val="9"/>
     <w:unhideWhenUsed/>
     <w:qFormat/>
@@ -3746,11 +3748,11 @@
       <w:szCs w:val="26"/>
     </w:rPr>
   </w:style>
-  <w:style w:type="paragraph" w:styleId="Heading3">
+  <w:style w:type="paragraph" w:styleId="31">
     <w:name w:val="heading 3"/>
-    <w:basedOn w:val="Normal"/>
-    <w:next w:val="Normal"/>
-    <w:link w:val="Heading3Char"/>
+    <w:basedOn w:val="a1"/>
+    <w:next w:val="a1"/>
+    <w:link w:val="32"/>
     <w:uiPriority w:val="9"/>
     <w:unhideWhenUsed/>
     <w:qFormat/>
@@ -3768,11 +3770,11 @@
       <w:color w:val="4F81BD" w:themeColor="accent1"/>
     </w:rPr>
   </w:style>
-  <w:style w:type="paragraph" w:styleId="Heading4">
+  <w:style w:type="paragraph" w:styleId="4">
     <w:name w:val="heading 4"/>
-    <w:basedOn w:val="Normal"/>
-    <w:next w:val="Normal"/>
-    <w:link w:val="Heading4Char"/>
+    <w:basedOn w:val="a1"/>
+    <w:next w:val="a1"/>
+    <w:link w:val="40"/>
     <w:uiPriority w:val="9"/>
     <w:semiHidden/>
     <w:unhideWhenUsed/>
@@ -3793,11 +3795,11 @@
       <w:color w:val="4F81BD" w:themeColor="accent1"/>
     </w:rPr>
   </w:style>
-  <w:style w:type="paragraph" w:styleId="Heading5">
+  <w:style w:type="paragraph" w:styleId="5">
     <w:name w:val="heading 5"/>
-    <w:basedOn w:val="Normal"/>
-    <w:next w:val="Normal"/>
-    <w:link w:val="Heading5Char"/>
+    <w:basedOn w:val="a1"/>
+    <w:next w:val="a1"/>
+    <w:link w:val="50"/>
     <w:uiPriority w:val="9"/>
     <w:semiHidden/>
     <w:unhideWhenUsed/>
@@ -3814,11 +3816,11 @@
       <w:color w:val="243F60" w:themeColor="accent1" w:themeShade="7F"/>
     </w:rPr>
   </w:style>
-  <w:style w:type="paragraph" w:styleId="Heading6">
+  <w:style w:type="paragraph" w:styleId="6">
     <w:name w:val="heading 6"/>
-    <w:basedOn w:val="Normal"/>
-    <w:next w:val="Normal"/>
-    <w:link w:val="Heading6Char"/>
+    <w:basedOn w:val="a1"/>
+    <w:next w:val="a1"/>
+    <w:link w:val="60"/>
     <w:uiPriority w:val="9"/>
     <w:semiHidden/>
     <w:unhideWhenUsed/>
@@ -3837,11 +3839,11 @@
       <w:color w:val="243F60" w:themeColor="accent1" w:themeShade="7F"/>
     </w:rPr>
   </w:style>
-  <w:style w:type="paragraph" w:styleId="Heading7">
+  <w:style w:type="paragraph" w:styleId="7">
     <w:name w:val="heading 7"/>
-    <w:basedOn w:val="Normal"/>
-    <w:next w:val="Normal"/>
-    <w:link w:val="Heading7Char"/>
+    <w:basedOn w:val="a1"/>
+    <w:next w:val="a1"/>
+    <w:link w:val="70"/>
     <w:uiPriority w:val="9"/>
     <w:semiHidden/>
     <w:unhideWhenUsed/>
@@ -3860,11 +3862,11 @@
       <w:color w:val="404040" w:themeColor="text1" w:themeTint="BF"/>
     </w:rPr>
   </w:style>
-  <w:style w:type="paragraph" w:styleId="Heading8">
+  <w:style w:type="paragraph" w:styleId="8">
     <w:name w:val="heading 8"/>
-    <w:basedOn w:val="Normal"/>
-    <w:next w:val="Normal"/>
-    <w:link w:val="Heading8Char"/>
+    <w:basedOn w:val="a1"/>
+    <w:next w:val="a1"/>
+    <w:link w:val="80"/>
     <w:uiPriority w:val="9"/>
     <w:semiHidden/>
     <w:unhideWhenUsed/>
@@ -3883,11 +3885,11 @@
       <w:szCs w:val="20"/>
     </w:rPr>
   </w:style>
-  <w:style w:type="paragraph" w:styleId="Heading9">
+  <w:style w:type="paragraph" w:styleId="9">
     <w:name w:val="heading 9"/>
-    <w:basedOn w:val="Normal"/>
-    <w:next w:val="Normal"/>
-    <w:link w:val="Heading9Char"/>
+    <w:basedOn w:val="a1"/>
+    <w:next w:val="a1"/>
+    <w:link w:val="90"/>
     <w:uiPriority w:val="9"/>
     <w:semiHidden/>
     <w:unhideWhenUsed/>
@@ -3908,13 +3910,13 @@
       <w:szCs w:val="20"/>
     </w:rPr>
   </w:style>
-  <w:style w:type="character" w:default="1" w:styleId="DefaultParagraphFont">
+  <w:style w:type="character" w:default="1" w:styleId="a2">
     <w:name w:val="Default Paragraph Font"/>
     <w:uiPriority w:val="1"/>
     <w:semiHidden/>
     <w:unhideWhenUsed/>
   </w:style>
-  <w:style w:type="table" w:default="1" w:styleId="TableNormal">
+  <w:style w:type="table" w:default="1" w:styleId="a3">
     <w:name w:val="Normal Table"/>
     <w:uiPriority w:val="99"/>
     <w:semiHidden/>
@@ -3929,16 +3931,16 @@
       </w:tblCellMar>
     </w:tblPr>
   </w:style>
-  <w:style w:type="numbering" w:default="1" w:styleId="NoList">
+  <w:style w:type="numbering" w:default="1" w:styleId="a4">
     <w:name w:val="No List"/>
     <w:uiPriority w:val="99"/>
     <w:semiHidden/>
     <w:unhideWhenUsed/>
   </w:style>
-  <w:style w:type="paragraph" w:styleId="Header">
+  <w:style w:type="paragraph" w:styleId="a5">
     <w:name w:val="header"/>
-    <w:basedOn w:val="Normal"/>
-    <w:link w:val="HeaderChar"/>
+    <w:basedOn w:val="a1"/>
+    <w:link w:val="a6"/>
     <w:uiPriority w:val="99"/>
     <w:unhideWhenUsed/>
     <w:rsid w:val="00E618BF"/>
@@ -3950,17 +3952,17 @@
       <w:spacing w:after="0" w:line="240" w:lineRule="auto"/>
     </w:pPr>
   </w:style>
-  <w:style w:type="character" w:customStyle="1" w:styleId="HeaderChar">
-    <w:name w:val="Header Char"/>
-    <w:basedOn w:val="DefaultParagraphFont"/>
-    <w:link w:val="Header"/>
+  <w:style w:type="character" w:customStyle="1" w:styleId="a6">
+    <w:name w:val="Верхний колонтитул Знак"/>
+    <w:basedOn w:val="a2"/>
+    <w:link w:val="a5"/>
     <w:uiPriority w:val="99"/>
     <w:rsid w:val="00E618BF"/>
   </w:style>
-  <w:style w:type="paragraph" w:styleId="Footer">
+  <w:style w:type="paragraph" w:styleId="a7">
     <w:name w:val="footer"/>
-    <w:basedOn w:val="Normal"/>
-    <w:link w:val="FooterChar"/>
+    <w:basedOn w:val="a1"/>
+    <w:link w:val="a8"/>
     <w:uiPriority w:val="99"/>
     <w:unhideWhenUsed/>
     <w:rsid w:val="00E618BF"/>
@@ -3972,14 +3974,14 @@
       <w:spacing w:after="0" w:line="240" w:lineRule="auto"/>
     </w:pPr>
   </w:style>
-  <w:style w:type="character" w:customStyle="1" w:styleId="FooterChar">
-    <w:name w:val="Footer Char"/>
-    <w:basedOn w:val="DefaultParagraphFont"/>
-    <w:link w:val="Footer"/>
+  <w:style w:type="character" w:customStyle="1" w:styleId="a8">
+    <w:name w:val="Нижний колонтитул Знак"/>
+    <w:basedOn w:val="a2"/>
+    <w:link w:val="a7"/>
     <w:uiPriority w:val="99"/>
     <w:rsid w:val="00E618BF"/>
   </w:style>
-  <w:style w:type="paragraph" w:styleId="NoSpacing">
+  <w:style w:type="paragraph" w:styleId="a9">
     <w:name w:val="No Spacing"/>
     <w:uiPriority w:val="1"/>
     <w:qFormat/>
@@ -3988,10 +3990,10 @@
       <w:spacing w:after="0" w:line="240" w:lineRule="auto"/>
     </w:pPr>
   </w:style>
-  <w:style w:type="character" w:customStyle="1" w:styleId="Heading1Char">
-    <w:name w:val="Heading 1 Char"/>
-    <w:basedOn w:val="DefaultParagraphFont"/>
-    <w:link w:val="Heading1"/>
+  <w:style w:type="character" w:customStyle="1" w:styleId="10">
+    <w:name w:val="Заголовок 1 Знак"/>
+    <w:basedOn w:val="a2"/>
+    <w:link w:val="1"/>
     <w:uiPriority w:val="9"/>
     <w:rsid w:val="00FC693F"/>
     <w:rPr>
@@ -4003,10 +4005,10 @@
       <w:szCs w:val="28"/>
     </w:rPr>
   </w:style>
-  <w:style w:type="character" w:customStyle="1" w:styleId="Heading2Char">
-    <w:name w:val="Heading 2 Char"/>
-    <w:basedOn w:val="DefaultParagraphFont"/>
-    <w:link w:val="Heading2"/>
+  <w:style w:type="character" w:customStyle="1" w:styleId="22">
+    <w:name w:val="Заголовок 2 Знак"/>
+    <w:basedOn w:val="a2"/>
+    <w:link w:val="21"/>
     <w:uiPriority w:val="9"/>
     <w:rsid w:val="00FC693F"/>
     <w:rPr>
@@ -4018,10 +4020,10 @@
       <w:szCs w:val="26"/>
     </w:rPr>
   </w:style>
-  <w:style w:type="character" w:customStyle="1" w:styleId="Heading3Char">
-    <w:name w:val="Heading 3 Char"/>
-    <w:basedOn w:val="DefaultParagraphFont"/>
-    <w:link w:val="Heading3"/>
+  <w:style w:type="character" w:customStyle="1" w:styleId="32">
+    <w:name w:val="Заголовок 3 Знак"/>
+    <w:basedOn w:val="a2"/>
+    <w:link w:val="31"/>
     <w:uiPriority w:val="9"/>
     <w:rsid w:val="00FC693F"/>
     <w:rPr>
@@ -4031,11 +4033,11 @@
       <w:color w:val="4F81BD" w:themeColor="accent1"/>
     </w:rPr>
   </w:style>
-  <w:style w:type="paragraph" w:styleId="Title">
+  <w:style w:type="paragraph" w:styleId="aa">
     <w:name w:val="Title"/>
-    <w:basedOn w:val="Normal"/>
-    <w:next w:val="Normal"/>
-    <w:link w:val="TitleChar"/>
+    <w:basedOn w:val="a1"/>
+    <w:next w:val="a1"/>
+    <w:link w:val="ab"/>
     <w:uiPriority w:val="10"/>
     <w:qFormat/>
     <w:rsid w:val="00FC693F"/>
@@ -4055,10 +4057,10 @@
       <w:szCs w:val="52"/>
     </w:rPr>
   </w:style>
-  <w:style w:type="character" w:customStyle="1" w:styleId="TitleChar">
-    <w:name w:val="Title Char"/>
-    <w:basedOn w:val="DefaultParagraphFont"/>
-    <w:link w:val="Title"/>
+  <w:style w:type="character" w:customStyle="1" w:styleId="ab">
+    <w:name w:val="Заголовок Знак"/>
+    <w:basedOn w:val="a2"/>
+    <w:link w:val="aa"/>
     <w:uiPriority w:val="10"/>
     <w:rsid w:val="00FC693F"/>
     <w:rPr>
@@ -4070,11 +4072,11 @@
       <w:szCs w:val="52"/>
     </w:rPr>
   </w:style>
-  <w:style w:type="paragraph" w:styleId="Subtitle">
+  <w:style w:type="paragraph" w:styleId="ac">
     <w:name w:val="Subtitle"/>
-    <w:basedOn w:val="Normal"/>
-    <w:next w:val="Normal"/>
-    <w:link w:val="SubtitleChar"/>
+    <w:basedOn w:val="a1"/>
+    <w:next w:val="a1"/>
+    <w:link w:val="ad"/>
     <w:uiPriority w:val="11"/>
     <w:qFormat/>
     <w:rsid w:val="00FC693F"/>
@@ -4093,10 +4095,10 @@
       <w:szCs w:val="24"/>
     </w:rPr>
   </w:style>
-  <w:style w:type="character" w:customStyle="1" w:styleId="SubtitleChar">
-    <w:name w:val="Subtitle Char"/>
-    <w:basedOn w:val="DefaultParagraphFont"/>
-    <w:link w:val="Subtitle"/>
+  <w:style w:type="character" w:customStyle="1" w:styleId="ad">
+    <w:name w:val="Подзаголовок Знак"/>
+    <w:basedOn w:val="a2"/>
+    <w:link w:val="ac"/>
     <w:uiPriority w:val="11"/>
     <w:rsid w:val="00FC693F"/>
     <w:rPr>
@@ -4109,9 +4111,9 @@
       <w:szCs w:val="24"/>
     </w:rPr>
   </w:style>
-  <w:style w:type="paragraph" w:styleId="ListParagraph">
+  <w:style w:type="paragraph" w:styleId="ae">
     <w:name w:val="List Paragraph"/>
-    <w:basedOn w:val="Normal"/>
+    <w:basedOn w:val="a1"/>
     <w:uiPriority w:val="34"/>
     <w:qFormat/>
     <w:rsid w:val="00FC693F"/>
@@ -4120,10 +4122,10 @@
       <w:contextualSpacing/>
     </w:pPr>
   </w:style>
-  <w:style w:type="paragraph" w:styleId="BodyText">
+  <w:style w:type="paragraph" w:styleId="af">
     <w:name w:val="Body Text"/>
-    <w:basedOn w:val="Normal"/>
-    <w:link w:val="BodyTextChar"/>
+    <w:basedOn w:val="a1"/>
+    <w:link w:val="af0"/>
     <w:uiPriority w:val="99"/>
     <w:unhideWhenUsed/>
     <w:rsid w:val="00AA1D8D"/>
@@ -4131,17 +4133,17 @@
       <w:spacing w:after="120"/>
     </w:pPr>
   </w:style>
-  <w:style w:type="character" w:customStyle="1" w:styleId="BodyTextChar">
-    <w:name w:val="Body Text Char"/>
-    <w:basedOn w:val="DefaultParagraphFont"/>
-    <w:link w:val="BodyText"/>
+  <w:style w:type="character" w:customStyle="1" w:styleId="af0">
+    <w:name w:val="Основной текст Знак"/>
+    <w:basedOn w:val="a2"/>
+    <w:link w:val="af"/>
     <w:uiPriority w:val="99"/>
     <w:rsid w:val="00AA1D8D"/>
   </w:style>
-  <w:style w:type="paragraph" w:styleId="BodyText2">
+  <w:style w:type="paragraph" w:styleId="23">
     <w:name w:val="Body Text 2"/>
-    <w:basedOn w:val="Normal"/>
-    <w:link w:val="BodyText2Char"/>
+    <w:basedOn w:val="a1"/>
+    <w:link w:val="24"/>
     <w:uiPriority w:val="99"/>
     <w:unhideWhenUsed/>
     <w:rsid w:val="00AA1D8D"/>
@@ -4149,17 +4151,17 @@
       <w:spacing w:after="120" w:line="480" w:lineRule="auto"/>
     </w:pPr>
   </w:style>
-  <w:style w:type="character" w:customStyle="1" w:styleId="BodyText2Char">
-    <w:name w:val="Body Text 2 Char"/>
-    <w:basedOn w:val="DefaultParagraphFont"/>
-    <w:link w:val="BodyText2"/>
+  <w:style w:type="character" w:customStyle="1" w:styleId="24">
+    <w:name w:val="Основной текст 2 Знак"/>
+    <w:basedOn w:val="a2"/>
+    <w:link w:val="23"/>
     <w:uiPriority w:val="99"/>
     <w:rsid w:val="00AA1D8D"/>
   </w:style>
-  <w:style w:type="paragraph" w:styleId="BodyText3">
+  <w:style w:type="paragraph" w:styleId="33">
     <w:name w:val="Body Text 3"/>
-    <w:basedOn w:val="Normal"/>
-    <w:link w:val="BodyText3Char"/>
+    <w:basedOn w:val="a1"/>
+    <w:link w:val="34"/>
     <w:uiPriority w:val="99"/>
     <w:unhideWhenUsed/>
     <w:rsid w:val="00AA1D8D"/>
@@ -4171,10 +4173,10 @@
       <w:szCs w:val="16"/>
     </w:rPr>
   </w:style>
-  <w:style w:type="character" w:customStyle="1" w:styleId="BodyText3Char">
-    <w:name w:val="Body Text 3 Char"/>
-    <w:basedOn w:val="DefaultParagraphFont"/>
-    <w:link w:val="BodyText3"/>
+  <w:style w:type="character" w:customStyle="1" w:styleId="34">
+    <w:name w:val="Основной текст 3 Знак"/>
+    <w:basedOn w:val="a2"/>
+    <w:link w:val="33"/>
     <w:uiPriority w:val="99"/>
     <w:rsid w:val="00AA1D8D"/>
     <w:rPr>
@@ -4182,9 +4184,9 @@
       <w:szCs w:val="16"/>
     </w:rPr>
   </w:style>
-  <w:style w:type="paragraph" w:styleId="List">
+  <w:style w:type="paragraph" w:styleId="af1">
     <w:name w:val="List"/>
-    <w:basedOn w:val="Normal"/>
+    <w:basedOn w:val="a1"/>
     <w:uiPriority w:val="99"/>
     <w:unhideWhenUsed/>
     <w:rsid w:val="00AA1D8D"/>
@@ -4193,9 +4195,9 @@
       <w:contextualSpacing/>
     </w:pPr>
   </w:style>
-  <w:style w:type="paragraph" w:styleId="List2">
+  <w:style w:type="paragraph" w:styleId="25">
     <w:name w:val="List 2"/>
-    <w:basedOn w:val="Normal"/>
+    <w:basedOn w:val="a1"/>
     <w:uiPriority w:val="99"/>
     <w:unhideWhenUsed/>
     <w:rsid w:val="00326F90"/>
@@ -4204,9 +4206,9 @@
       <w:contextualSpacing/>
     </w:pPr>
   </w:style>
-  <w:style w:type="paragraph" w:styleId="List3">
+  <w:style w:type="paragraph" w:styleId="35">
     <w:name w:val="List 3"/>
-    <w:basedOn w:val="Normal"/>
+    <w:basedOn w:val="a1"/>
     <w:uiPriority w:val="99"/>
     <w:unhideWhenUsed/>
     <w:rsid w:val="00326F90"/>
@@ -4215,9 +4217,9 @@
       <w:contextualSpacing/>
     </w:pPr>
   </w:style>
-  <w:style w:type="paragraph" w:styleId="ListBullet">
+  <w:style w:type="paragraph" w:styleId="a0">
     <w:name w:val="List Bullet"/>
-    <w:basedOn w:val="Normal"/>
+    <w:basedOn w:val="a1"/>
     <w:uiPriority w:val="99"/>
     <w:unhideWhenUsed/>
     <w:rsid w:val="00326F90"/>
@@ -4228,9 +4230,9 @@
       <w:contextualSpacing/>
     </w:pPr>
   </w:style>
-  <w:style w:type="paragraph" w:styleId="ListBullet2">
+  <w:style w:type="paragraph" w:styleId="20">
     <w:name w:val="List Bullet 2"/>
-    <w:basedOn w:val="Normal"/>
+    <w:basedOn w:val="a1"/>
     <w:uiPriority w:val="99"/>
     <w:unhideWhenUsed/>
     <w:rsid w:val="00326F90"/>
@@ -4241,9 +4243,9 @@
       <w:contextualSpacing/>
     </w:pPr>
   </w:style>
-  <w:style w:type="paragraph" w:styleId="ListBullet3">
+  <w:style w:type="paragraph" w:styleId="30">
     <w:name w:val="List Bullet 3"/>
-    <w:basedOn w:val="Normal"/>
+    <w:basedOn w:val="a1"/>
     <w:uiPriority w:val="99"/>
     <w:unhideWhenUsed/>
     <w:rsid w:val="00326F90"/>
@@ -4254,9 +4256,9 @@
       <w:contextualSpacing/>
     </w:pPr>
   </w:style>
-  <w:style w:type="paragraph" w:styleId="ListNumber">
+  <w:style w:type="paragraph" w:styleId="a">
     <w:name w:val="List Number"/>
-    <w:basedOn w:val="Normal"/>
+    <w:basedOn w:val="a1"/>
     <w:uiPriority w:val="99"/>
     <w:unhideWhenUsed/>
     <w:rsid w:val="00326F90"/>
@@ -4267,9 +4269,9 @@
       <w:contextualSpacing/>
     </w:pPr>
   </w:style>
-  <w:style w:type="paragraph" w:styleId="ListNumber2">
+  <w:style w:type="paragraph" w:styleId="2">
     <w:name w:val="List Number 2"/>
-    <w:basedOn w:val="Normal"/>
+    <w:basedOn w:val="a1"/>
     <w:uiPriority w:val="99"/>
     <w:unhideWhenUsed/>
     <w:rsid w:val="0029639D"/>
@@ -4280,9 +4282,9 @@
       <w:contextualSpacing/>
     </w:pPr>
   </w:style>
-  <w:style w:type="paragraph" w:styleId="ListNumber3">
+  <w:style w:type="paragraph" w:styleId="3">
     <w:name w:val="List Number 3"/>
-    <w:basedOn w:val="Normal"/>
+    <w:basedOn w:val="a1"/>
     <w:uiPriority w:val="99"/>
     <w:unhideWhenUsed/>
     <w:rsid w:val="0029639D"/>
@@ -4293,9 +4295,9 @@
       <w:contextualSpacing/>
     </w:pPr>
   </w:style>
-  <w:style w:type="paragraph" w:styleId="ListContinue">
+  <w:style w:type="paragraph" w:styleId="af2">
     <w:name w:val="List Continue"/>
-    <w:basedOn w:val="Normal"/>
+    <w:basedOn w:val="a1"/>
     <w:uiPriority w:val="99"/>
     <w:unhideWhenUsed/>
     <w:rsid w:val="0029639D"/>
@@ -4305,9 +4307,9 @@
       <w:contextualSpacing/>
     </w:pPr>
   </w:style>
-  <w:style w:type="paragraph" w:styleId="ListContinue2">
+  <w:style w:type="paragraph" w:styleId="26">
     <w:name w:val="List Continue 2"/>
-    <w:basedOn w:val="Normal"/>
+    <w:basedOn w:val="a1"/>
     <w:uiPriority w:val="99"/>
     <w:unhideWhenUsed/>
     <w:rsid w:val="0029639D"/>
@@ -4317,9 +4319,9 @@
       <w:contextualSpacing/>
     </w:pPr>
   </w:style>
-  <w:style w:type="paragraph" w:styleId="ListContinue3">
+  <w:style w:type="paragraph" w:styleId="36">
     <w:name w:val="List Continue 3"/>
-    <w:basedOn w:val="Normal"/>
+    <w:basedOn w:val="a1"/>
     <w:uiPriority w:val="99"/>
     <w:unhideWhenUsed/>
     <w:rsid w:val="0029639D"/>
@@ -4329,9 +4331,9 @@
       <w:contextualSpacing/>
     </w:pPr>
   </w:style>
-  <w:style w:type="paragraph" w:styleId="MacroText">
+  <w:style w:type="paragraph" w:styleId="af3">
     <w:name w:val="macro"/>
-    <w:link w:val="MacroTextChar"/>
+    <w:link w:val="af4"/>
     <w:uiPriority w:val="99"/>
     <w:unhideWhenUsed/>
     <w:rsid w:val="0029639D"/>
@@ -4352,10 +4354,10 @@
       <w:szCs w:val="20"/>
     </w:rPr>
   </w:style>
-  <w:style w:type="character" w:customStyle="1" w:styleId="MacroTextChar">
-    <w:name w:val="Macro Text Char"/>
-    <w:basedOn w:val="DefaultParagraphFont"/>
-    <w:link w:val="MacroText"/>
+  <w:style w:type="character" w:customStyle="1" w:styleId="af4">
+    <w:name w:val="Текст макроса Знак"/>
+    <w:basedOn w:val="a2"/>
+    <w:link w:val="af3"/>
     <w:uiPriority w:val="99"/>
     <w:rsid w:val="0029639D"/>
     <w:rPr>
@@ -4364,11 +4366,11 @@
       <w:szCs w:val="20"/>
     </w:rPr>
   </w:style>
-  <w:style w:type="paragraph" w:styleId="Quote">
+  <w:style w:type="paragraph" w:styleId="27">
     <w:name w:val="Quote"/>
-    <w:basedOn w:val="Normal"/>
-    <w:next w:val="Normal"/>
-    <w:link w:val="QuoteChar"/>
+    <w:basedOn w:val="a1"/>
+    <w:next w:val="a1"/>
+    <w:link w:val="28"/>
     <w:uiPriority w:val="29"/>
     <w:qFormat/>
     <w:rsid w:val="00FC693F"/>
@@ -4378,10 +4380,10 @@
       <w:color w:val="000000" w:themeColor="text1"/>
     </w:rPr>
   </w:style>
-  <w:style w:type="character" w:customStyle="1" w:styleId="QuoteChar">
-    <w:name w:val="Quote Char"/>
-    <w:basedOn w:val="DefaultParagraphFont"/>
-    <w:link w:val="Quote"/>
+  <w:style w:type="character" w:customStyle="1" w:styleId="28">
+    <w:name w:val="Цитата 2 Знак"/>
+    <w:basedOn w:val="a2"/>
+    <w:link w:val="27"/>
     <w:uiPriority w:val="29"/>
     <w:rsid w:val="00FC693F"/>
     <w:rPr>
@@ -4390,10 +4392,10 @@
       <w:color w:val="000000" w:themeColor="text1"/>
     </w:rPr>
   </w:style>
-  <w:style w:type="character" w:customStyle="1" w:styleId="Heading4Char">
-    <w:name w:val="Heading 4 Char"/>
-    <w:basedOn w:val="DefaultParagraphFont"/>
-    <w:link w:val="Heading4"/>
+  <w:style w:type="character" w:customStyle="1" w:styleId="40">
+    <w:name w:val="Заголовок 4 Знак"/>
+    <w:basedOn w:val="a2"/>
+    <w:link w:val="4"/>
     <w:uiPriority w:val="9"/>
     <w:semiHidden/>
     <w:rsid w:val="00FC693F"/>
@@ -4406,10 +4408,10 @@
       <w:color w:val="4F81BD" w:themeColor="accent1"/>
     </w:rPr>
   </w:style>
-  <w:style w:type="character" w:customStyle="1" w:styleId="Heading5Char">
-    <w:name w:val="Heading 5 Char"/>
-    <w:basedOn w:val="DefaultParagraphFont"/>
-    <w:link w:val="Heading5"/>
+  <w:style w:type="character" w:customStyle="1" w:styleId="50">
+    <w:name w:val="Заголовок 5 Знак"/>
+    <w:basedOn w:val="a2"/>
+    <w:link w:val="5"/>
     <w:uiPriority w:val="9"/>
     <w:semiHidden/>
     <w:rsid w:val="00FC693F"/>
@@ -4418,10 +4420,10 @@
       <w:color w:val="243F60" w:themeColor="accent1" w:themeShade="7F"/>
     </w:rPr>
   </w:style>
-  <w:style w:type="character" w:customStyle="1" w:styleId="Heading6Char">
-    <w:name w:val="Heading 6 Char"/>
-    <w:basedOn w:val="DefaultParagraphFont"/>
-    <w:link w:val="Heading6"/>
+  <w:style w:type="character" w:customStyle="1" w:styleId="60">
+    <w:name w:val="Заголовок 6 Знак"/>
+    <w:basedOn w:val="a2"/>
+    <w:link w:val="6"/>
     <w:uiPriority w:val="9"/>
     <w:semiHidden/>
     <w:rsid w:val="00FC693F"/>
@@ -4432,10 +4434,10 @@
       <w:color w:val="243F60" w:themeColor="accent1" w:themeShade="7F"/>
     </w:rPr>
   </w:style>
-  <w:style w:type="character" w:customStyle="1" w:styleId="Heading7Char">
-    <w:name w:val="Heading 7 Char"/>
-    <w:basedOn w:val="DefaultParagraphFont"/>
-    <w:link w:val="Heading7"/>
+  <w:style w:type="character" w:customStyle="1" w:styleId="70">
+    <w:name w:val="Заголовок 7 Знак"/>
+    <w:basedOn w:val="a2"/>
+    <w:link w:val="7"/>
     <w:uiPriority w:val="9"/>
     <w:semiHidden/>
     <w:rsid w:val="00FC693F"/>
@@ -4446,10 +4448,10 @@
       <w:color w:val="404040" w:themeColor="text1" w:themeTint="BF"/>
     </w:rPr>
   </w:style>
-  <w:style w:type="character" w:customStyle="1" w:styleId="Heading8Char">
-    <w:name w:val="Heading 8 Char"/>
-    <w:basedOn w:val="DefaultParagraphFont"/>
-    <w:link w:val="Heading8"/>
+  <w:style w:type="character" w:customStyle="1" w:styleId="80">
+    <w:name w:val="Заголовок 8 Знак"/>
+    <w:basedOn w:val="a2"/>
+    <w:link w:val="8"/>
     <w:uiPriority w:val="9"/>
     <w:semiHidden/>
     <w:rsid w:val="00FC693F"/>
@@ -4460,10 +4462,10 @@
       <w:szCs w:val="20"/>
     </w:rPr>
   </w:style>
-  <w:style w:type="character" w:customStyle="1" w:styleId="Heading9Char">
-    <w:name w:val="Heading 9 Char"/>
-    <w:basedOn w:val="DefaultParagraphFont"/>
-    <w:link w:val="Heading9"/>
+  <w:style w:type="character" w:customStyle="1" w:styleId="90">
+    <w:name w:val="Заголовок 9 Знак"/>
+    <w:basedOn w:val="a2"/>
+    <w:link w:val="9"/>
     <w:uiPriority w:val="9"/>
     <w:semiHidden/>
     <w:rsid w:val="00FC693F"/>
@@ -4476,10 +4478,10 @@
       <w:szCs w:val="20"/>
     </w:rPr>
   </w:style>
-  <w:style w:type="paragraph" w:styleId="Caption">
+  <w:style w:type="paragraph" w:styleId="af5">
     <w:name w:val="caption"/>
-    <w:basedOn w:val="Normal"/>
-    <w:next w:val="Normal"/>
+    <w:basedOn w:val="a1"/>
+    <w:next w:val="a1"/>
     <w:uiPriority w:val="35"/>
     <w:semiHidden/>
     <w:unhideWhenUsed/>
@@ -4496,9 +4498,9 @@
       <w:szCs w:val="18"/>
     </w:rPr>
   </w:style>
-  <w:style w:type="character" w:styleId="Strong">
+  <w:style w:type="character" w:styleId="af6">
     <w:name w:val="Strong"/>
-    <w:basedOn w:val="DefaultParagraphFont"/>
+    <w:basedOn w:val="a2"/>
     <w:uiPriority w:val="22"/>
     <w:qFormat/>
     <w:rsid w:val="00FC693F"/>
@@ -4507,9 +4509,9 @@
       <w:bCs/>
     </w:rPr>
   </w:style>
-  <w:style w:type="character" w:styleId="Emphasis">
+  <w:style w:type="character" w:styleId="af7">
     <w:name w:val="Emphasis"/>
-    <w:basedOn w:val="DefaultParagraphFont"/>
+    <w:basedOn w:val="a2"/>
     <w:uiPriority w:val="20"/>
     <w:qFormat/>
     <w:rsid w:val="00FC693F"/>
@@ -4518,11 +4520,11 @@
       <w:iCs/>
     </w:rPr>
   </w:style>
-  <w:style w:type="paragraph" w:styleId="IntenseQuote">
+  <w:style w:type="paragraph" w:styleId="af8">
     <w:name w:val="Intense Quote"/>
-    <w:basedOn w:val="Normal"/>
-    <w:next w:val="Normal"/>
-    <w:link w:val="IntenseQuoteChar"/>
+    <w:basedOn w:val="a1"/>
+    <w:next w:val="a1"/>
+    <w:link w:val="af9"/>
     <w:uiPriority w:val="30"/>
     <w:qFormat/>
     <w:rsid w:val="00FC693F"/>
@@ -4541,10 +4543,10 @@
       <w:color w:val="4F81BD" w:themeColor="accent1"/>
     </w:rPr>
   </w:style>
-  <w:style w:type="character" w:customStyle="1" w:styleId="IntenseQuoteChar">
-    <w:name w:val="Intense Quote Char"/>
-    <w:basedOn w:val="DefaultParagraphFont"/>
-    <w:link w:val="IntenseQuote"/>
+  <w:style w:type="character" w:customStyle="1" w:styleId="af9">
+    <w:name w:val="Выделенная цитата Знак"/>
+    <w:basedOn w:val="a2"/>
+    <w:link w:val="af8"/>
     <w:uiPriority w:val="30"/>
     <w:rsid w:val="00FC693F"/>
     <w:rPr>
@@ -4555,9 +4557,9 @@
       <w:color w:val="4F81BD" w:themeColor="accent1"/>
     </w:rPr>
   </w:style>
-  <w:style w:type="character" w:styleId="SubtleEmphasis">
+  <w:style w:type="character" w:styleId="afa">
     <w:name w:val="Subtle Emphasis"/>
-    <w:basedOn w:val="DefaultParagraphFont"/>
+    <w:basedOn w:val="a2"/>
     <w:uiPriority w:val="19"/>
     <w:qFormat/>
     <w:rsid w:val="00FC693F"/>
@@ -4567,9 +4569,9 @@
       <w:color w:val="808080" w:themeColor="text1" w:themeTint="7F"/>
     </w:rPr>
   </w:style>
-  <w:style w:type="character" w:styleId="IntenseEmphasis">
+  <w:style w:type="character" w:styleId="afb">
     <w:name w:val="Intense Emphasis"/>
-    <w:basedOn w:val="DefaultParagraphFont"/>
+    <w:basedOn w:val="a2"/>
     <w:uiPriority w:val="21"/>
     <w:qFormat/>
     <w:rsid w:val="00FC693F"/>
@@ -4581,9 +4583,9 @@
       <w:color w:val="4F81BD" w:themeColor="accent1"/>
     </w:rPr>
   </w:style>
-  <w:style w:type="character" w:styleId="SubtleReference">
+  <w:style w:type="character" w:styleId="afc">
     <w:name w:val="Subtle Reference"/>
-    <w:basedOn w:val="DefaultParagraphFont"/>
+    <w:basedOn w:val="a2"/>
     <w:uiPriority w:val="31"/>
     <w:qFormat/>
     <w:rsid w:val="00FC693F"/>
@@ -4593,9 +4595,9 @@
       <w:u w:val="single"/>
     </w:rPr>
   </w:style>
-  <w:style w:type="character" w:styleId="IntenseReference">
+  <w:style w:type="character" w:styleId="afd">
     <w:name w:val="Intense Reference"/>
-    <w:basedOn w:val="DefaultParagraphFont"/>
+    <w:basedOn w:val="a2"/>
     <w:uiPriority w:val="32"/>
     <w:qFormat/>
     <w:rsid w:val="00FC693F"/>
@@ -4608,9 +4610,9 @@
       <w:u w:val="single"/>
     </w:rPr>
   </w:style>
-  <w:style w:type="character" w:styleId="BookTitle">
+  <w:style w:type="character" w:styleId="afe">
     <w:name w:val="Book Title"/>
-    <w:basedOn w:val="DefaultParagraphFont"/>
+    <w:basedOn w:val="a2"/>
     <w:uiPriority w:val="33"/>
     <w:qFormat/>
     <w:rsid w:val="00FC693F"/>
@@ -4621,10 +4623,10 @@
       <w:spacing w:val="5"/>
     </w:rPr>
   </w:style>
-  <w:style w:type="paragraph" w:styleId="TOCHeading">
+  <w:style w:type="paragraph" w:styleId="aff">
     <w:name w:val="TOC Heading"/>
-    <w:basedOn w:val="Heading1"/>
-    <w:next w:val="Normal"/>
+    <w:basedOn w:val="1"/>
+    <w:next w:val="a1"/>
     <w:uiPriority w:val="39"/>
     <w:semiHidden/>
     <w:unhideWhenUsed/>
@@ -4634,9 +4636,9 @@
       <w:outlineLvl w:val="9"/>
     </w:pPr>
   </w:style>
-  <w:style w:type="table" w:styleId="TableGrid">
+  <w:style w:type="table" w:styleId="aff0">
     <w:name w:val="Table Grid"/>
-    <w:basedOn w:val="TableNormal"/>
+    <w:basedOn w:val="a3"/>
     <w:uiPriority w:val="59"/>
     <w:rsid w:val="00FC693F"/>
     <w:pPr>
@@ -4653,9 +4655,9 @@
       </w:tblBorders>
     </w:tblPr>
   </w:style>
-  <w:style w:type="table" w:styleId="LightShading">
+  <w:style w:type="table" w:styleId="aff1">
     <w:name w:val="Light Shading"/>
-    <w:basedOn w:val="TableNormal"/>
+    <w:basedOn w:val="a3"/>
     <w:uiPriority w:val="60"/>
     <w:rsid w:val="00FC693F"/>
     <w:pPr>
@@ -4749,9 +4751,9 @@
       </w:tcPr>
     </w:tblStylePr>
   </w:style>
-  <w:style w:type="table" w:styleId="LightShading-Accent1">
+  <w:style w:type="table" w:styleId="-1">
     <w:name w:val="Light Shading Accent 1"/>
-    <w:basedOn w:val="TableNormal"/>
+    <w:basedOn w:val="a3"/>
     <w:uiPriority w:val="60"/>
     <w:rsid w:val="00FC693F"/>
     <w:pPr>
@@ -4845,9 +4847,9 @@
       </w:tcPr>
     </w:tblStylePr>
   </w:style>
-  <w:style w:type="table" w:styleId="LightShading-Accent2">
+  <w:style w:type="table" w:styleId="-2">
     <w:name w:val="Light Shading Accent 2"/>
-    <w:basedOn w:val="TableNormal"/>
+    <w:basedOn w:val="a3"/>
     <w:uiPriority w:val="60"/>
     <w:rsid w:val="00FC693F"/>
     <w:pPr>
@@ -4941,9 +4943,9 @@
       </w:tcPr>
     </w:tblStylePr>
   </w:style>
-  <w:style w:type="table" w:styleId="LightShading-Accent3">
+  <w:style w:type="table" w:styleId="-3">
     <w:name w:val="Light Shading Accent 3"/>
-    <w:basedOn w:val="TableNormal"/>
+    <w:basedOn w:val="a3"/>
     <w:uiPriority w:val="60"/>
     <w:rsid w:val="00FC693F"/>
     <w:pPr>
@@ -5037,9 +5039,9 @@
       </w:tcPr>
     </w:tblStylePr>
   </w:style>
-  <w:style w:type="table" w:styleId="LightShading-Accent4">
+  <w:style w:type="table" w:styleId="-4">
     <w:name w:val="Light Shading Accent 4"/>
-    <w:basedOn w:val="TableNormal"/>
+    <w:basedOn w:val="a3"/>
     <w:uiPriority w:val="60"/>
     <w:rsid w:val="00FC693F"/>
     <w:pPr>
@@ -5133,9 +5135,9 @@
       </w:tcPr>
     </w:tblStylePr>
   </w:style>
-  <w:style w:type="table" w:styleId="LightShading-Accent5">
+  <w:style w:type="table" w:styleId="-5">
     <w:name w:val="Light Shading Accent 5"/>
-    <w:basedOn w:val="TableNormal"/>
+    <w:basedOn w:val="a3"/>
     <w:uiPriority w:val="60"/>
     <w:rsid w:val="00FC693F"/>
     <w:pPr>
@@ -5229,9 +5231,9 @@
       </w:tcPr>
     </w:tblStylePr>
   </w:style>
-  <w:style w:type="table" w:styleId="LightShading-Accent6">
+  <w:style w:type="table" w:styleId="-6">
     <w:name w:val="Light Shading Accent 6"/>
-    <w:basedOn w:val="TableNormal"/>
+    <w:basedOn w:val="a3"/>
     <w:uiPriority w:val="60"/>
     <w:rsid w:val="00FC693F"/>
     <w:pPr>
@@ -5325,9 +5327,9 @@
       </w:tcPr>
     </w:tblStylePr>
   </w:style>
-  <w:style w:type="table" w:styleId="LightList">
+  <w:style w:type="table" w:styleId="aff2">
     <w:name w:val="Light List"/>
-    <w:basedOn w:val="TableNormal"/>
+    <w:basedOn w:val="a3"/>
     <w:uiPriority w:val="61"/>
     <w:rsid w:val="00FC693F"/>
     <w:pPr>
@@ -5410,9 +5412,9 @@
       </w:tcPr>
     </w:tblStylePr>
   </w:style>
-  <w:style w:type="table" w:styleId="LightList-Accent1">
+  <w:style w:type="table" w:styleId="-10">
     <w:name w:val="Light List Accent 1"/>
-    <w:basedOn w:val="TableNormal"/>
+    <w:basedOn w:val="a3"/>
     <w:uiPriority w:val="61"/>
     <w:rsid w:val="00FC693F"/>
     <w:pPr>
@@ -5495,9 +5497,9 @@
       </w:tcPr>
     </w:tblStylePr>
   </w:style>
-  <w:style w:type="table" w:styleId="LightList-Accent2">
+  <w:style w:type="table" w:styleId="-20">
     <w:name w:val="Light List Accent 2"/>
-    <w:basedOn w:val="TableNormal"/>
+    <w:basedOn w:val="a3"/>
     <w:uiPriority w:val="61"/>
     <w:rsid w:val="00CB0664"/>
     <w:pPr>
@@ -5580,9 +5582,9 @@
       </w:tcPr>
     </w:tblStylePr>
   </w:style>
-  <w:style w:type="table" w:styleId="LightList-Accent3">
+  <w:style w:type="table" w:styleId="-30">
     <w:name w:val="Light List Accent 3"/>
-    <w:basedOn w:val="TableNormal"/>
+    <w:basedOn w:val="a3"/>
     <w:uiPriority w:val="61"/>
     <w:rsid w:val="00CB0664"/>
     <w:pPr>
@@ -5665,9 +5667,9 @@
       </w:tcPr>
     </w:tblStylePr>
   </w:style>
-  <w:style w:type="table" w:styleId="LightList-Accent4">
+  <w:style w:type="table" w:styleId="-40">
     <w:name w:val="Light List Accent 4"/>
-    <w:basedOn w:val="TableNormal"/>
+    <w:basedOn w:val="a3"/>
     <w:uiPriority w:val="61"/>
     <w:rsid w:val="00CB0664"/>
     <w:pPr>
@@ -5750,9 +5752,9 @@
       </w:tcPr>
     </w:tblStylePr>
   </w:style>
-  <w:style w:type="table" w:styleId="LightList-Accent5">
+  <w:style w:type="table" w:styleId="-50">
     <w:name w:val="Light List Accent 5"/>
-    <w:basedOn w:val="TableNormal"/>
+    <w:basedOn w:val="a3"/>
     <w:uiPriority w:val="61"/>
     <w:rsid w:val="00CB0664"/>
     <w:pPr>
@@ -5835,9 +5837,9 @@
       </w:tcPr>
     </w:tblStylePr>
   </w:style>
-  <w:style w:type="table" w:styleId="LightList-Accent6">
+  <w:style w:type="table" w:styleId="-60">
     <w:name w:val="Light List Accent 6"/>
-    <w:basedOn w:val="TableNormal"/>
+    <w:basedOn w:val="a3"/>
     <w:uiPriority w:val="61"/>
     <w:rsid w:val="00CB0664"/>
     <w:pPr>
@@ -5920,9 +5922,9 @@
       </w:tcPr>
     </w:tblStylePr>
   </w:style>
-  <w:style w:type="table" w:styleId="LightGrid">
+  <w:style w:type="table" w:styleId="aff3">
     <w:name w:val="Light Grid"/>
-    <w:basedOn w:val="TableNormal"/>
+    <w:basedOn w:val="a3"/>
     <w:uiPriority w:val="62"/>
     <w:rsid w:val="00CB0664"/>
     <w:pPr>
@@ -6043,9 +6045,9 @@
       </w:tcPr>
     </w:tblStylePr>
   </w:style>
-  <w:style w:type="table" w:styleId="LightGrid-Accent1">
+  <w:style w:type="table" w:styleId="-11">
     <w:name w:val="Light Grid Accent 1"/>
-    <w:basedOn w:val="TableNormal"/>
+    <w:basedOn w:val="a3"/>
     <w:uiPriority w:val="62"/>
     <w:rsid w:val="00CB0664"/>
     <w:pPr>
@@ -6166,9 +6168,9 @@
       </w:tcPr>
     </w:tblStylePr>
   </w:style>
-  <w:style w:type="table" w:styleId="LightGrid-Accent2">
+  <w:style w:type="table" w:styleId="-21">
     <w:name w:val="Light Grid Accent 2"/>
-    <w:basedOn w:val="TableNormal"/>
+    <w:basedOn w:val="a3"/>
     <w:uiPriority w:val="62"/>
     <w:rsid w:val="00CB0664"/>
     <w:pPr>
@@ -6289,9 +6291,9 @@
       </w:tcPr>
     </w:tblStylePr>
   </w:style>
-  <w:style w:type="table" w:styleId="LightGrid-Accent3">
+  <w:style w:type="table" w:styleId="-31">
     <w:name w:val="Light Grid Accent 3"/>
-    <w:basedOn w:val="TableNormal"/>
+    <w:basedOn w:val="a3"/>
     <w:uiPriority w:val="62"/>
     <w:rsid w:val="00CB0664"/>
     <w:pPr>
@@ -6412,9 +6414,9 @@
       </w:tcPr>
     </w:tblStylePr>
   </w:style>
-  <w:style w:type="table" w:styleId="LightGrid-Accent4">
+  <w:style w:type="table" w:styleId="-41">
     <w:name w:val="Light Grid Accent 4"/>
-    <w:basedOn w:val="TableNormal"/>
+    <w:basedOn w:val="a3"/>
     <w:uiPriority w:val="62"/>
     <w:rsid w:val="00CB0664"/>
     <w:pPr>
@@ -6535,9 +6537,9 @@
       </w:tcPr>
     </w:tblStylePr>
   </w:style>
-  <w:style w:type="table" w:styleId="LightGrid-Accent5">
+  <w:style w:type="table" w:styleId="-51">
     <w:name w:val="Light Grid Accent 5"/>
-    <w:basedOn w:val="TableNormal"/>
+    <w:basedOn w:val="a3"/>
     <w:uiPriority w:val="62"/>
     <w:rsid w:val="00CB0664"/>
     <w:pPr>
@@ -6658,9 +6660,9 @@
       </w:tcPr>
     </w:tblStylePr>
   </w:style>
-  <w:style w:type="table" w:styleId="LightGrid-Accent6">
+  <w:style w:type="table" w:styleId="-61">
     <w:name w:val="Light Grid Accent 6"/>
-    <w:basedOn w:val="TableNormal"/>
+    <w:basedOn w:val="a3"/>
     <w:uiPriority w:val="62"/>
     <w:rsid w:val="00CB0664"/>
     <w:pPr>
@@ -6781,9 +6783,9 @@
       </w:tcPr>
     </w:tblStylePr>
   </w:style>
-  <w:style w:type="table" w:styleId="MediumShading1">
+  <w:style w:type="table" w:styleId="11">
     <w:name w:val="Medium Shading 1"/>
-    <w:basedOn w:val="TableNormal"/>
+    <w:basedOn w:val="a3"/>
     <w:uiPriority w:val="63"/>
     <w:rsid w:val="00CB0664"/>
     <w:pPr>
@@ -6880,9 +6882,9 @@
       </w:tcPr>
     </w:tblStylePr>
   </w:style>
-  <w:style w:type="table" w:styleId="MediumShading1-Accent1">
+  <w:style w:type="table" w:styleId="1-1">
     <w:name w:val="Medium Shading 1 Accent 1"/>
-    <w:basedOn w:val="TableNormal"/>
+    <w:basedOn w:val="a3"/>
     <w:uiPriority w:val="63"/>
     <w:rsid w:val="00CB0664"/>
     <w:pPr>
@@ -6979,9 +6981,9 @@
       </w:tcPr>
     </w:tblStylePr>
   </w:style>
-  <w:style w:type="table" w:styleId="MediumShading1-Accent2">
+  <w:style w:type="table" w:styleId="1-2">
     <w:name w:val="Medium Shading 1 Accent 2"/>
-    <w:basedOn w:val="TableNormal"/>
+    <w:basedOn w:val="a3"/>
     <w:uiPriority w:val="63"/>
     <w:rsid w:val="00CB0664"/>
     <w:pPr>
@@ -7078,9 +7080,9 @@
       </w:tcPr>
     </w:tblStylePr>
   </w:style>
-  <w:style w:type="table" w:styleId="MediumShading1-Accent3">
+  <w:style w:type="table" w:styleId="1-3">
     <w:name w:val="Medium Shading 1 Accent 3"/>
-    <w:basedOn w:val="TableNormal"/>
+    <w:basedOn w:val="a3"/>
     <w:uiPriority w:val="63"/>
     <w:rsid w:val="00CB0664"/>
     <w:pPr>
@@ -7177,9 +7179,9 @@
       </w:tcPr>
     </w:tblStylePr>
   </w:style>
-  <w:style w:type="table" w:styleId="MediumShading1-Accent4">
+  <w:style w:type="table" w:styleId="1-4">
     <w:name w:val="Medium Shading 1 Accent 4"/>
-    <w:basedOn w:val="TableNormal"/>
+    <w:basedOn w:val="a3"/>
     <w:uiPriority w:val="63"/>
     <w:rsid w:val="00CB0664"/>
     <w:pPr>
@@ -7276,9 +7278,9 @@
       </w:tcPr>
     </w:tblStylePr>
   </w:style>
-  <w:style w:type="table" w:styleId="MediumShading1-Accent5">
+  <w:style w:type="table" w:styleId="1-5">
     <w:name w:val="Medium Shading 1 Accent 5"/>
-    <w:basedOn w:val="TableNormal"/>
+    <w:basedOn w:val="a3"/>
     <w:uiPriority w:val="63"/>
     <w:rsid w:val="00CB0664"/>
     <w:pPr>
@@ -7375,9 +7377,9 @@
       </w:tcPr>
     </w:tblStylePr>
   </w:style>
-  <w:style w:type="table" w:styleId="MediumShading1-Accent6">
+  <w:style w:type="table" w:styleId="1-6">
     <w:name w:val="Medium Shading 1 Accent 6"/>
-    <w:basedOn w:val="TableNormal"/>
+    <w:basedOn w:val="a3"/>
     <w:uiPriority w:val="63"/>
     <w:rsid w:val="00CB0664"/>
     <w:pPr>
@@ -7474,9 +7476,9 @@
       </w:tcPr>
     </w:tblStylePr>
   </w:style>
-  <w:style w:type="table" w:styleId="MediumShading2">
+  <w:style w:type="table" w:styleId="29">
     <w:name w:val="Medium Shading 2"/>
-    <w:basedOn w:val="TableNormal"/>
+    <w:basedOn w:val="a3"/>
     <w:uiPriority w:val="64"/>
     <w:rsid w:val="00CB0664"/>
     <w:pPr>
@@ -7616,9 +7618,9 @@
       </w:tcPr>
     </w:tblStylePr>
   </w:style>
-  <w:style w:type="table" w:styleId="MediumShading2-Accent1">
+  <w:style w:type="table" w:styleId="2-1">
     <w:name w:val="Medium Shading 2 Accent 1"/>
-    <w:basedOn w:val="TableNormal"/>
+    <w:basedOn w:val="a3"/>
     <w:uiPriority w:val="64"/>
     <w:rsid w:val="00CB0664"/>
     <w:pPr>
@@ -7758,9 +7760,9 @@
       </w:tcPr>
     </w:tblStylePr>
   </w:style>
-  <w:style w:type="table" w:styleId="MediumShading2-Accent2">
+  <w:style w:type="table" w:styleId="2-2">
     <w:name w:val="Medium Shading 2 Accent 2"/>
-    <w:basedOn w:val="TableNormal"/>
+    <w:basedOn w:val="a3"/>
     <w:uiPriority w:val="64"/>
     <w:rsid w:val="00CB0664"/>
     <w:pPr>
@@ -7900,9 +7902,9 @@
       </w:tcPr>
     </w:tblStylePr>
   </w:style>
-  <w:style w:type="table" w:styleId="MediumShading2-Accent3">
+  <w:style w:type="table" w:styleId="2-3">
     <w:name w:val="Medium Shading 2 Accent 3"/>
-    <w:basedOn w:val="TableNormal"/>
+    <w:basedOn w:val="a3"/>
     <w:uiPriority w:val="64"/>
     <w:rsid w:val="00CB0664"/>
     <w:pPr>
@@ -8042,9 +8044,9 @@
       </w:tcPr>
     </w:tblStylePr>
   </w:style>
-  <w:style w:type="table" w:styleId="MediumShading2-Accent4">
+  <w:style w:type="table" w:styleId="2-4">
     <w:name w:val="Medium Shading 2 Accent 4"/>
-    <w:basedOn w:val="TableNormal"/>
+    <w:basedOn w:val="a3"/>
     <w:uiPriority w:val="64"/>
     <w:rsid w:val="00CB0664"/>
     <w:pPr>
@@ -8184,9 +8186,9 @@
       </w:tcPr>
     </w:tblStylePr>
   </w:style>
-  <w:style w:type="table" w:styleId="MediumShading2-Accent5">
+  <w:style w:type="table" w:styleId="2-5">
     <w:name w:val="Medium Shading 2 Accent 5"/>
-    <w:basedOn w:val="TableNormal"/>
+    <w:basedOn w:val="a3"/>
     <w:uiPriority w:val="64"/>
     <w:rsid w:val="00CB0664"/>
     <w:pPr>
@@ -8326,9 +8328,9 @@
       </w:tcPr>
     </w:tblStylePr>
   </w:style>
-  <w:style w:type="table" w:styleId="MediumShading2-Accent6">
+  <w:style w:type="table" w:styleId="2-6">
     <w:name w:val="Medium Shading 2 Accent 6"/>
-    <w:basedOn w:val="TableNormal"/>
+    <w:basedOn w:val="a3"/>
     <w:uiPriority w:val="64"/>
     <w:rsid w:val="00CB0664"/>
     <w:pPr>
@@ -8468,9 +8470,9 @@
       </w:tcPr>
     </w:tblStylePr>
   </w:style>
-  <w:style w:type="table" w:styleId="MediumList1">
+  <w:style w:type="table" w:styleId="12">
     <w:name w:val="Medium List 1"/>
-    <w:basedOn w:val="TableNormal"/>
+    <w:basedOn w:val="a3"/>
     <w:uiPriority w:val="65"/>
     <w:rsid w:val="00CB0664"/>
     <w:pPr>
@@ -8545,9 +8547,9 @@
       </w:tcPr>
     </w:tblStylePr>
   </w:style>
-  <w:style w:type="table" w:styleId="MediumList1-Accent1">
+  <w:style w:type="table" w:styleId="1-10">
     <w:name w:val="Medium List 1 Accent 1"/>
-    <w:basedOn w:val="TableNormal"/>
+    <w:basedOn w:val="a3"/>
     <w:uiPriority w:val="65"/>
     <w:rsid w:val="00CB0664"/>
     <w:pPr>
@@ -8622,9 +8624,9 @@
       </w:tcPr>
     </w:tblStylePr>
   </w:style>
-  <w:style w:type="table" w:styleId="MediumList1-Accent2">
+  <w:style w:type="table" w:styleId="1-20">
     <w:name w:val="Medium List 1 Accent 2"/>
-    <w:basedOn w:val="TableNormal"/>
+    <w:basedOn w:val="a3"/>
     <w:uiPriority w:val="65"/>
     <w:rsid w:val="00CB0664"/>
     <w:pPr>
@@ -8699,9 +8701,9 @@
       </w:tcPr>
     </w:tblStylePr>
   </w:style>
-  <w:style w:type="table" w:styleId="MediumList1-Accent3">
+  <w:style w:type="table" w:styleId="1-30">
     <w:name w:val="Medium List 1 Accent 3"/>
-    <w:basedOn w:val="TableNormal"/>
+    <w:basedOn w:val="a3"/>
     <w:uiPriority w:val="65"/>
     <w:rsid w:val="00CB0664"/>
     <w:pPr>
@@ -8776,9 +8778,9 @@
       </w:tcPr>
     </w:tblStylePr>
   </w:style>
-  <w:style w:type="table" w:styleId="MediumList1-Accent4">
+  <w:style w:type="table" w:styleId="1-40">
     <w:name w:val="Medium List 1 Accent 4"/>
-    <w:basedOn w:val="TableNormal"/>
+    <w:basedOn w:val="a3"/>
     <w:uiPriority w:val="65"/>
     <w:rsid w:val="00CB0664"/>
     <w:pPr>
@@ -8853,9 +8855,9 @@
       </w:tcPr>
     </w:tblStylePr>
   </w:style>
-  <w:style w:type="table" w:styleId="MediumList1-Accent5">
+  <w:style w:type="table" w:styleId="1-50">
     <w:name w:val="Medium List 1 Accent 5"/>
-    <w:basedOn w:val="TableNormal"/>
+    <w:basedOn w:val="a3"/>
     <w:uiPriority w:val="65"/>
     <w:rsid w:val="00CB0664"/>
     <w:pPr>
@@ -8930,9 +8932,9 @@
       </w:tcPr>
     </w:tblStylePr>
   </w:style>
-  <w:style w:type="table" w:styleId="MediumList1-Accent6">
+  <w:style w:type="table" w:styleId="1-60">
     <w:name w:val="Medium List 1 Accent 6"/>
-    <w:basedOn w:val="TableNormal"/>
+    <w:basedOn w:val="a3"/>
     <w:uiPriority w:val="65"/>
     <w:rsid w:val="00CB0664"/>
     <w:pPr>
@@ -9007,9 +9009,9 @@
       </w:tcPr>
     </w:tblStylePr>
   </w:style>
-  <w:style w:type="table" w:styleId="MediumList2">
+  <w:style w:type="table" w:styleId="2a">
     <w:name w:val="Medium List 2"/>
-    <w:basedOn w:val="TableNormal"/>
+    <w:basedOn w:val="a3"/>
     <w:uiPriority w:val="66"/>
     <w:rsid w:val="00CB0664"/>
     <w:pPr>
@@ -9128,9 +9130,9 @@
       </w:tcPr>
     </w:tblStylePr>
   </w:style>
-  <w:style w:type="table" w:styleId="MediumList2-Accent1">
+  <w:style w:type="table" w:styleId="2-10">
     <w:name w:val="Medium List 2 Accent 1"/>
-    <w:basedOn w:val="TableNormal"/>
+    <w:basedOn w:val="a3"/>
     <w:uiPriority w:val="66"/>
     <w:rsid w:val="00CB0664"/>
     <w:pPr>
@@ -9249,9 +9251,9 @@
       </w:tcPr>
     </w:tblStylePr>
   </w:style>
-  <w:style w:type="table" w:styleId="MediumList2-Accent2">
+  <w:style w:type="table" w:styleId="2-20">
     <w:name w:val="Medium List 2 Accent 2"/>
-    <w:basedOn w:val="TableNormal"/>
+    <w:basedOn w:val="a3"/>
     <w:uiPriority w:val="66"/>
     <w:rsid w:val="00CB0664"/>
     <w:pPr>
@@ -9370,9 +9372,9 @@
       </w:tcPr>
     </w:tblStylePr>
   </w:style>
-  <w:style w:type="table" w:styleId="MediumList2-Accent3">
+  <w:style w:type="table" w:styleId="2-30">
     <w:name w:val="Medium List 2 Accent 3"/>
-    <w:basedOn w:val="TableNormal"/>
+    <w:basedOn w:val="a3"/>
     <w:uiPriority w:val="66"/>
     <w:rsid w:val="00CB0664"/>
     <w:pPr>
@@ -9491,9 +9493,9 @@
       </w:tcPr>
     </w:tblStylePr>
   </w:style>
-  <w:style w:type="table" w:styleId="MediumList2-Accent4">
+  <w:style w:type="table" w:styleId="2-40">
     <w:name w:val="Medium List 2 Accent 4"/>
-    <w:basedOn w:val="TableNormal"/>
+    <w:basedOn w:val="a3"/>
     <w:uiPriority w:val="66"/>
     <w:rsid w:val="00CB0664"/>
     <w:pPr>
@@ -9612,9 +9614,9 @@
       </w:tcPr>
     </w:tblStylePr>
   </w:style>
-  <w:style w:type="table" w:styleId="MediumList2-Accent5">
+  <w:style w:type="table" w:styleId="2-50">
     <w:name w:val="Medium List 2 Accent 5"/>
-    <w:basedOn w:val="TableNormal"/>
+    <w:basedOn w:val="a3"/>
     <w:uiPriority w:val="66"/>
     <w:rsid w:val="00CB0664"/>
     <w:pPr>
@@ -9733,9 +9735,9 @@
       </w:tcPr>
     </w:tblStylePr>
   </w:style>
-  <w:style w:type="table" w:styleId="MediumList2-Accent6">
+  <w:style w:type="table" w:styleId="2-60">
     <w:name w:val="Medium List 2 Accent 6"/>
-    <w:basedOn w:val="TableNormal"/>
+    <w:basedOn w:val="a3"/>
     <w:uiPriority w:val="66"/>
     <w:rsid w:val="00CB0664"/>
     <w:pPr>
@@ -9854,9 +9856,9 @@
       </w:tcPr>
     </w:tblStylePr>
   </w:style>
-  <w:style w:type="table" w:styleId="MediumGrid1">
+  <w:style w:type="table" w:styleId="13">
     <w:name w:val="Medium Grid 1"/>
-    <w:basedOn w:val="TableNormal"/>
+    <w:basedOn w:val="a3"/>
     <w:uiPriority w:val="67"/>
     <w:rsid w:val="00CB0664"/>
     <w:pPr>
@@ -9920,9 +9922,9 @@
       </w:tcPr>
     </w:tblStylePr>
   </w:style>
-  <w:style w:type="table" w:styleId="MediumGrid1-Accent1">
+  <w:style w:type="table" w:styleId="1-11">
     <w:name w:val="Medium Grid 1 Accent 1"/>
-    <w:basedOn w:val="TableNormal"/>
+    <w:basedOn w:val="a3"/>
     <w:uiPriority w:val="67"/>
     <w:rsid w:val="00CB0664"/>
     <w:pPr>
@@ -9986,9 +9988,9 @@
       </w:tcPr>
     </w:tblStylePr>
   </w:style>
-  <w:style w:type="table" w:styleId="MediumGrid1-Accent2">
+  <w:style w:type="table" w:styleId="1-21">
     <w:name w:val="Medium Grid 1 Accent 2"/>
-    <w:basedOn w:val="TableNormal"/>
+    <w:basedOn w:val="a3"/>
     <w:uiPriority w:val="67"/>
     <w:rsid w:val="00CB0664"/>
     <w:pPr>
@@ -10052,9 +10054,9 @@
       </w:tcPr>
     </w:tblStylePr>
   </w:style>
-  <w:style w:type="table" w:styleId="MediumGrid1-Accent3">
+  <w:style w:type="table" w:styleId="1-31">
     <w:name w:val="Medium Grid 1 Accent 3"/>
-    <w:basedOn w:val="TableNormal"/>
+    <w:basedOn w:val="a3"/>
     <w:uiPriority w:val="67"/>
     <w:rsid w:val="00CB0664"/>
     <w:pPr>
@@ -10118,9 +10120,9 @@
       </w:tcPr>
     </w:tblStylePr>
   </w:style>
-  <w:style w:type="table" w:styleId="MediumGrid1-Accent4">
+  <w:style w:type="table" w:styleId="1-41">
     <w:name w:val="Medium Grid 1 Accent 4"/>
-    <w:basedOn w:val="TableNormal"/>
+    <w:basedOn w:val="a3"/>
     <w:uiPriority w:val="67"/>
     <w:rsid w:val="00CB0664"/>
     <w:pPr>
@@ -10184,9 +10186,9 @@
       </w:tcPr>
     </w:tblStylePr>
   </w:style>
-  <w:style w:type="table" w:styleId="MediumGrid1-Accent5">
+  <w:style w:type="table" w:styleId="1-51">
     <w:name w:val="Medium Grid 1 Accent 5"/>
-    <w:basedOn w:val="TableNormal"/>
+    <w:basedOn w:val="a3"/>
     <w:uiPriority w:val="67"/>
     <w:rsid w:val="00CB0664"/>
     <w:pPr>
@@ -10250,9 +10252,9 @@
       </w:tcPr>
     </w:tblStylePr>
   </w:style>
-  <w:style w:type="table" w:styleId="MediumGrid1-Accent6">
+  <w:style w:type="table" w:styleId="1-61">
     <w:name w:val="Medium Grid 1 Accent 6"/>
-    <w:basedOn w:val="TableNormal"/>
+    <w:basedOn w:val="a3"/>
     <w:uiPriority w:val="67"/>
     <w:rsid w:val="00CB0664"/>
     <w:pPr>
@@ -10316,9 +10318,9 @@
       </w:tcPr>
     </w:tblStylePr>
   </w:style>
-  <w:style w:type="table" w:styleId="MediumGrid2">
+  <w:style w:type="table" w:styleId="2b">
     <w:name w:val="Medium Grid 2"/>
-    <w:basedOn w:val="TableNormal"/>
+    <w:basedOn w:val="a3"/>
     <w:uiPriority w:val="68"/>
     <w:rsid w:val="00CB0664"/>
     <w:pPr>
@@ -10434,9 +10436,9 @@
       </w:tcPr>
     </w:tblStylePr>
   </w:style>
-  <w:style w:type="table" w:styleId="MediumGrid2-Accent1">
+  <w:style w:type="table" w:styleId="2-11">
     <w:name w:val="Medium Grid 2 Accent 1"/>
-    <w:basedOn w:val="TableNormal"/>
+    <w:basedOn w:val="a3"/>
     <w:uiPriority w:val="68"/>
     <w:rsid w:val="00CB0664"/>
     <w:pPr>
@@ -10552,9 +10554,9 @@
       </w:tcPr>
     </w:tblStylePr>
   </w:style>
-  <w:style w:type="table" w:styleId="MediumGrid2-Accent2">
+  <w:style w:type="table" w:styleId="2-21">
     <w:name w:val="Medium Grid 2 Accent 2"/>
-    <w:basedOn w:val="TableNormal"/>
+    <w:basedOn w:val="a3"/>
     <w:uiPriority w:val="68"/>
     <w:rsid w:val="00CB0664"/>
     <w:pPr>
@@ -10670,9 +10672,9 @@
       </w:tcPr>
     </w:tblStylePr>
   </w:style>
-  <w:style w:type="table" w:styleId="MediumGrid2-Accent3">
+  <w:style w:type="table" w:styleId="2-31">
     <w:name w:val="Medium Grid 2 Accent 3"/>
-    <w:basedOn w:val="TableNormal"/>
+    <w:basedOn w:val="a3"/>
     <w:uiPriority w:val="68"/>
     <w:rsid w:val="00CB0664"/>
     <w:pPr>
@@ -10788,9 +10790,9 @@
       </w:tcPr>
     </w:tblStylePr>
   </w:style>
-  <w:style w:type="table" w:styleId="MediumGrid2-Accent4">
+  <w:style w:type="table" w:styleId="2-41">
     <w:name w:val="Medium Grid 2 Accent 4"/>
-    <w:basedOn w:val="TableNormal"/>
+    <w:basedOn w:val="a3"/>
     <w:uiPriority w:val="68"/>
     <w:rsid w:val="00CB0664"/>
     <w:pPr>
@@ -10906,9 +10908,9 @@
       </w:tcPr>
     </w:tblStylePr>
   </w:style>
-  <w:style w:type="table" w:styleId="MediumGrid2-Accent5">
+  <w:style w:type="table" w:styleId="2-51">
     <w:name w:val="Medium Grid 2 Accent 5"/>
-    <w:basedOn w:val="TableNormal"/>
+    <w:basedOn w:val="a3"/>
     <w:uiPriority w:val="68"/>
     <w:rsid w:val="00CB0664"/>
     <w:pPr>
@@ -11024,9 +11026,9 @@
       </w:tcPr>
     </w:tblStylePr>
   </w:style>
-  <w:style w:type="table" w:styleId="MediumGrid2-Accent6">
+  <w:style w:type="table" w:styleId="2-61">
     <w:name w:val="Medium Grid 2 Accent 6"/>
-    <w:basedOn w:val="TableNormal"/>
+    <w:basedOn w:val="a3"/>
     <w:uiPriority w:val="68"/>
     <w:rsid w:val="00CB0664"/>
     <w:pPr>
@@ -11142,9 +11144,9 @@
       </w:tcPr>
     </w:tblStylePr>
   </w:style>
-  <w:style w:type="table" w:styleId="MediumGrid3">
+  <w:style w:type="table" w:styleId="37">
     <w:name w:val="Medium Grid 3"/>
-    <w:basedOn w:val="TableNormal"/>
+    <w:basedOn w:val="a3"/>
     <w:uiPriority w:val="69"/>
     <w:rsid w:val="00CB0664"/>
     <w:pPr>
@@ -11276,9 +11278,9 @@
       </w:tcPr>
     </w:tblStylePr>
   </w:style>
-  <w:style w:type="table" w:styleId="MediumGrid3-Accent1">
+  <w:style w:type="table" w:styleId="3-1">
     <w:name w:val="Medium Grid 3 Accent 1"/>
-    <w:basedOn w:val="TableNormal"/>
+    <w:basedOn w:val="a3"/>
     <w:uiPriority w:val="69"/>
     <w:rsid w:val="00CB0664"/>
     <w:pPr>
@@ -11410,9 +11412,9 @@
       </w:tcPr>
     </w:tblStylePr>
   </w:style>
-  <w:style w:type="table" w:styleId="MediumGrid3-Accent2">
+  <w:style w:type="table" w:styleId="3-2">
     <w:name w:val="Medium Grid 3 Accent 2"/>
-    <w:basedOn w:val="TableNormal"/>
+    <w:basedOn w:val="a3"/>
     <w:uiPriority w:val="69"/>
     <w:rsid w:val="00CB0664"/>
     <w:pPr>
@@ -11544,9 +11546,9 @@
       </w:tcPr>
     </w:tblStylePr>
   </w:style>
-  <w:style w:type="table" w:styleId="MediumGrid3-Accent3">
+  <w:style w:type="table" w:styleId="3-3">
     <w:name w:val="Medium Grid 3 Accent 3"/>
-    <w:basedOn w:val="TableNormal"/>
+    <w:basedOn w:val="a3"/>
     <w:uiPriority w:val="69"/>
     <w:rsid w:val="00CB0664"/>
     <w:pPr>
@@ -11678,9 +11680,9 @@
       </w:tcPr>
     </w:tblStylePr>
   </w:style>
-  <w:style w:type="table" w:styleId="MediumGrid3-Accent4">
+  <w:style w:type="table" w:styleId="3-4">
     <w:name w:val="Medium Grid 3 Accent 4"/>
-    <w:basedOn w:val="TableNormal"/>
+    <w:basedOn w:val="a3"/>
     <w:uiPriority w:val="69"/>
     <w:rsid w:val="00CB0664"/>
     <w:pPr>
@@ -11812,9 +11814,9 @@
       </w:tcPr>
     </w:tblStylePr>
   </w:style>
-  <w:style w:type="table" w:styleId="MediumGrid3-Accent5">
+  <w:style w:type="table" w:styleId="3-5">
     <w:name w:val="Medium Grid 3 Accent 5"/>
-    <w:basedOn w:val="TableNormal"/>
+    <w:basedOn w:val="a3"/>
     <w:uiPriority w:val="69"/>
     <w:rsid w:val="00CB0664"/>
     <w:pPr>
@@ -11946,9 +11948,9 @@
       </w:tcPr>
     </w:tblStylePr>
   </w:style>
-  <w:style w:type="table" w:styleId="MediumGrid3-Accent6">
+  <w:style w:type="table" w:styleId="3-6">
     <w:name w:val="Medium Grid 3 Accent 6"/>
-    <w:basedOn w:val="TableNormal"/>
+    <w:basedOn w:val="a3"/>
     <w:uiPriority w:val="69"/>
     <w:rsid w:val="00CB0664"/>
     <w:pPr>
@@ -12080,9 +12082,9 @@
       </w:tcPr>
     </w:tblStylePr>
   </w:style>
-  <w:style w:type="table" w:styleId="DarkList">
+  <w:style w:type="table" w:styleId="aff4">
     <w:name w:val="Dark List"/>
-    <w:basedOn w:val="TableNormal"/>
+    <w:basedOn w:val="a3"/>
     <w:uiPriority w:val="70"/>
     <w:rsid w:val="00CB0664"/>
     <w:pPr>
@@ -12187,9 +12189,9 @@
       </w:tcPr>
     </w:tblStylePr>
   </w:style>
-  <w:style w:type="table" w:styleId="DarkList-Accent1">
+  <w:style w:type="table" w:styleId="-12">
     <w:name w:val="Dark List Accent 1"/>
-    <w:basedOn w:val="TableNormal"/>
+    <w:basedOn w:val="a3"/>
     <w:uiPriority w:val="70"/>
     <w:rsid w:val="00CB0664"/>
     <w:pPr>
@@ -12294,9 +12296,9 @@
       </w:tcPr>
     </w:tblStylePr>
   </w:style>
-  <w:style w:type="table" w:styleId="DarkList-Accent2">
+  <w:style w:type="table" w:styleId="-22">
     <w:name w:val="Dark List Accent 2"/>
-    <w:basedOn w:val="TableNormal"/>
+    <w:basedOn w:val="a3"/>
     <w:uiPriority w:val="70"/>
     <w:rsid w:val="00CB0664"/>
     <w:pPr>
@@ -12401,9 +12403,9 @@
       </w:tcPr>
     </w:tblStylePr>
   </w:style>
-  <w:style w:type="table" w:styleId="DarkList-Accent3">
+  <w:style w:type="table" w:styleId="-32">
     <w:name w:val="Dark List Accent 3"/>
-    <w:basedOn w:val="TableNormal"/>
+    <w:basedOn w:val="a3"/>
     <w:uiPriority w:val="70"/>
     <w:rsid w:val="00CB0664"/>
     <w:pPr>
@@ -12508,9 +12510,9 @@
       </w:tcPr>
     </w:tblStylePr>
   </w:style>
-  <w:style w:type="table" w:styleId="DarkList-Accent4">
+  <w:style w:type="table" w:styleId="-42">
     <w:name w:val="Dark List Accent 4"/>
-    <w:basedOn w:val="TableNormal"/>
+    <w:basedOn w:val="a3"/>
     <w:uiPriority w:val="70"/>
     <w:rsid w:val="00CB0664"/>
     <w:pPr>
@@ -12615,9 +12617,9 @@
       </w:tcPr>
     </w:tblStylePr>
   </w:style>
-  <w:style w:type="table" w:styleId="DarkList-Accent5">
+  <w:style w:type="table" w:styleId="-52">
     <w:name w:val="Dark List Accent 5"/>
-    <w:basedOn w:val="TableNormal"/>
+    <w:basedOn w:val="a3"/>
     <w:uiPriority w:val="70"/>
     <w:rsid w:val="00CB0664"/>
     <w:pPr>
@@ -12722,9 +12724,9 @@
       </w:tcPr>
     </w:tblStylePr>
   </w:style>
-  <w:style w:type="table" w:styleId="DarkList-Accent6">
+  <w:style w:type="table" w:styleId="-62">
     <w:name w:val="Dark List Accent 6"/>
-    <w:basedOn w:val="TableNormal"/>
+    <w:basedOn w:val="a3"/>
     <w:uiPriority w:val="70"/>
     <w:rsid w:val="00CB0664"/>
     <w:pPr>
@@ -12829,9 +12831,9 @@
       </w:tcPr>
     </w:tblStylePr>
   </w:style>
-  <w:style w:type="table" w:styleId="ColorfulShading">
+  <w:style w:type="table" w:styleId="aff5">
     <w:name w:val="Colorful Shading"/>
-    <w:basedOn w:val="TableNormal"/>
+    <w:basedOn w:val="a3"/>
     <w:uiPriority w:val="71"/>
     <w:rsid w:val="00CB0664"/>
     <w:pPr>
@@ -12944,9 +12946,9 @@
       </w:rPr>
     </w:tblStylePr>
   </w:style>
-  <w:style w:type="table" w:styleId="ColorfulShading-Accent1">
+  <w:style w:type="table" w:styleId="-13">
     <w:name w:val="Colorful Shading Accent 1"/>
-    <w:basedOn w:val="TableNormal"/>
+    <w:basedOn w:val="a3"/>
     <w:uiPriority w:val="71"/>
     <w:rsid w:val="00CB0664"/>
     <w:pPr>
@@ -13059,9 +13061,9 @@
       </w:rPr>
     </w:tblStylePr>
   </w:style>
-  <w:style w:type="table" w:styleId="ColorfulShading-Accent2">
+  <w:style w:type="table" w:styleId="-23">
     <w:name w:val="Colorful Shading Accent 2"/>
-    <w:basedOn w:val="TableNormal"/>
+    <w:basedOn w:val="a3"/>
     <w:uiPriority w:val="71"/>
     <w:rsid w:val="00CB0664"/>
     <w:pPr>
@@ -13174,9 +13176,9 @@
       </w:rPr>
     </w:tblStylePr>
   </w:style>
-  <w:style w:type="table" w:styleId="ColorfulShading-Accent3">
+  <w:style w:type="table" w:styleId="-33">
     <w:name w:val="Colorful Shading Accent 3"/>
-    <w:basedOn w:val="TableNormal"/>
+    <w:basedOn w:val="a3"/>
     <w:uiPriority w:val="71"/>
     <w:rsid w:val="00CB0664"/>
     <w:pPr>
@@ -13279,9 +13281,9 @@
       </w:tcPr>
     </w:tblStylePr>
   </w:style>
-  <w:style w:type="table" w:styleId="ColorfulShading-Accent4">
+  <w:style w:type="table" w:styleId="-43">
     <w:name w:val="Colorful Shading Accent 4"/>
-    <w:basedOn w:val="TableNormal"/>
+    <w:basedOn w:val="a3"/>
     <w:uiPriority w:val="71"/>
     <w:rsid w:val="00CB0664"/>
     <w:pPr>
@@ -13394,9 +13396,9 @@
       </w:rPr>
     </w:tblStylePr>
   </w:style>
-  <w:style w:type="table" w:styleId="ColorfulShading-Accent5">
+  <w:style w:type="table" w:styleId="-53">
     <w:name w:val="Colorful Shading Accent 5"/>
-    <w:basedOn w:val="TableNormal"/>
+    <w:basedOn w:val="a3"/>
     <w:uiPriority w:val="71"/>
     <w:rsid w:val="00CB0664"/>
     <w:pPr>
@@ -13509,9 +13511,9 @@
       </w:rPr>
     </w:tblStylePr>
   </w:style>
-  <w:style w:type="table" w:styleId="ColorfulShading-Accent6">
+  <w:style w:type="table" w:styleId="-63">
     <w:name w:val="Colorful Shading Accent 6"/>
-    <w:basedOn w:val="TableNormal"/>
+    <w:basedOn w:val="a3"/>
     <w:uiPriority w:val="71"/>
     <w:rsid w:val="00CB0664"/>
     <w:pPr>
@@ -13624,9 +13626,9 @@
       </w:rPr>
     </w:tblStylePr>
   </w:style>
-  <w:style w:type="table" w:styleId="ColorfulList">
+  <w:style w:type="table" w:styleId="aff6">
     <w:name w:val="Colorful List"/>
-    <w:basedOn w:val="TableNormal"/>
+    <w:basedOn w:val="a3"/>
     <w:uiPriority w:val="72"/>
     <w:rsid w:val="00CB0664"/>
     <w:pPr>
@@ -13703,9 +13705,9 @@
       </w:tcPr>
     </w:tblStylePr>
   </w:style>
-  <w:style w:type="table" w:styleId="ColorfulList-Accent1">
+  <w:style w:type="table" w:styleId="-14">
     <w:name w:val="Colorful List Accent 1"/>
-    <w:basedOn w:val="TableNormal"/>
+    <w:basedOn w:val="a3"/>
     <w:uiPriority w:val="72"/>
     <w:rsid w:val="00CB0664"/>
     <w:pPr>
@@ -13782,9 +13784,9 @@
       </w:tcPr>
     </w:tblStylePr>
   </w:style>
-  <w:style w:type="table" w:styleId="ColorfulList-Accent2">
+  <w:style w:type="table" w:styleId="-24">
     <w:name w:val="Colorful List Accent 2"/>
-    <w:basedOn w:val="TableNormal"/>
+    <w:basedOn w:val="a3"/>
     <w:uiPriority w:val="72"/>
     <w:rsid w:val="00CB0664"/>
     <w:pPr>
@@ -13861,9 +13863,9 @@
       </w:tcPr>
     </w:tblStylePr>
   </w:style>
-  <w:style w:type="table" w:styleId="ColorfulList-Accent3">
+  <w:style w:type="table" w:styleId="-34">
     <w:name w:val="Colorful List Accent 3"/>
-    <w:basedOn w:val="TableNormal"/>
+    <w:basedOn w:val="a3"/>
     <w:uiPriority w:val="72"/>
     <w:rsid w:val="00CB0664"/>
     <w:pPr>
@@ -13940,9 +13942,9 @@
       </w:tcPr>
     </w:tblStylePr>
   </w:style>
-  <w:style w:type="table" w:styleId="ColorfulList-Accent4">
+  <w:style w:type="table" w:styleId="-44">
     <w:name w:val="Colorful List Accent 4"/>
-    <w:basedOn w:val="TableNormal"/>
+    <w:basedOn w:val="a3"/>
     <w:uiPriority w:val="72"/>
     <w:rsid w:val="00CB0664"/>
     <w:pPr>
@@ -14019,9 +14021,9 @@
       </w:tcPr>
     </w:tblStylePr>
   </w:style>
-  <w:style w:type="table" w:styleId="ColorfulList-Accent5">
+  <w:style w:type="table" w:styleId="-54">
     <w:name w:val="Colorful List Accent 5"/>
-    <w:basedOn w:val="TableNormal"/>
+    <w:basedOn w:val="a3"/>
     <w:uiPriority w:val="72"/>
     <w:rsid w:val="00CB0664"/>
     <w:pPr>
@@ -14098,9 +14100,9 @@
       </w:tcPr>
     </w:tblStylePr>
   </w:style>
-  <w:style w:type="table" w:styleId="ColorfulList-Accent6">
+  <w:style w:type="table" w:styleId="-64">
     <w:name w:val="Colorful List Accent 6"/>
-    <w:basedOn w:val="TableNormal"/>
+    <w:basedOn w:val="a3"/>
     <w:uiPriority w:val="72"/>
     <w:rsid w:val="00CB0664"/>
     <w:pPr>
@@ -14177,9 +14179,9 @@
       </w:tcPr>
     </w:tblStylePr>
   </w:style>
-  <w:style w:type="table" w:styleId="ColorfulGrid">
+  <w:style w:type="table" w:styleId="aff7">
     <w:name w:val="Colorful Grid"/>
-    <w:basedOn w:val="TableNormal"/>
+    <w:basedOn w:val="a3"/>
     <w:uiPriority w:val="73"/>
     <w:rsid w:val="00CB0664"/>
     <w:pPr>
@@ -14250,9 +14252,9 @@
       </w:tcPr>
     </w:tblStylePr>
   </w:style>
-  <w:style w:type="table" w:styleId="ColorfulGrid-Accent1">
+  <w:style w:type="table" w:styleId="-15">
     <w:name w:val="Colorful Grid Accent 1"/>
-    <w:basedOn w:val="TableNormal"/>
+    <w:basedOn w:val="a3"/>
     <w:uiPriority w:val="73"/>
     <w:rsid w:val="00CB0664"/>
     <w:pPr>
@@ -14323,9 +14325,9 @@
       </w:tcPr>
     </w:tblStylePr>
   </w:style>
-  <w:style w:type="table" w:styleId="ColorfulGrid-Accent2">
+  <w:style w:type="table" w:styleId="-25">
     <w:name w:val="Colorful Grid Accent 2"/>
-    <w:basedOn w:val="TableNormal"/>
+    <w:basedOn w:val="a3"/>
     <w:uiPriority w:val="73"/>
     <w:rsid w:val="00CB0664"/>
     <w:pPr>
@@ -14396,9 +14398,9 @@
       </w:tcPr>
     </w:tblStylePr>
   </w:style>
-  <w:style w:type="table" w:styleId="ColorfulGrid-Accent3">
+  <w:style w:type="table" w:styleId="-35">
     <w:name w:val="Colorful Grid Accent 3"/>
-    <w:basedOn w:val="TableNormal"/>
+    <w:basedOn w:val="a3"/>
     <w:uiPriority w:val="73"/>
     <w:rsid w:val="00CB0664"/>
     <w:pPr>
@@ -14469,9 +14471,9 @@
       </w:tcPr>
     </w:tblStylePr>
   </w:style>
-  <w:style w:type="table" w:styleId="ColorfulGrid-Accent4">
+  <w:style w:type="table" w:styleId="-45">
     <w:name w:val="Colorful Grid Accent 4"/>
-    <w:basedOn w:val="TableNormal"/>
+    <w:basedOn w:val="a3"/>
     <w:uiPriority w:val="73"/>
     <w:rsid w:val="00CB0664"/>
     <w:pPr>
@@ -14542,9 +14544,9 @@
       </w:tcPr>
     </w:tblStylePr>
   </w:style>
-  <w:style w:type="table" w:styleId="ColorfulGrid-Accent5">
+  <w:style w:type="table" w:styleId="-55">
     <w:name w:val="Colorful Grid Accent 5"/>
-    <w:basedOn w:val="TableNormal"/>
+    <w:basedOn w:val="a3"/>
     <w:uiPriority w:val="73"/>
     <w:rsid w:val="00CB0664"/>
     <w:pPr>
@@ -14615,9 +14617,9 @@
       </w:tcPr>
     </w:tblStylePr>
   </w:style>
-  <w:style w:type="table" w:styleId="ColorfulGrid-Accent6">
+  <w:style w:type="table" w:styleId="-65">
     <w:name w:val="Colorful Grid Accent 6"/>
-    <w:basedOn w:val="TableNormal"/>
+    <w:basedOn w:val="a3"/>
     <w:uiPriority w:val="73"/>
     <w:rsid w:val="00CB0664"/>
     <w:pPr>

</xml_diff>